<commit_message>
A change of project lead tells the people it affects; one module code for projects
</commit_message>
<xml_diff>
--- a/docs/prowess-project-staffing.docx
+++ b/docs/prowess-project-staffing.docx
@@ -9775,6 +9775,743 @@
                 <w:szCs w:val="20"/>
               </w:rPr>
               <w:t xml:space="preserve"> plus the notification history enough?</w:t>
+            </w:r>
+          </w:p>
+        </w:tc>
+      </w:tr>
+    </w:tbl>
+    <w:p>
+      <w:pPr>
+        <w:spacing w:after="120"/>
+      </w:pPr>
+    </w:p>
+    <w:tbl>
+      <w:tblPr>
+        <w:tblW w:type="dxa" w:w="9746"/>
+        <w:tblBorders>
+          <w:top w:val="single" w:color="A3342F" w:sz="18"/>
+          <w:left w:val="single" w:color="D7DFE9" w:sz="4"/>
+          <w:bottom w:val="single" w:color="D7DFE9" w:sz="4"/>
+          <w:right w:val="single" w:color="D7DFE9" w:sz="4"/>
+          <w:insideH w:val="single" w:color="auto" w:sz="4"/>
+          <w:insideV w:val="single" w:color="auto" w:sz="4"/>
+        </w:tblBorders>
+      </w:tblPr>
+      <w:tblGrid>
+        <w:gridCol w:w="9746"/>
+      </w:tblGrid>
+      <w:tr>
+        <w:tc>
+          <w:tcPr>
+            <w:tcW w:type="dxa" w:w="9746"/>
+            <w:tcMar>
+              <w:top w:type="dxa" w:w="140"/>
+              <w:left w:type="dxa" w:w="170"/>
+              <w:bottom w:type="dxa" w:w="140"/>
+              <w:right w:type="dxa" w:w="170"/>
+            </w:tcMar>
+          </w:tcPr>
+          <w:p>
+            <w:pPr>
+              <w:spacing w:after="60"/>
+            </w:pPr>
+            <w:r>
+              <w:rPr>
+                <w:rFonts w:ascii="Consolas" w:cs="Consolas" w:eastAsia="Consolas" w:hAnsi="Consolas"/>
+                <w:b/>
+                <w:bCs/>
+                <w:color w:val="A3342F"/>
+                <w:sz w:val="16"/>
+                <w:szCs w:val="16"/>
+              </w:rPr>
+              <w:t xml:space="preserve">Q11 · defect</w:t>
+            </w:r>
+          </w:p>
+          <w:p>
+            <w:pPr>
+              <w:spacing w:after="90"/>
+            </w:pPr>
+            <w:r>
+              <w:rPr>
+                <w:rFonts w:ascii="Calibri" w:cs="Calibri" w:eastAsia="Calibri" w:hAnsi="Calibri"/>
+                <w:b/>
+                <w:bCs/>
+                <w:color w:val="16233A"/>
+                <w:sz w:val="22"/>
+                <w:szCs w:val="22"/>
+              </w:rPr>
+              <w:t xml:space="preserve">The project screen promises an approval workflow it does not route through.</w:t>
+            </w:r>
+          </w:p>
+          <w:p>
+            <w:pPr>
+              <w:spacing w:after="70" w:line="276"/>
+            </w:pPr>
+            <w:r>
+              <w:rPr>
+                <w:rFonts w:ascii="Cambria" w:cs="Cambria" w:eastAsia="Cambria" w:hAnsi="Cambria"/>
+                <w:color w:val="3F4E66"/>
+                <w:sz w:val="20"/>
+                <w:szCs w:val="20"/>
+              </w:rPr>
+              <w:t xml:space="preserve">Admin → Projects mounts </w:t>
+            </w:r>
+            <w:r>
+              <w:rPr>
+                <w:rFonts w:ascii="Consolas" w:cs="Consolas" w:eastAsia="Consolas" w:hAnsi="Consolas"/>
+                <w:color w:val="3F4E66"/>
+                <w:sz w:val="17"/>
+                <w:szCs w:val="17"/>
+              </w:rPr>
+              <w:t xml:space="preserve">WorkflowGateBanner</w:t>
+            </w:r>
+            <w:r>
+              <w:rPr>
+                <w:rFonts w:ascii="Cambria" w:cs="Cambria" w:eastAsia="Cambria" w:hAnsi="Cambria"/>
+                <w:color w:val="3F4E66"/>
+                <w:sz w:val="20"/>
+                <w:szCs w:val="20"/>
+              </w:rPr>
+              <w:t xml:space="preserve"> for </w:t>
+            </w:r>
+            <w:r>
+              <w:rPr>
+                <w:rFonts w:ascii="Consolas" w:cs="Consolas" w:eastAsia="Consolas" w:hAnsi="Consolas"/>
+                <w:color w:val="3F4E66"/>
+                <w:sz w:val="17"/>
+                <w:szCs w:val="17"/>
+              </w:rPr>
+              <w:t xml:space="preserve">project_create</w:t>
+            </w:r>
+            <w:r>
+              <w:rPr>
+                <w:rFonts w:ascii="Cambria" w:cs="Cambria" w:eastAsia="Cambria" w:hAnsi="Cambria"/>
+                <w:color w:val="3F4E66"/>
+                <w:sz w:val="20"/>
+                <w:szCs w:val="20"/>
+              </w:rPr>
+              <w:t xml:space="preserve"> and </w:t>
+            </w:r>
+            <w:r>
+              <w:rPr>
+                <w:rFonts w:ascii="Consolas" w:cs="Consolas" w:eastAsia="Consolas" w:hAnsi="Consolas"/>
+                <w:color w:val="3F4E66"/>
+                <w:sz w:val="17"/>
+                <w:szCs w:val="17"/>
+              </w:rPr>
+              <w:t xml:space="preserve">project_edit</w:t>
+            </w:r>
+            <w:r>
+              <w:rPr>
+                <w:rFonts w:ascii="Cambria" w:cs="Cambria" w:eastAsia="Cambria" w:hAnsi="Cambria"/>
+                <w:color w:val="3F4E66"/>
+                <w:sz w:val="20"/>
+                <w:szCs w:val="20"/>
+              </w:rPr>
+              <w:t xml:space="preserve">. When a workflow is assigned to either, that banner tells the user </w:t>
+            </w:r>
+            <w:r>
+              <w:rPr>
+                <w:rFonts w:ascii="Cambria" w:cs="Cambria" w:eastAsia="Cambria" w:hAnsi="Cambria"/>
+                <w:i/>
+                <w:iCs/>
+                <w:color w:val="3F4E66"/>
+                <w:sz w:val="20"/>
+                <w:szCs w:val="20"/>
+              </w:rPr>
+              <w:t xml:space="preserve">"saves will be routed through an approval workflow rather than applied immediately"</w:t>
+            </w:r>
+            <w:r>
+              <w:rPr>
+                <w:rFonts w:ascii="Cambria" w:cs="Cambria" w:eastAsia="Cambria" w:hAnsi="Cambria"/>
+                <w:color w:val="3F4E66"/>
+                <w:sz w:val="20"/>
+                <w:szCs w:val="20"/>
+              </w:rPr>
+              <w:t xml:space="preserve"> — and then the save runs </w:t>
+            </w:r>
+            <w:r>
+              <w:rPr>
+                <w:rFonts w:ascii="Consolas" w:cs="Consolas" w:eastAsia="Consolas" w:hAnsi="Consolas"/>
+                <w:color w:val="3F4E66"/>
+                <w:sz w:val="17"/>
+                <w:szCs w:val="17"/>
+              </w:rPr>
+              <w:t xml:space="preserve">supabase.from('projects').update(…)</w:t>
+            </w:r>
+            <w:r>
+              <w:rPr>
+                <w:rFonts w:ascii="Cambria" w:cs="Cambria" w:eastAsia="Cambria" w:hAnsi="Cambria"/>
+                <w:color w:val="3F4E66"/>
+                <w:sz w:val="20"/>
+                <w:szCs w:val="20"/>
+              </w:rPr>
+              <w:t xml:space="preserve"> straight to the table. No </w:t>
+            </w:r>
+            <w:r>
+              <w:rPr>
+                <w:rFonts w:ascii="Consolas" w:cs="Consolas" w:eastAsia="Consolas" w:hAnsi="Consolas"/>
+                <w:color w:val="3F4E66"/>
+                <w:sz w:val="17"/>
+                <w:szCs w:val="17"/>
+              </w:rPr>
+              <w:t xml:space="preserve">wf_submit</w:t>
+            </w:r>
+            <w:r>
+              <w:rPr>
+                <w:rFonts w:ascii="Cambria" w:cs="Cambria" w:eastAsia="Cambria" w:hAnsi="Cambria"/>
+                <w:color w:val="3F4E66"/>
+                <w:sz w:val="20"/>
+                <w:szCs w:val="20"/>
+              </w:rPr>
+              <w:t xml:space="preserve">, no gate check.</w:t>
+            </w:r>
+          </w:p>
+          <w:p>
+            <w:pPr>
+              <w:spacing w:after="70" w:line="276"/>
+            </w:pPr>
+            <w:r>
+              <w:rPr>
+                <w:rFonts w:ascii="Cambria" w:cs="Cambria" w:eastAsia="Cambria" w:hAnsi="Cambria"/>
+                <w:color w:val="3F4E66"/>
+                <w:sz w:val="20"/>
+                <w:szCs w:val="20"/>
+              </w:rPr>
+              <w:t xml:space="preserve">Not a Projects bug — the shape of the whole admin tree. My Profile and Expenses genuinely route; Projects, Departments, Exchange Rates, Employee Edit, Add Employee, Employee Details and Delegations all mount the banner and save directly. Nothing is assigned to the project modules today, so there is no live effect — but the control exists, and using it would be worse than not having it.</w:t>
+            </w:r>
+          </w:p>
+          <w:p>
+            <w:pPr>
+              <w:spacing w:after="70" w:line="276"/>
+            </w:pPr>
+            <w:r>
+              <w:rPr>
+                <w:rFonts w:ascii="Cambria" w:cs="Cambria" w:eastAsia="Cambria" w:hAnsi="Cambria"/>
+                <w:b/>
+                <w:bCs/>
+                <w:color w:val="3F4E66"/>
+                <w:sz w:val="20"/>
+                <w:szCs w:val="20"/>
+              </w:rPr>
+              <w:t xml:space="preserve">The two halves are not the same size of job.</w:t>
+            </w:r>
+            <w:r>
+              <w:rPr>
+                <w:rFonts w:ascii="Cambria" w:cs="Cambria" w:eastAsia="Cambria" w:hAnsi="Cambria"/>
+                <w:color w:val="3F4E66"/>
+                <w:sz w:val="20"/>
+                <w:szCs w:val="20"/>
+              </w:rPr>
+              <w:t xml:space="preserve"> </w:t>
+            </w:r>
+            <w:r>
+              <w:rPr>
+                <w:rFonts w:ascii="Consolas" w:cs="Consolas" w:eastAsia="Consolas" w:hAnsi="Consolas"/>
+                <w:color w:val="3F4E66"/>
+                <w:sz w:val="17"/>
+                <w:szCs w:val="17"/>
+              </w:rPr>
+              <w:t xml:space="preserve">project_edit</w:t>
+            </w:r>
+            <w:r>
+              <w:rPr>
+                <w:rFonts w:ascii="Cambria" w:cs="Cambria" w:eastAsia="Cambria" w:hAnsi="Cambria"/>
+                <w:color w:val="3F4E66"/>
+                <w:sz w:val="20"/>
+                <w:szCs w:val="20"/>
+              </w:rPr>
+              <w:t xml:space="preserve"> needs only the routing in the screen. </w:t>
+            </w:r>
+            <w:r>
+              <w:rPr>
+                <w:rFonts w:ascii="Consolas" w:cs="Consolas" w:eastAsia="Consolas" w:hAnsi="Consolas"/>
+                <w:color w:val="3F4E66"/>
+                <w:sz w:val="17"/>
+                <w:szCs w:val="17"/>
+              </w:rPr>
+              <w:t xml:space="preserve">project_create</w:t>
+            </w:r>
+            <w:r>
+              <w:rPr>
+                <w:rFonts w:ascii="Cambria" w:cs="Cambria" w:eastAsia="Cambria" w:hAnsi="Cambria"/>
+                <w:color w:val="3F4E66"/>
+                <w:sz w:val="20"/>
+                <w:szCs w:val="20"/>
+              </w:rPr>
+              <w:t xml:space="preserve"> cannot be implemented as registered at all: </w:t>
+            </w:r>
+            <w:r>
+              <w:rPr>
+                <w:rFonts w:ascii="Consolas" w:cs="Consolas" w:eastAsia="Consolas" w:hAnsi="Consolas"/>
+                <w:color w:val="3F4E66"/>
+                <w:sz w:val="17"/>
+                <w:szCs w:val="17"/>
+              </w:rPr>
+              <w:t xml:space="preserve">workflow_instances.record_id</w:t>
+            </w:r>
+            <w:r>
+              <w:rPr>
+                <w:rFonts w:ascii="Cambria" w:cs="Cambria" w:eastAsia="Cambria" w:hAnsi="Cambria"/>
+                <w:color w:val="3F4E66"/>
+                <w:sz w:val="20"/>
+                <w:szCs w:val="20"/>
+              </w:rPr>
+              <w:t xml:space="preserve"> is </w:t>
+            </w:r>
+            <w:r>
+              <w:rPr>
+                <w:rFonts w:ascii="Consolas" w:cs="Consolas" w:eastAsia="Consolas" w:hAnsi="Consolas"/>
+                <w:color w:val="3F4E66"/>
+                <w:sz w:val="17"/>
+                <w:szCs w:val="17"/>
+              </w:rPr>
+              <w:t xml:space="preserve">NOT NULL</w:t>
+            </w:r>
+            <w:r>
+              <w:rPr>
+                <w:rFonts w:ascii="Cambria" w:cs="Cambria" w:eastAsia="Cambria" w:hAnsi="Cambria"/>
+                <w:color w:val="3F4E66"/>
+                <w:sz w:val="20"/>
+                <w:szCs w:val="20"/>
+              </w:rPr>
+              <w:t xml:space="preserve">, so the engine cannot hold an approval for a row that does not exist. The one create-shaped flow that works, </w:t>
+            </w:r>
+            <w:r>
+              <w:rPr>
+                <w:rFonts w:ascii="Consolas" w:cs="Consolas" w:eastAsia="Consolas" w:hAnsi="Consolas"/>
+                <w:color w:val="3F4E66"/>
+                <w:sz w:val="17"/>
+                <w:szCs w:val="17"/>
+              </w:rPr>
+              <w:t xml:space="preserve">employee_hire</w:t>
+            </w:r>
+            <w:r>
+              <w:rPr>
+                <w:rFonts w:ascii="Cambria" w:cs="Cambria" w:eastAsia="Cambria" w:hAnsi="Cambria"/>
+                <w:color w:val="3F4E66"/>
+                <w:sz w:val="20"/>
+                <w:szCs w:val="20"/>
+              </w:rPr>
+              <w:t xml:space="preserve">, gets round this by inserting the row first in a </w:t>
+            </w:r>
+            <w:r>
+              <w:rPr>
+                <w:rFonts w:ascii="Cambria" w:cs="Cambria" w:eastAsia="Cambria" w:hAnsi="Cambria"/>
+                <w:b/>
+                <w:bCs/>
+                <w:color w:val="3F4E66"/>
+                <w:sz w:val="20"/>
+                <w:szCs w:val="20"/>
+              </w:rPr>
+              <w:t xml:space="preserve">Pending</w:t>
+            </w:r>
+            <w:r>
+              <w:rPr>
+                <w:rFonts w:ascii="Cambria" w:cs="Cambria" w:eastAsia="Cambria" w:hAnsi="Cambria"/>
+                <w:color w:val="3F4E66"/>
+                <w:sz w:val="20"/>
+                <w:szCs w:val="20"/>
+              </w:rPr>
+              <w:t xml:space="preserve"> state with </w:t>
+            </w:r>
+            <w:r>
+              <w:rPr>
+                <w:rFonts w:ascii="Consolas" w:cs="Consolas" w:eastAsia="Consolas" w:hAnsi="Consolas"/>
+                <w:color w:val="3F4E66"/>
+                <w:sz w:val="17"/>
+                <w:szCs w:val="17"/>
+              </w:rPr>
+              <w:t xml:space="preserve">locked = true</w:t>
+            </w:r>
+            <w:r>
+              <w:rPr>
+                <w:rFonts w:ascii="Cambria" w:cs="Cambria" w:eastAsia="Cambria" w:hAnsi="Cambria"/>
+                <w:color w:val="3F4E66"/>
+                <w:sz w:val="20"/>
+                <w:szCs w:val="20"/>
+              </w:rPr>
+              <w:t xml:space="preserve"> and pointing the instance at it. </w:t>
+            </w:r>
+            <w:r>
+              <w:rPr>
+                <w:rFonts w:ascii="Consolas" w:cs="Consolas" w:eastAsia="Consolas" w:hAnsi="Consolas"/>
+                <w:color w:val="3F4E66"/>
+                <w:sz w:val="17"/>
+                <w:szCs w:val="17"/>
+              </w:rPr>
+              <w:t xml:space="preserve">projects</w:t>
+            </w:r>
+            <w:r>
+              <w:rPr>
+                <w:rFonts w:ascii="Cambria" w:cs="Cambria" w:eastAsia="Cambria" w:hAnsi="Cambria"/>
+                <w:color w:val="3F4E66"/>
+                <w:sz w:val="20"/>
+                <w:szCs w:val="20"/>
+              </w:rPr>
+              <w:t xml:space="preserve"> has no draft state, so </w:t>
+            </w:r>
+            <w:r>
+              <w:rPr>
+                <w:rFonts w:ascii="Consolas" w:cs="Consolas" w:eastAsia="Consolas" w:hAnsi="Consolas"/>
+                <w:color w:val="3F4E66"/>
+                <w:sz w:val="17"/>
+                <w:szCs w:val="17"/>
+              </w:rPr>
+              <w:t xml:space="preserve">project_create</w:t>
+            </w:r>
+            <w:r>
+              <w:rPr>
+                <w:rFonts w:ascii="Cambria" w:cs="Cambria" w:eastAsia="Cambria" w:hAnsi="Cambria"/>
+                <w:color w:val="3F4E66"/>
+                <w:sz w:val="20"/>
+                <w:szCs w:val="20"/>
+              </w:rPr>
+              <w:t xml:space="preserve"> would need one before that module code can ever do anything.</w:t>
+            </w:r>
+          </w:p>
+          <w:p>
+            <w:pPr>
+              <w:pBdr>
+                <w:top w:val="single" w:color="D7DFE9" w:sz="4" w:space="8"/>
+              </w:pBdr>
+              <w:spacing w:after="0" w:before="100" w:line="276"/>
+            </w:pPr>
+            <w:r>
+              <w:rPr>
+                <w:rFonts w:ascii="Calibri" w:cs="Calibri" w:eastAsia="Calibri" w:hAnsi="Calibri"/>
+                <w:color w:val="16233A"/>
+                <w:sz w:val="20"/>
+                <w:szCs w:val="20"/>
+              </w:rPr>
+              <w:t xml:space="preserve">Remove the two banners until the routing exists, or build the routing? And if we build it, is </w:t>
+            </w:r>
+            <w:r>
+              <w:rPr>
+                <w:rFonts w:ascii="Consolas" w:cs="Consolas" w:eastAsia="Consolas" w:hAnsi="Consolas"/>
+                <w:color w:val="16233A"/>
+                <w:sz w:val="17"/>
+                <w:szCs w:val="17"/>
+              </w:rPr>
+              <w:t xml:space="preserve">project_create</w:t>
+            </w:r>
+            <w:r>
+              <w:rPr>
+                <w:rFonts w:ascii="Calibri" w:cs="Calibri" w:eastAsia="Calibri" w:hAnsi="Calibri"/>
+                <w:color w:val="16233A"/>
+                <w:sz w:val="20"/>
+                <w:szCs w:val="20"/>
+              </w:rPr>
+              <w:t xml:space="preserve"> worth a draft state on </w:t>
+            </w:r>
+            <w:r>
+              <w:rPr>
+                <w:rFonts w:ascii="Consolas" w:cs="Consolas" w:eastAsia="Consolas" w:hAnsi="Consolas"/>
+                <w:color w:val="16233A"/>
+                <w:sz w:val="17"/>
+                <w:szCs w:val="17"/>
+              </w:rPr>
+              <w:t xml:space="preserve">projects</w:t>
+            </w:r>
+            <w:r>
+              <w:rPr>
+                <w:rFonts w:ascii="Calibri" w:cs="Calibri" w:eastAsia="Calibri" w:hAnsi="Calibri"/>
+                <w:color w:val="16233A"/>
+                <w:sz w:val="20"/>
+                <w:szCs w:val="20"/>
+              </w:rPr>
+              <w:t xml:space="preserve">, or should approval only ever apply to edits?</w:t>
+            </w:r>
+          </w:p>
+        </w:tc>
+      </w:tr>
+    </w:tbl>
+    <w:p>
+      <w:pPr>
+        <w:spacing w:after="120"/>
+      </w:pPr>
+    </w:p>
+    <w:tbl>
+      <w:tblPr>
+        <w:tblW w:type="dxa" w:w="9746"/>
+        <w:tblBorders>
+          <w:top w:val="single" w:color="A3342F" w:sz="18"/>
+          <w:left w:val="single" w:color="D7DFE9" w:sz="4"/>
+          <w:bottom w:val="single" w:color="D7DFE9" w:sz="4"/>
+          <w:right w:val="single" w:color="D7DFE9" w:sz="4"/>
+          <w:insideH w:val="single" w:color="auto" w:sz="4"/>
+          <w:insideV w:val="single" w:color="auto" w:sz="4"/>
+        </w:tblBorders>
+      </w:tblPr>
+      <w:tblGrid>
+        <w:gridCol w:w="9746"/>
+      </w:tblGrid>
+      <w:tr>
+        <w:tc>
+          <w:tcPr>
+            <w:tcW w:type="dxa" w:w="9746"/>
+            <w:tcMar>
+              <w:top w:type="dxa" w:w="140"/>
+              <w:left w:type="dxa" w:w="170"/>
+              <w:bottom w:type="dxa" w:w="140"/>
+              <w:right w:type="dxa" w:w="170"/>
+            </w:tcMar>
+          </w:tcPr>
+          <w:p>
+            <w:pPr>
+              <w:spacing w:after="60"/>
+            </w:pPr>
+            <w:r>
+              <w:rPr>
+                <w:rFonts w:ascii="Consolas" w:cs="Consolas" w:eastAsia="Consolas" w:hAnsi="Consolas"/>
+                <w:b/>
+                <w:bCs/>
+                <w:color w:val="A3342F"/>
+                <w:sz w:val="16"/>
+                <w:szCs w:val="16"/>
+              </w:rPr>
+              <w:t xml:space="preserve">Q12 · design decision</w:t>
+            </w:r>
+          </w:p>
+          <w:p>
+            <w:pPr>
+              <w:spacing w:after="90"/>
+            </w:pPr>
+            <w:r>
+              <w:rPr>
+                <w:rFonts w:ascii="Calibri" w:cs="Calibri" w:eastAsia="Calibri" w:hAnsi="Calibri"/>
+                <w:b/>
+                <w:bCs/>
+                <w:color w:val="16233A"/>
+                <w:sz w:val="22"/>
+                <w:szCs w:val="22"/>
+              </w:rPr>
+              <w:t xml:space="preserve">Is project_create / project_edit the right split, given the engine has no verb?</w:t>
+            </w:r>
+          </w:p>
+          <w:p>
+            <w:pPr>
+              <w:spacing w:after="70" w:line="276"/>
+            </w:pPr>
+            <w:r>
+              <w:rPr>
+                <w:rFonts w:ascii="Cambria" w:cs="Cambria" w:eastAsia="Cambria" w:hAnsi="Cambria"/>
+                <w:color w:val="3F4E66"/>
+                <w:sz w:val="20"/>
+                <w:szCs w:val="20"/>
+              </w:rPr>
+              <w:t xml:space="preserve">A workflow instance carries </w:t>
+            </w:r>
+            <w:r>
+              <w:rPr>
+                <w:rFonts w:ascii="Consolas" w:cs="Consolas" w:eastAsia="Consolas" w:hAnsi="Consolas"/>
+                <w:color w:val="3F4E66"/>
+                <w:sz w:val="17"/>
+                <w:szCs w:val="17"/>
+              </w:rPr>
+              <w:t xml:space="preserve">module_code</w:t>
+            </w:r>
+            <w:r>
+              <w:rPr>
+                <w:rFonts w:ascii="Cambria" w:cs="Cambria" w:eastAsia="Cambria" w:hAnsi="Cambria"/>
+                <w:color w:val="3F4E66"/>
+                <w:sz w:val="20"/>
+                <w:szCs w:val="20"/>
+              </w:rPr>
+              <w:t xml:space="preserve"> and </w:t>
+            </w:r>
+            <w:r>
+              <w:rPr>
+                <w:rFonts w:ascii="Consolas" w:cs="Consolas" w:eastAsia="Consolas" w:hAnsi="Consolas"/>
+                <w:color w:val="3F4E66"/>
+                <w:sz w:val="17"/>
+                <w:szCs w:val="17"/>
+              </w:rPr>
+              <w:t xml:space="preserve">record_id</w:t>
+            </w:r>
+            <w:r>
+              <w:rPr>
+                <w:rFonts w:ascii="Cambria" w:cs="Cambria" w:eastAsia="Cambria" w:hAnsi="Cambria"/>
+                <w:color w:val="3F4E66"/>
+                <w:sz w:val="20"/>
+                <w:szCs w:val="20"/>
+              </w:rPr>
+              <w:t xml:space="preserve"> and nothing that says </w:t>
+            </w:r>
+            <w:r>
+              <w:rPr>
+                <w:rFonts w:ascii="Cambria" w:cs="Cambria" w:eastAsia="Cambria" w:hAnsi="Cambria"/>
+                <w:i/>
+                <w:iCs/>
+                <w:color w:val="3F4E66"/>
+                <w:sz w:val="20"/>
+                <w:szCs w:val="20"/>
+              </w:rPr>
+              <w:t xml:space="preserve">what kind of change</w:t>
+            </w:r>
+            <w:r>
+              <w:rPr>
+                <w:rFonts w:ascii="Cambria" w:cs="Cambria" w:eastAsia="Cambria" w:hAnsi="Cambria"/>
+                <w:color w:val="3F4E66"/>
+                <w:sz w:val="20"/>
+                <w:szCs w:val="20"/>
+              </w:rPr>
+              <w:t xml:space="preserve"> this is. The module code </w:t>
+            </w:r>
+            <w:r>
+              <w:rPr>
+                <w:rFonts w:ascii="Cambria" w:cs="Cambria" w:eastAsia="Cambria" w:hAnsi="Cambria"/>
+                <w:i/>
+                <w:iCs/>
+                <w:color w:val="3F4E66"/>
+                <w:sz w:val="20"/>
+                <w:szCs w:val="20"/>
+              </w:rPr>
+              <w:t xml:space="preserve">is</w:t>
+            </w:r>
+            <w:r>
+              <w:rPr>
+                <w:rFonts w:ascii="Cambria" w:cs="Cambria" w:eastAsia="Cambria" w:hAnsi="Cambria"/>
+                <w:color w:val="3F4E66"/>
+                <w:sz w:val="20"/>
+                <w:szCs w:val="20"/>
+              </w:rPr>
+              <w:t xml:space="preserve"> the verb. So merging the two would make a create indistinguishable from an edit in the approver's inbox, in the notification templates, and in </w:t>
+            </w:r>
+            <w:r>
+              <w:rPr>
+                <w:rFonts w:ascii="Consolas" w:cs="Consolas" w:eastAsia="Consolas" w:hAnsi="Consolas"/>
+                <w:color w:val="3F4E66"/>
+                <w:sz w:val="17"/>
+                <w:szCs w:val="17"/>
+              </w:rPr>
+              <w:t xml:space="preserve">edit_route</w:t>
+            </w:r>
+            <w:r>
+              <w:rPr>
+                <w:rFonts w:ascii="Cambria" w:cs="Cambria" w:eastAsia="Cambria" w:hAnsi="Cambria"/>
+                <w:color w:val="3F4E66"/>
+                <w:sz w:val="20"/>
+                <w:szCs w:val="20"/>
+              </w:rPr>
+              <w:t xml:space="preserve"> — which is already </w:t>
+            </w:r>
+            <w:r>
+              <w:rPr>
+                <w:rFonts w:ascii="Consolas" w:cs="Consolas" w:eastAsia="Consolas" w:hAnsi="Consolas"/>
+                <w:color w:val="3F4E66"/>
+                <w:sz w:val="17"/>
+                <w:szCs w:val="17"/>
+              </w:rPr>
+              <w:t xml:space="preserve">/admin/projects/</w:t>
+            </w:r>
+            <w:r>
+              <w:rPr>
+                <w:rFonts w:ascii="Cambria" w:cs="Cambria" w:eastAsia="Cambria" w:hAnsi="Cambria"/>
+                <w:color w:val="3F4E66"/>
+                <w:sz w:val="20"/>
+                <w:szCs w:val="20"/>
+              </w:rPr>
+              <w:t xml:space="preserve"> for one and </w:t>
+            </w:r>
+            <w:r>
+              <w:rPr>
+                <w:rFonts w:ascii="Consolas" w:cs="Consolas" w:eastAsia="Consolas" w:hAnsi="Consolas"/>
+                <w:color w:val="3F4E66"/>
+                <w:sz w:val="17"/>
+                <w:szCs w:val="17"/>
+              </w:rPr>
+              <w:t xml:space="preserve">/admin/projects/new</w:t>
+            </w:r>
+            <w:r>
+              <w:rPr>
+                <w:rFonts w:ascii="Cambria" w:cs="Cambria" w:eastAsia="Cambria" w:hAnsi="Cambria"/>
+                <w:color w:val="3F4E66"/>
+                <w:sz w:val="20"/>
+                <w:szCs w:val="20"/>
+              </w:rPr>
+              <w:t xml:space="preserve"> for the other.</w:t>
+            </w:r>
+          </w:p>
+          <w:p>
+            <w:pPr>
+              <w:spacing w:after="70" w:line="276"/>
+            </w:pPr>
+            <w:r>
+              <w:rPr>
+                <w:rFonts w:ascii="Cambria" w:cs="Cambria" w:eastAsia="Cambria" w:hAnsi="Cambria"/>
+                <w:color w:val="3F4E66"/>
+                <w:sz w:val="20"/>
+                <w:szCs w:val="20"/>
+              </w:rPr>
+              <w:t xml:space="preserve">The split also buys two things worth having: different approvers (a new project is a new cost object and may be Finance's call; a budget change is the PMO's), and different appetite for a gate at all — creating a project is additive and reversible, while editing dates can strand booked hours and editing the Reporting Manager silently moves access.</w:t>
+            </w:r>
+          </w:p>
+          <w:p>
+            <w:pPr>
+              <w:spacing w:after="70" w:line="276"/>
+            </w:pPr>
+            <w:r>
+              <w:rPr>
+                <w:rFonts w:ascii="Cambria" w:cs="Cambria" w:eastAsia="Cambria" w:hAnsi="Cambria"/>
+                <w:color w:val="3F4E66"/>
+                <w:sz w:val="20"/>
+                <w:szCs w:val="20"/>
+              </w:rPr>
+              <w:t xml:space="preserve">Against it: two codes double the configuration surface — two assignments, two sets of role overrides, two notification bindings — and they will drift. The registry is also already inconsistent, so there is no house rule to appeal to: departments split by verb, employees do not (</w:t>
+            </w:r>
+            <w:r>
+              <w:rPr>
+                <w:rFonts w:ascii="Consolas" w:cs="Consolas" w:eastAsia="Consolas" w:hAnsi="Consolas"/>
+                <w:color w:val="3F4E66"/>
+                <w:sz w:val="17"/>
+                <w:szCs w:val="17"/>
+              </w:rPr>
+              <w:t xml:space="preserve">employee_edit</w:t>
+            </w:r>
+            <w:r>
+              <w:rPr>
+                <w:rFonts w:ascii="Cambria" w:cs="Cambria" w:eastAsia="Cambria" w:hAnsi="Cambria"/>
+                <w:color w:val="3F4E66"/>
+                <w:sz w:val="20"/>
+                <w:szCs w:val="20"/>
+              </w:rPr>
+              <w:t xml:space="preserve"> exists but hiring is its own module), and the </w:t>
+            </w:r>
+            <w:r>
+              <w:rPr>
+                <w:rFonts w:ascii="Consolas" w:cs="Consolas" w:eastAsia="Consolas" w:hAnsi="Consolas"/>
+                <w:color w:val="3F4E66"/>
+                <w:sz w:val="17"/>
+                <w:szCs w:val="17"/>
+              </w:rPr>
+              <w:t xml:space="preserve">profile_*</w:t>
+            </w:r>
+            <w:r>
+              <w:rPr>
+                <w:rFonts w:ascii="Cambria" w:cs="Cambria" w:eastAsia="Cambria" w:hAnsi="Cambria"/>
+                <w:color w:val="3F4E66"/>
+                <w:sz w:val="20"/>
+                <w:szCs w:val="20"/>
+              </w:rPr>
+              <w:t xml:space="preserve"> codes split by section rather than by verb.</w:t>
+            </w:r>
+          </w:p>
+          <w:p>
+            <w:pPr>
+              <w:pBdr>
+                <w:top w:val="single" w:color="D7DFE9" w:sz="4" w:space="8"/>
+              </w:pBdr>
+              <w:spacing w:after="0" w:before="100" w:line="276"/>
+            </w:pPr>
+            <w:r>
+              <w:rPr>
+                <w:rFonts w:ascii="Calibri" w:cs="Calibri" w:eastAsia="Calibri" w:hAnsi="Calibri"/>
+                <w:color w:val="16233A"/>
+                <w:sz w:val="20"/>
+                <w:szCs w:val="20"/>
+              </w:rPr>
+              <w:t xml:space="preserve">Keep the split for projects, or is the real fix an action column on the workflow instance so any module can be gated per verb without doubling its codes?</w:t>
             </w:r>
           </w:p>
         </w:tc>

</xml_diff>

<commit_message>
Test plan: cases for 799 and 800
AP extended to cover 799 -- self-assignment as lead, no duplicate copies
for the actor, each member's line manager notified once per report, and
an edited team template surviving the rewording.

New section AQ for 800. AQ1 records six figures before the deploy and
AQ8 compares them after: the split must not move Recorded, Planned,
the recording rate, entries, employees or projects. AQ10 confirms the
in-place patch of upsert_time_type did not revert 715, 718 or 729.

309 cases to 324. Closing section renumbered AQ to AR.

Co-Authored-By: Claude Opus 5 <noreply@anthropic.com>
Claude-Session: https://claude.ai/code/session_01TbzVzbdQLkvHADQbeNiF9Y
</commit_message>
<xml_diff>
--- a/docs/prowess-project-staffing.docx
+++ b/docs/prowess-project-staffing.docx
@@ -63,7 +63,7 @@
           <w:sz w:val="16"/>
           <w:szCs w:val="16"/>
         </w:rPr>
-        <w:t xml:space="preserve">Environment  Dev (prowess-dev)      Migrations  773–795      Status  deployed, untested by users      Drafted  26 Aug 2026</w:t>
+        <w:t xml:space="preserve">Environment  Dev (prowess-dev)      Migrations  773–798      Status  deployed, untested by users      Drafted  26 Aug 2026</w:t>
       </w:r>
     </w:p>
     <w:p>
@@ -5952,7 +5952,7 @@
           <w:sz w:val="23"/>
           <w:szCs w:val="23"/>
         </w:rPr>
-        <w:t xml:space="preserve">Four events, three recipients, one insert. Writing a row to </w:t>
+        <w:t xml:space="preserve">Six events across two records. Writing a row to </w:t>
       </w:r>
       <w:r>
         <w:rPr>
@@ -5970,7 +5970,44 @@
           <w:sz w:val="23"/>
           <w:szCs w:val="23"/>
         </w:rPr>
-        <w:t xml:space="preserve"> produces both the in-app bell entry and the email — a trigger on that table carries the mail leg — so there is no second code path that can drift.</w:t>
+        <w:t xml:space="preserve"> produces both the in-app bell entry and the email — a trigger on that table carries the mail leg — so there is no second code path that can drift. Since migration 796 the </w:t>
+      </w:r>
+      <w:r>
+        <w:rPr>
+          <w:rFonts w:ascii="Cambria" w:cs="Cambria" w:eastAsia="Cambria" w:hAnsi="Cambria"/>
+          <w:b/>
+          <w:bCs/>
+          <w:color w:val="3F4E66"/>
+          <w:sz w:val="23"/>
+          <w:szCs w:val="23"/>
+        </w:rPr>
+        <w:t xml:space="preserve">wording is the administrator’s</w:t>
+      </w:r>
+      <w:r>
+        <w:rPr>
+          <w:rFonts w:ascii="Cambria" w:cs="Cambria" w:eastAsia="Cambria" w:hAnsi="Cambria"/>
+          <w:color w:val="3F4E66"/>
+          <w:sz w:val="23"/>
+          <w:szCs w:val="23"/>
+        </w:rPr>
+        <w:t xml:space="preserve">, not the developer’s.</w:t>
+      </w:r>
+    </w:p>
+    <w:p>
+      <w:pPr>
+        <w:pStyle w:val="Heading2"/>
+        <w:spacing w:after="100" w:before="280"/>
+      </w:pPr>
+      <w:r>
+        <w:rPr>
+          <w:rFonts w:ascii="Calibri" w:cs="Calibri" w:eastAsia="Calibri" w:hAnsi="Calibri"/>
+          <w:b/>
+          <w:bCs/>
+          <w:color w:val="16233A"/>
+          <w:sz w:val="23"/>
+          <w:szCs w:val="23"/>
+        </w:rPr>
+        <w:t xml:space="preserve">What is announced</w:t>
       </w:r>
     </w:p>
     <w:tbl>
@@ -5986,10 +6023,10 @@
         </w:tblBorders>
       </w:tblPr>
       <w:tblGrid>
-        <w:gridCol w:w="1170"/>
-        <w:gridCol w:w="2534"/>
+        <w:gridCol w:w="1364"/>
+        <w:gridCol w:w="2339"/>
         <w:gridCol w:w="3021"/>
-        <w:gridCol w:w="3021"/>
+        <w:gridCol w:w="3022"/>
       </w:tblGrid>
       <w:tr>
         <w:trPr>
@@ -5997,7 +6034,7 @@
         </w:trPr>
         <w:tc>
           <w:tcPr>
-            <w:tcW w:type="dxa" w:w="1170"/>
+            <w:tcW w:type="dxa" w:w="1364"/>
             <w:shd w:fill="EEF2F7" w:val="clear"/>
             <w:tcMar>
               <w:top w:type="dxa" w:w="90"/>
@@ -6023,7 +6060,7 @@
         </w:tc>
         <w:tc>
           <w:tcPr>
-            <w:tcW w:type="dxa" w:w="2534"/>
+            <w:tcW w:type="dxa" w:w="2339"/>
             <w:shd w:fill="EEF2F7" w:val="clear"/>
             <w:tcMar>
               <w:top w:type="dxa" w:w="90"/>
@@ -6075,7 +6112,7 @@
         </w:tc>
         <w:tc>
           <w:tcPr>
-            <w:tcW w:type="dxa" w:w="3021"/>
+            <w:tcW w:type="dxa" w:w="3022"/>
             <w:shd w:fill="EEF2F7" w:val="clear"/>
             <w:tcMar>
               <w:top w:type="dxa" w:w="90"/>
@@ -6103,7 +6140,7 @@
       <w:tr>
         <w:tc>
           <w:tcPr>
-            <w:tcW w:type="dxa" w:w="1170"/>
+            <w:tcW w:type="dxa" w:w="1364"/>
             <w:tcMar>
               <w:top w:type="dxa" w:w="90"/>
               <w:left w:type="dxa" w:w="130"/>
@@ -6128,7 +6165,7 @@
         </w:tc>
         <w:tc>
           <w:tcPr>
-            <w:tcW w:type="dxa" w:w="2534"/>
+            <w:tcW w:type="dxa" w:w="2339"/>
             <w:tcMar>
               <w:top w:type="dxa" w:w="90"/>
               <w:left w:type="dxa" w:w="130"/>
@@ -6178,7 +6215,7 @@
         </w:tc>
         <w:tc>
           <w:tcPr>
-            <w:tcW w:type="dxa" w:w="3021"/>
+            <w:tcW w:type="dxa" w:w="3022"/>
             <w:tcMar>
               <w:top w:type="dxa" w:w="90"/>
               <w:left w:type="dxa" w:w="130"/>
@@ -6205,7 +6242,7 @@
       <w:tr>
         <w:tc>
           <w:tcPr>
-            <w:tcW w:type="dxa" w:w="1170"/>
+            <w:tcW w:type="dxa" w:w="1364"/>
             <w:tcMar>
               <w:top w:type="dxa" w:w="90"/>
               <w:left w:type="dxa" w:w="130"/>
@@ -6230,7 +6267,7 @@
         </w:tc>
         <w:tc>
           <w:tcPr>
-            <w:tcW w:type="dxa" w:w="2534"/>
+            <w:tcW w:type="dxa" w:w="2339"/>
             <w:tcMar>
               <w:top w:type="dxa" w:w="90"/>
               <w:left w:type="dxa" w:w="130"/>
@@ -6280,7 +6317,7 @@
         </w:tc>
         <w:tc>
           <w:tcPr>
-            <w:tcW w:type="dxa" w:w="3021"/>
+            <w:tcW w:type="dxa" w:w="3022"/>
             <w:tcMar>
               <w:top w:type="dxa" w:w="90"/>
               <w:left w:type="dxa" w:w="130"/>
@@ -6307,7 +6344,7 @@
       <w:tr>
         <w:tc>
           <w:tcPr>
-            <w:tcW w:type="dxa" w:w="1170"/>
+            <w:tcW w:type="dxa" w:w="1364"/>
             <w:tcMar>
               <w:top w:type="dxa" w:w="90"/>
               <w:left w:type="dxa" w:w="130"/>
@@ -6332,7 +6369,7 @@
         </w:tc>
         <w:tc>
           <w:tcPr>
-            <w:tcW w:type="dxa" w:w="2534"/>
+            <w:tcW w:type="dxa" w:w="2339"/>
             <w:tcMar>
               <w:top w:type="dxa" w:w="90"/>
               <w:left w:type="dxa" w:w="130"/>
@@ -6382,7 +6419,7 @@
         </w:tc>
         <w:tc>
           <w:tcPr>
-            <w:tcW w:type="dxa" w:w="3021"/>
+            <w:tcW w:type="dxa" w:w="3022"/>
             <w:tcMar>
               <w:top w:type="dxa" w:w="90"/>
               <w:left w:type="dxa" w:w="130"/>
@@ -6409,7 +6446,7 @@
       <w:tr>
         <w:tc>
           <w:tcPr>
-            <w:tcW w:type="dxa" w:w="1170"/>
+            <w:tcW w:type="dxa" w:w="1364"/>
             <w:tcMar>
               <w:top w:type="dxa" w:w="90"/>
               <w:left w:type="dxa" w:w="130"/>
@@ -6434,7 +6471,7 @@
         </w:tc>
         <w:tc>
           <w:tcPr>
-            <w:tcW w:type="dxa" w:w="2534"/>
+            <w:tcW w:type="dxa" w:w="2339"/>
             <w:tcMar>
               <w:top w:type="dxa" w:w="90"/>
               <w:left w:type="dxa" w:w="130"/>
@@ -6484,6 +6521,83 @@
         </w:tc>
         <w:tc>
           <w:tcPr>
+            <w:tcW w:type="dxa" w:w="3022"/>
+            <w:tcMar>
+              <w:top w:type="dxa" w:w="90"/>
+              <w:left w:type="dxa" w:w="130"/>
+              <w:bottom w:type="dxa" w:w="90"/>
+              <w:right w:type="dxa" w:w="130"/>
+            </w:tcMar>
+          </w:tcPr>
+          <w:p>
+            <w:pPr>
+              <w:spacing w:line="264"/>
+            </w:pPr>
+            <w:r>
+              <w:rPr>
+                <w:rFonts w:ascii="Calibri" w:cs="Calibri" w:eastAsia="Calibri" w:hAnsi="Calibri"/>
+                <w:color w:val="3F4E66"/>
+                <w:sz w:val="19"/>
+                <w:szCs w:val="19"/>
+              </w:rPr>
+              <w:t xml:space="preserve">Meera R was removed from AMPTJ</w:t>
+            </w:r>
+          </w:p>
+        </w:tc>
+      </w:tr>
+      <w:tr>
+        <w:tc>
+          <w:tcPr>
+            <w:tcW w:type="dxa" w:w="1364"/>
+            <w:tcMar>
+              <w:top w:type="dxa" w:w="90"/>
+              <w:left w:type="dxa" w:w="130"/>
+              <w:bottom w:type="dxa" w:w="90"/>
+              <w:right w:type="dxa" w:w="130"/>
+            </w:tcMar>
+          </w:tcPr>
+          <w:p>
+            <w:pPr>
+              <w:spacing w:line="264"/>
+            </w:pPr>
+            <w:r>
+              <w:rPr>
+                <w:rFonts w:ascii="Calibri" w:cs="Calibri" w:eastAsia="Calibri" w:hAnsi="Calibri"/>
+                <w:color w:val="16233A"/>
+                <w:sz w:val="19"/>
+                <w:szCs w:val="19"/>
+              </w:rPr>
+              <w:t xml:space="preserve">lead assigned</w:t>
+            </w:r>
+          </w:p>
+        </w:tc>
+        <w:tc>
+          <w:tcPr>
+            <w:tcW w:type="dxa" w:w="2339"/>
+            <w:tcMar>
+              <w:top w:type="dxa" w:w="90"/>
+              <w:left w:type="dxa" w:w="130"/>
+              <w:bottom w:type="dxa" w:w="90"/>
+              <w:right w:type="dxa" w:w="130"/>
+            </w:tcMar>
+          </w:tcPr>
+          <w:p>
+            <w:pPr>
+              <w:spacing w:line="264"/>
+            </w:pPr>
+            <w:r>
+              <w:rPr>
+                <w:rFonts w:ascii="Calibri" w:cs="Calibri" w:eastAsia="Calibri" w:hAnsi="Calibri"/>
+                <w:color w:val="3F4E66"/>
+                <w:sz w:val="19"/>
+                <w:szCs w:val="19"/>
+              </w:rPr>
+              <w:t xml:space="preserve">Named Reporting Manager</w:t>
+            </w:r>
+          </w:p>
+        </w:tc>
+        <w:tc>
+          <w:tcPr>
             <w:tcW w:type="dxa" w:w="3021"/>
             <w:tcMar>
               <w:top w:type="dxa" w:w="90"/>
@@ -6503,7 +6617,134 @@
                 <w:sz w:val="19"/>
                 <w:szCs w:val="19"/>
               </w:rPr>
-              <w:t xml:space="preserve">Meera R was removed from AMPTJ</w:t>
+              <w:t xml:space="preserve">You are now the lead on AMPTJ</w:t>
+            </w:r>
+          </w:p>
+        </w:tc>
+        <w:tc>
+          <w:tcPr>
+            <w:tcW w:type="dxa" w:w="3022"/>
+            <w:tcMar>
+              <w:top w:type="dxa" w:w="90"/>
+              <w:left w:type="dxa" w:w="130"/>
+              <w:bottom w:type="dxa" w:w="90"/>
+              <w:right w:type="dxa" w:w="130"/>
+            </w:tcMar>
+          </w:tcPr>
+          <w:p>
+            <w:pPr>
+              <w:spacing w:line="264"/>
+            </w:pPr>
+            <w:r>
+              <w:rPr>
+                <w:rFonts w:ascii="Calibri" w:cs="Calibri" w:eastAsia="Calibri" w:hAnsi="Calibri"/>
+                <w:color w:val="3F4E66"/>
+                <w:sz w:val="19"/>
+                <w:szCs w:val="19"/>
+              </w:rPr>
+              <w:t xml:space="preserve">Hari A now leads AMPTJ</w:t>
+            </w:r>
+          </w:p>
+        </w:tc>
+      </w:tr>
+      <w:tr>
+        <w:tc>
+          <w:tcPr>
+            <w:tcW w:type="dxa" w:w="1364"/>
+            <w:tcMar>
+              <w:top w:type="dxa" w:w="90"/>
+              <w:left w:type="dxa" w:w="130"/>
+              <w:bottom w:type="dxa" w:w="90"/>
+              <w:right w:type="dxa" w:w="130"/>
+            </w:tcMar>
+          </w:tcPr>
+          <w:p>
+            <w:pPr>
+              <w:spacing w:line="264"/>
+            </w:pPr>
+            <w:r>
+              <w:rPr>
+                <w:rFonts w:ascii="Calibri" w:cs="Calibri" w:eastAsia="Calibri" w:hAnsi="Calibri"/>
+                <w:color w:val="16233A"/>
+                <w:sz w:val="19"/>
+                <w:szCs w:val="19"/>
+              </w:rPr>
+              <w:t xml:space="preserve">lead removed</w:t>
+            </w:r>
+          </w:p>
+        </w:tc>
+        <w:tc>
+          <w:tcPr>
+            <w:tcW w:type="dxa" w:w="2339"/>
+            <w:tcMar>
+              <w:top w:type="dxa" w:w="90"/>
+              <w:left w:type="dxa" w:w="130"/>
+              <w:bottom w:type="dxa" w:w="90"/>
+              <w:right w:type="dxa" w:w="130"/>
+            </w:tcMar>
+          </w:tcPr>
+          <w:p>
+            <w:pPr>
+              <w:spacing w:line="264"/>
+            </w:pPr>
+            <w:r>
+              <w:rPr>
+                <w:rFonts w:ascii="Calibri" w:cs="Calibri" w:eastAsia="Calibri" w:hAnsi="Calibri"/>
+                <w:color w:val="3F4E66"/>
+                <w:sz w:val="19"/>
+                <w:szCs w:val="19"/>
+              </w:rPr>
+              <w:t xml:space="preserve">Replaced or cleared</w:t>
+            </w:r>
+          </w:p>
+        </w:tc>
+        <w:tc>
+          <w:tcPr>
+            <w:tcW w:type="dxa" w:w="3021"/>
+            <w:tcMar>
+              <w:top w:type="dxa" w:w="90"/>
+              <w:left w:type="dxa" w:w="130"/>
+              <w:bottom w:type="dxa" w:w="90"/>
+              <w:right w:type="dxa" w:w="130"/>
+            </w:tcMar>
+          </w:tcPr>
+          <w:p>
+            <w:pPr>
+              <w:spacing w:line="264"/>
+            </w:pPr>
+            <w:r>
+              <w:rPr>
+                <w:rFonts w:ascii="Calibri" w:cs="Calibri" w:eastAsia="Calibri" w:hAnsi="Calibri"/>
+                <w:color w:val="3F4E66"/>
+                <w:sz w:val="19"/>
+                <w:szCs w:val="19"/>
+              </w:rPr>
+              <w:t xml:space="preserve">You no longer lead AMPTJ</w:t>
+            </w:r>
+          </w:p>
+        </w:tc>
+        <w:tc>
+          <w:tcPr>
+            <w:tcW w:type="dxa" w:w="3022"/>
+            <w:tcMar>
+              <w:top w:type="dxa" w:w="90"/>
+              <w:left w:type="dxa" w:w="130"/>
+              <w:bottom w:type="dxa" w:w="90"/>
+              <w:right w:type="dxa" w:w="130"/>
+            </w:tcMar>
+          </w:tcPr>
+          <w:p>
+            <w:pPr>
+              <w:spacing w:line="264"/>
+            </w:pPr>
+            <w:r>
+              <w:rPr>
+                <w:rFonts w:ascii="Calibri" w:cs="Calibri" w:eastAsia="Calibri" w:hAnsi="Calibri"/>
+                <w:color w:val="3F4E66"/>
+                <w:sz w:val="19"/>
+                <w:szCs w:val="19"/>
+              </w:rPr>
+              <w:t xml:space="preserve">Gita M no longer leads AMPTJ</w:t>
             </w:r>
           </w:p>
         </w:tc>
@@ -6544,10 +6785,10 @@
         </w:tblBorders>
       </w:tblPr>
       <w:tblGrid>
-        <w:gridCol w:w="1949"/>
-        <w:gridCol w:w="2339"/>
-        <w:gridCol w:w="3703"/>
-        <w:gridCol w:w="1755"/>
+        <w:gridCol w:w="2047"/>
+        <w:gridCol w:w="2144"/>
+        <w:gridCol w:w="3898"/>
+        <w:gridCol w:w="1657"/>
       </w:tblGrid>
       <w:tr>
         <w:trPr>
@@ -6555,7 +6796,7 @@
         </w:trPr>
         <w:tc>
           <w:tcPr>
-            <w:tcW w:type="dxa" w:w="1949"/>
+            <w:tcW w:type="dxa" w:w="2047"/>
             <w:shd w:fill="EEF2F7" w:val="clear"/>
             <w:tcMar>
               <w:top w:type="dxa" w:w="90"/>
@@ -6581,7 +6822,7 @@
         </w:tc>
         <w:tc>
           <w:tcPr>
-            <w:tcW w:type="dxa" w:w="2339"/>
+            <w:tcW w:type="dxa" w:w="2144"/>
             <w:shd w:fill="EEF2F7" w:val="clear"/>
             <w:tcMar>
               <w:top w:type="dxa" w:w="90"/>
@@ -6607,7 +6848,7 @@
         </w:tc>
         <w:tc>
           <w:tcPr>
-            <w:tcW w:type="dxa" w:w="3703"/>
+            <w:tcW w:type="dxa" w:w="3898"/>
             <w:shd w:fill="EEF2F7" w:val="clear"/>
             <w:tcMar>
               <w:top w:type="dxa" w:w="90"/>
@@ -6633,7 +6874,7 @@
         </w:tc>
         <w:tc>
           <w:tcPr>
-            <w:tcW w:type="dxa" w:w="1755"/>
+            <w:tcW w:type="dxa" w:w="1657"/>
             <w:shd w:fill="EEF2F7" w:val="clear"/>
             <w:tcMar>
               <w:top w:type="dxa" w:w="90"/>
@@ -6661,7 +6902,7 @@
       <w:tr>
         <w:tc>
           <w:tcPr>
-            <w:tcW w:type="dxa" w:w="1949"/>
+            <w:tcW w:type="dxa" w:w="2047"/>
             <w:tcMar>
               <w:top w:type="dxa" w:w="90"/>
               <w:left w:type="dxa" w:w="130"/>
@@ -6680,13 +6921,13 @@
                 <w:sz w:val="19"/>
                 <w:szCs w:val="19"/>
               </w:rPr>
-              <w:t xml:space="preserve">The person</w:t>
-            </w:r>
-          </w:p>
-        </w:tc>
-        <w:tc>
-          <w:tcPr>
-            <w:tcW w:type="dxa" w:w="2339"/>
+              <w:t xml:space="preserve">The person staffed</w:t>
+            </w:r>
+          </w:p>
+        </w:tc>
+        <w:tc>
+          <w:tcPr>
+            <w:tcW w:type="dxa" w:w="2144"/>
             <w:tcMar>
               <w:top w:type="dxa" w:w="90"/>
               <w:left w:type="dxa" w:w="130"/>
@@ -6711,32 +6952,32 @@
         </w:tc>
         <w:tc>
           <w:tcPr>
-            <w:tcW w:type="dxa" w:w="3703"/>
-            <w:tcMar>
-              <w:top w:type="dxa" w:w="90"/>
-              <w:left w:type="dxa" w:w="130"/>
-              <w:bottom w:type="dxa" w:w="90"/>
-              <w:right w:type="dxa" w:w="130"/>
-            </w:tcMar>
-          </w:tcPr>
-          <w:p>
-            <w:pPr>
-              <w:spacing w:line="264"/>
-            </w:pPr>
-            <w:r>
-              <w:rPr>
-                <w:rFonts w:ascii="Calibri" w:cs="Calibri" w:eastAsia="Calibri" w:hAnsi="Calibri"/>
-                <w:color w:val="3F4E66"/>
-                <w:sz w:val="19"/>
-                <w:szCs w:val="19"/>
-              </w:rPr>
-              <w:t xml:space="preserve">Always, if they have a login</w:t>
-            </w:r>
-          </w:p>
-        </w:tc>
-        <w:tc>
-          <w:tcPr>
-            <w:tcW w:type="dxa" w:w="1755"/>
+            <w:tcW w:type="dxa" w:w="3898"/>
+            <w:tcMar>
+              <w:top w:type="dxa" w:w="90"/>
+              <w:left w:type="dxa" w:w="130"/>
+              <w:bottom w:type="dxa" w:w="90"/>
+              <w:right w:type="dxa" w:w="130"/>
+            </w:tcMar>
+          </w:tcPr>
+          <w:p>
+            <w:pPr>
+              <w:spacing w:line="264"/>
+            </w:pPr>
+            <w:r>
+              <w:rPr>
+                <w:rFonts w:ascii="Calibri" w:cs="Calibri" w:eastAsia="Calibri" w:hAnsi="Calibri"/>
+                <w:color w:val="3F4E66"/>
+                <w:sz w:val="19"/>
+                <w:szCs w:val="19"/>
+              </w:rPr>
+              <w:t xml:space="preserve">Every assignment event</w:t>
+            </w:r>
+          </w:p>
+        </w:tc>
+        <w:tc>
+          <w:tcPr>
+            <w:tcW w:type="dxa" w:w="1657"/>
             <w:tcMar>
               <w:top w:type="dxa" w:w="90"/>
               <w:left w:type="dxa" w:w="130"/>
@@ -6763,7 +7004,7 @@
       <w:tr>
         <w:tc>
           <w:tcPr>
-            <w:tcW w:type="dxa" w:w="1949"/>
+            <w:tcW w:type="dxa" w:w="2047"/>
             <w:tcMar>
               <w:top w:type="dxa" w:w="90"/>
               <w:left w:type="dxa" w:w="130"/>
@@ -6788,7 +7029,7 @@
         </w:tc>
         <w:tc>
           <w:tcPr>
-            <w:tcW w:type="dxa" w:w="2339"/>
+            <w:tcW w:type="dxa" w:w="2144"/>
             <w:tcMar>
               <w:top w:type="dxa" w:w="90"/>
               <w:left w:type="dxa" w:w="130"/>
@@ -6813,32 +7054,32 @@
         </w:tc>
         <w:tc>
           <w:tcPr>
-            <w:tcW w:type="dxa" w:w="3703"/>
-            <w:tcMar>
-              <w:top w:type="dxa" w:w="90"/>
-              <w:left w:type="dxa" w:w="130"/>
-              <w:bottom w:type="dxa" w:w="90"/>
-              <w:right w:type="dxa" w:w="130"/>
-            </w:tcMar>
-          </w:tcPr>
-          <w:p>
-            <w:pPr>
-              <w:spacing w:line="264"/>
-            </w:pPr>
-            <w:r>
-              <w:rPr>
-                <w:rFonts w:ascii="Calibri" w:cs="Calibri" w:eastAsia="Calibri" w:hAnsi="Calibri"/>
-                <w:color w:val="3F4E66"/>
-                <w:sz w:val="19"/>
-                <w:szCs w:val="19"/>
-              </w:rPr>
-              <w:t xml:space="preserve">Always, unless already sent</w:t>
-            </w:r>
-          </w:p>
-        </w:tc>
-        <w:tc>
-          <w:tcPr>
-            <w:tcW w:type="dxa" w:w="1755"/>
+            <w:tcW w:type="dxa" w:w="3898"/>
+            <w:tcMar>
+              <w:top w:type="dxa" w:w="90"/>
+              <w:left w:type="dxa" w:w="130"/>
+              <w:bottom w:type="dxa" w:w="90"/>
+              <w:right w:type="dxa" w:w="130"/>
+            </w:tcMar>
+          </w:tcPr>
+          <w:p>
+            <w:pPr>
+              <w:spacing w:line="264"/>
+            </w:pPr>
+            <w:r>
+              <w:rPr>
+                <w:rFonts w:ascii="Calibri" w:cs="Calibri" w:eastAsia="Calibri" w:hAnsi="Calibri"/>
+                <w:color w:val="3F4E66"/>
+                <w:sz w:val="19"/>
+                <w:szCs w:val="19"/>
+              </w:rPr>
+              <w:t xml:space="preserve">Every assignment event</w:t>
+            </w:r>
+          </w:p>
+        </w:tc>
+        <w:tc>
+          <w:tcPr>
+            <w:tcW w:type="dxa" w:w="1657"/>
             <w:tcMar>
               <w:top w:type="dxa" w:w="90"/>
               <w:left w:type="dxa" w:w="130"/>
@@ -6865,7 +7106,7 @@
       <w:tr>
         <w:tc>
           <w:tcPr>
-            <w:tcW w:type="dxa" w:w="1949"/>
+            <w:tcW w:type="dxa" w:w="2047"/>
             <w:tcMar>
               <w:top w:type="dxa" w:w="90"/>
               <w:left w:type="dxa" w:w="130"/>
@@ -6890,7 +7131,7 @@
         </w:tc>
         <w:tc>
           <w:tcPr>
-            <w:tcW w:type="dxa" w:w="2339"/>
+            <w:tcW w:type="dxa" w:w="2144"/>
             <w:tcMar>
               <w:top w:type="dxa" w:w="90"/>
               <w:left w:type="dxa" w:w="130"/>
@@ -6915,26 +7156,26 @@
         </w:tc>
         <w:tc>
           <w:tcPr>
-            <w:tcW w:type="dxa" w:w="3703"/>
-            <w:tcMar>
-              <w:top w:type="dxa" w:w="90"/>
-              <w:left w:type="dxa" w:w="130"/>
-              <w:bottom w:type="dxa" w:w="90"/>
-              <w:right w:type="dxa" w:w="130"/>
-            </w:tcMar>
-          </w:tcPr>
-          <w:p>
-            <w:pPr>
-              <w:spacing w:line="264"/>
-            </w:pPr>
-            <w:r>
-              <w:rPr>
-                <w:rFonts w:ascii="Calibri" w:cs="Calibri" w:eastAsia="Calibri" w:hAnsi="Calibri"/>
-                <w:color w:val="3F4E66"/>
-                <w:sz w:val="19"/>
-                <w:szCs w:val="19"/>
-              </w:rPr>
-              <w:t xml:space="preserve">Only when </w:t>
+            <w:tcW w:type="dxa" w:w="3898"/>
+            <w:tcMar>
+              <w:top w:type="dxa" w:w="90"/>
+              <w:left w:type="dxa" w:w="130"/>
+              <w:bottom w:type="dxa" w:w="90"/>
+              <w:right w:type="dxa" w:w="130"/>
+            </w:tcMar>
+          </w:tcPr>
+          <w:p>
+            <w:pPr>
+              <w:spacing w:line="264"/>
+            </w:pPr>
+            <w:r>
+              <w:rPr>
+                <w:rFonts w:ascii="Calibri" w:cs="Calibri" w:eastAsia="Calibri" w:hAnsi="Calibri"/>
+                <w:color w:val="3F4E66"/>
+                <w:sz w:val="19"/>
+                <w:szCs w:val="19"/>
+              </w:rPr>
+              <w:t xml:space="preserve">Assignment events, when </w:t>
             </w:r>
             <w:r>
               <w:rPr>
@@ -6960,7 +7201,7 @@
         </w:tc>
         <w:tc>
           <w:tcPr>
-            <w:tcW w:type="dxa" w:w="1755"/>
+            <w:tcW w:type="dxa" w:w="1657"/>
             <w:tcMar>
               <w:top w:type="dxa" w:w="90"/>
               <w:left w:type="dxa" w:w="130"/>
@@ -6980,6 +7221,432 @@
                 <w:szCs w:val="19"/>
               </w:rPr>
               <w:t xml:space="preserve">My Projects</w:t>
+            </w:r>
+          </w:p>
+        </w:tc>
+      </w:tr>
+      <w:tr>
+        <w:tc>
+          <w:tcPr>
+            <w:tcW w:type="dxa" w:w="2047"/>
+            <w:tcMar>
+              <w:top w:type="dxa" w:w="90"/>
+              <w:left w:type="dxa" w:w="130"/>
+              <w:bottom w:type="dxa" w:w="90"/>
+              <w:right w:type="dxa" w:w="130"/>
+            </w:tcMar>
+          </w:tcPr>
+          <w:p>
+            <w:pPr>
+              <w:spacing w:line="264"/>
+            </w:pPr>
+            <w:r>
+              <w:rPr>
+                <w:rFonts w:ascii="Calibri" w:cs="Calibri" w:eastAsia="Calibri" w:hAnsi="Calibri"/>
+                <w:color w:val="16233A"/>
+                <w:sz w:val="19"/>
+                <w:szCs w:val="19"/>
+              </w:rPr>
+              <w:t xml:space="preserve">The incoming lead</w:t>
+            </w:r>
+          </w:p>
+        </w:tc>
+        <w:tc>
+          <w:tcPr>
+            <w:tcW w:type="dxa" w:w="2144"/>
+            <w:tcMar>
+              <w:top w:type="dxa" w:w="90"/>
+              <w:left w:type="dxa" w:w="130"/>
+              <w:bottom w:type="dxa" w:w="90"/>
+              <w:right w:type="dxa" w:w="130"/>
+            </w:tcMar>
+          </w:tcPr>
+          <w:p>
+            <w:pPr>
+              <w:spacing w:line="264"/>
+            </w:pPr>
+            <w:r>
+              <w:rPr>
+                <w:rFonts w:ascii="Calibri" w:cs="Calibri" w:eastAsia="Calibri" w:hAnsi="Calibri"/>
+                <w:color w:val="3F4E66"/>
+                <w:sz w:val="19"/>
+                <w:szCs w:val="19"/>
+              </w:rPr>
+              <w:t xml:space="preserve">the new </w:t>
+            </w:r>
+            <w:r>
+              <w:rPr>
+                <w:rFonts w:ascii="Consolas" w:cs="Consolas" w:eastAsia="Consolas" w:hAnsi="Consolas"/>
+                <w:color w:val="3F4E66"/>
+                <w:sz w:val="16"/>
+                <w:szCs w:val="16"/>
+              </w:rPr>
+              <w:t xml:space="preserve">manager_id</w:t>
+            </w:r>
+          </w:p>
+        </w:tc>
+        <w:tc>
+          <w:tcPr>
+            <w:tcW w:type="dxa" w:w="3898"/>
+            <w:tcMar>
+              <w:top w:type="dxa" w:w="90"/>
+              <w:left w:type="dxa" w:w="130"/>
+              <w:bottom w:type="dxa" w:w="90"/>
+              <w:right w:type="dxa" w:w="130"/>
+            </w:tcMar>
+          </w:tcPr>
+          <w:p>
+            <w:pPr>
+              <w:spacing w:line="264"/>
+            </w:pPr>
+            <w:r>
+              <w:rPr>
+                <w:rFonts w:ascii="Calibri" w:cs="Calibri" w:eastAsia="Calibri" w:hAnsi="Calibri"/>
+                <w:color w:val="3F4E66"/>
+                <w:sz w:val="19"/>
+                <w:szCs w:val="19"/>
+              </w:rPr>
+              <w:t xml:space="preserve">Lead change</w:t>
+            </w:r>
+          </w:p>
+        </w:tc>
+        <w:tc>
+          <w:tcPr>
+            <w:tcW w:type="dxa" w:w="1657"/>
+            <w:tcMar>
+              <w:top w:type="dxa" w:w="90"/>
+              <w:left w:type="dxa" w:w="130"/>
+              <w:bottom w:type="dxa" w:w="90"/>
+              <w:right w:type="dxa" w:w="130"/>
+            </w:tcMar>
+          </w:tcPr>
+          <w:p>
+            <w:pPr>
+              <w:spacing w:line="264"/>
+            </w:pPr>
+            <w:r>
+              <w:rPr>
+                <w:rFonts w:ascii="Calibri" w:cs="Calibri" w:eastAsia="Calibri" w:hAnsi="Calibri"/>
+                <w:color w:val="3F4E66"/>
+                <w:sz w:val="19"/>
+                <w:szCs w:val="19"/>
+              </w:rPr>
+              <w:t xml:space="preserve">My Projects</w:t>
+            </w:r>
+          </w:p>
+        </w:tc>
+      </w:tr>
+      <w:tr>
+        <w:tc>
+          <w:tcPr>
+            <w:tcW w:type="dxa" w:w="2047"/>
+            <w:tcMar>
+              <w:top w:type="dxa" w:w="90"/>
+              <w:left w:type="dxa" w:w="130"/>
+              <w:bottom w:type="dxa" w:w="90"/>
+              <w:right w:type="dxa" w:w="130"/>
+            </w:tcMar>
+          </w:tcPr>
+          <w:p>
+            <w:pPr>
+              <w:spacing w:line="264"/>
+            </w:pPr>
+            <w:r>
+              <w:rPr>
+                <w:rFonts w:ascii="Calibri" w:cs="Calibri" w:eastAsia="Calibri" w:hAnsi="Calibri"/>
+                <w:color w:val="16233A"/>
+                <w:sz w:val="19"/>
+                <w:szCs w:val="19"/>
+              </w:rPr>
+              <w:t xml:space="preserve">The outgoing lead</w:t>
+            </w:r>
+          </w:p>
+        </w:tc>
+        <w:tc>
+          <w:tcPr>
+            <w:tcW w:type="dxa" w:w="2144"/>
+            <w:tcMar>
+              <w:top w:type="dxa" w:w="90"/>
+              <w:left w:type="dxa" w:w="130"/>
+              <w:bottom w:type="dxa" w:w="90"/>
+              <w:right w:type="dxa" w:w="130"/>
+            </w:tcMar>
+          </w:tcPr>
+          <w:p>
+            <w:pPr>
+              <w:spacing w:line="264"/>
+            </w:pPr>
+            <w:r>
+              <w:rPr>
+                <w:rFonts w:ascii="Calibri" w:cs="Calibri" w:eastAsia="Calibri" w:hAnsi="Calibri"/>
+                <w:color w:val="3F4E66"/>
+                <w:sz w:val="19"/>
+                <w:szCs w:val="19"/>
+              </w:rPr>
+              <w:t xml:space="preserve">the old </w:t>
+            </w:r>
+            <w:r>
+              <w:rPr>
+                <w:rFonts w:ascii="Consolas" w:cs="Consolas" w:eastAsia="Consolas" w:hAnsi="Consolas"/>
+                <w:color w:val="3F4E66"/>
+                <w:sz w:val="16"/>
+                <w:szCs w:val="16"/>
+              </w:rPr>
+              <w:t xml:space="preserve">manager_id</w:t>
+            </w:r>
+          </w:p>
+        </w:tc>
+        <w:tc>
+          <w:tcPr>
+            <w:tcW w:type="dxa" w:w="3898"/>
+            <w:tcMar>
+              <w:top w:type="dxa" w:w="90"/>
+              <w:left w:type="dxa" w:w="130"/>
+              <w:bottom w:type="dxa" w:w="90"/>
+              <w:right w:type="dxa" w:w="130"/>
+            </w:tcMar>
+          </w:tcPr>
+          <w:p>
+            <w:pPr>
+              <w:spacing w:line="264"/>
+            </w:pPr>
+            <w:r>
+              <w:rPr>
+                <w:rFonts w:ascii="Calibri" w:cs="Calibri" w:eastAsia="Calibri" w:hAnsi="Calibri"/>
+                <w:color w:val="3F4E66"/>
+                <w:sz w:val="19"/>
+                <w:szCs w:val="19"/>
+              </w:rPr>
+              <w:t xml:space="preserve">Lead change — they lost access</w:t>
+            </w:r>
+          </w:p>
+        </w:tc>
+        <w:tc>
+          <w:tcPr>
+            <w:tcW w:type="dxa" w:w="1657"/>
+            <w:tcMar>
+              <w:top w:type="dxa" w:w="90"/>
+              <w:left w:type="dxa" w:w="130"/>
+              <w:bottom w:type="dxa" w:w="90"/>
+              <w:right w:type="dxa" w:w="130"/>
+            </w:tcMar>
+          </w:tcPr>
+          <w:p>
+            <w:pPr>
+              <w:spacing w:line="264"/>
+            </w:pPr>
+            <w:r>
+              <w:rPr>
+                <w:rFonts w:ascii="Calibri" w:cs="Calibri" w:eastAsia="Calibri" w:hAnsi="Calibri"/>
+                <w:color w:val="3F4E66"/>
+                <w:sz w:val="19"/>
+                <w:szCs w:val="19"/>
+              </w:rPr>
+              <w:t xml:space="preserve">none</w:t>
+            </w:r>
+          </w:p>
+        </w:tc>
+      </w:tr>
+      <w:tr>
+        <w:tc>
+          <w:tcPr>
+            <w:tcW w:type="dxa" w:w="2047"/>
+            <w:tcMar>
+              <w:top w:type="dxa" w:w="90"/>
+              <w:left w:type="dxa" w:w="130"/>
+              <w:bottom w:type="dxa" w:w="90"/>
+              <w:right w:type="dxa" w:w="130"/>
+            </w:tcMar>
+          </w:tcPr>
+          <w:p>
+            <w:pPr>
+              <w:spacing w:line="264"/>
+            </w:pPr>
+            <w:r>
+              <w:rPr>
+                <w:rFonts w:ascii="Calibri" w:cs="Calibri" w:eastAsia="Calibri" w:hAnsi="Calibri"/>
+                <w:color w:val="16233A"/>
+                <w:sz w:val="19"/>
+                <w:szCs w:val="19"/>
+              </w:rPr>
+              <w:t xml:space="preserve">Both their line managers</w:t>
+            </w:r>
+          </w:p>
+        </w:tc>
+        <w:tc>
+          <w:tcPr>
+            <w:tcW w:type="dxa" w:w="2144"/>
+            <w:tcMar>
+              <w:top w:type="dxa" w:w="90"/>
+              <w:left w:type="dxa" w:w="130"/>
+              <w:bottom w:type="dxa" w:w="90"/>
+              <w:right w:type="dxa" w:w="130"/>
+            </w:tcMar>
+          </w:tcPr>
+          <w:p>
+            <w:pPr>
+              <w:spacing w:line="264"/>
+            </w:pPr>
+            <w:r>
+              <w:rPr>
+                <w:rFonts w:ascii="Consolas" w:cs="Consolas" w:eastAsia="Consolas" w:hAnsi="Consolas"/>
+                <w:color w:val="3F4E66"/>
+                <w:sz w:val="16"/>
+                <w:szCs w:val="16"/>
+              </w:rPr>
+              <w:t xml:space="preserve">employees.manager_id</w:t>
+            </w:r>
+          </w:p>
+        </w:tc>
+        <w:tc>
+          <w:tcPr>
+            <w:tcW w:type="dxa" w:w="3898"/>
+            <w:tcMar>
+              <w:top w:type="dxa" w:w="90"/>
+              <w:left w:type="dxa" w:w="130"/>
+              <w:bottom w:type="dxa" w:w="90"/>
+              <w:right w:type="dxa" w:w="130"/>
+            </w:tcMar>
+          </w:tcPr>
+          <w:p>
+            <w:pPr>
+              <w:spacing w:line="264"/>
+            </w:pPr>
+            <w:r>
+              <w:rPr>
+                <w:rFonts w:ascii="Calibri" w:cs="Calibri" w:eastAsia="Calibri" w:hAnsi="Calibri"/>
+                <w:color w:val="3F4E66"/>
+                <w:sz w:val="19"/>
+                <w:szCs w:val="19"/>
+              </w:rPr>
+              <w:t xml:space="preserve">Lead change</w:t>
+            </w:r>
+          </w:p>
+        </w:tc>
+        <w:tc>
+          <w:tcPr>
+            <w:tcW w:type="dxa" w:w="1657"/>
+            <w:tcMar>
+              <w:top w:type="dxa" w:w="90"/>
+              <w:left w:type="dxa" w:w="130"/>
+              <w:bottom w:type="dxa" w:w="90"/>
+              <w:right w:type="dxa" w:w="130"/>
+            </w:tcMar>
+          </w:tcPr>
+          <w:p>
+            <w:pPr>
+              <w:spacing w:line="264"/>
+            </w:pPr>
+            <w:r>
+              <w:rPr>
+                <w:rFonts w:ascii="Calibri" w:cs="Calibri" w:eastAsia="Calibri" w:hAnsi="Calibri"/>
+                <w:color w:val="3F4E66"/>
+                <w:sz w:val="19"/>
+                <w:szCs w:val="19"/>
+              </w:rPr>
+              <w:t xml:space="preserve">none</w:t>
+            </w:r>
+          </w:p>
+        </w:tc>
+      </w:tr>
+      <w:tr>
+        <w:tc>
+          <w:tcPr>
+            <w:tcW w:type="dxa" w:w="2047"/>
+            <w:tcMar>
+              <w:top w:type="dxa" w:w="90"/>
+              <w:left w:type="dxa" w:w="130"/>
+              <w:bottom w:type="dxa" w:w="90"/>
+              <w:right w:type="dxa" w:w="130"/>
+            </w:tcMar>
+          </w:tcPr>
+          <w:p>
+            <w:pPr>
+              <w:spacing w:line="264"/>
+            </w:pPr>
+            <w:r>
+              <w:rPr>
+                <w:rFonts w:ascii="Calibri" w:cs="Calibri" w:eastAsia="Calibri" w:hAnsi="Calibri"/>
+                <w:color w:val="16233A"/>
+                <w:sz w:val="19"/>
+                <w:szCs w:val="19"/>
+              </w:rPr>
+              <w:t xml:space="preserve">The current members</w:t>
+            </w:r>
+          </w:p>
+        </w:tc>
+        <w:tc>
+          <w:tcPr>
+            <w:tcW w:type="dxa" w:w="2144"/>
+            <w:tcMar>
+              <w:top w:type="dxa" w:w="90"/>
+              <w:left w:type="dxa" w:w="130"/>
+              <w:bottom w:type="dxa" w:w="90"/>
+              <w:right w:type="dxa" w:w="130"/>
+            </w:tcMar>
+          </w:tcPr>
+          <w:p>
+            <w:pPr>
+              <w:spacing w:line="264"/>
+            </w:pPr>
+            <w:r>
+              <w:rPr>
+                <w:rFonts w:ascii="Consolas" w:cs="Consolas" w:eastAsia="Consolas" w:hAnsi="Consolas"/>
+                <w:color w:val="3F4E66"/>
+                <w:sz w:val="16"/>
+                <w:szCs w:val="16"/>
+              </w:rPr>
+              <w:t xml:space="preserve">project_members</w:t>
+            </w:r>
+          </w:p>
+        </w:tc>
+        <w:tc>
+          <w:tcPr>
+            <w:tcW w:type="dxa" w:w="3898"/>
+            <w:tcMar>
+              <w:top w:type="dxa" w:w="90"/>
+              <w:left w:type="dxa" w:w="130"/>
+              <w:bottom w:type="dxa" w:w="90"/>
+              <w:right w:type="dxa" w:w="130"/>
+            </w:tcMar>
+          </w:tcPr>
+          <w:p>
+            <w:pPr>
+              <w:spacing w:line="264"/>
+            </w:pPr>
+            <w:r>
+              <w:rPr>
+                <w:rFonts w:ascii="Calibri" w:cs="Calibri" w:eastAsia="Calibri" w:hAnsi="Calibri"/>
+                <w:color w:val="3F4E66"/>
+                <w:sz w:val="19"/>
+                <w:szCs w:val="19"/>
+              </w:rPr>
+              <w:t xml:space="preserve">Lead change, if the project is active</w:t>
+            </w:r>
+          </w:p>
+        </w:tc>
+        <w:tc>
+          <w:tcPr>
+            <w:tcW w:type="dxa" w:w="1657"/>
+            <w:tcMar>
+              <w:top w:type="dxa" w:w="90"/>
+              <w:left w:type="dxa" w:w="130"/>
+              <w:bottom w:type="dxa" w:w="90"/>
+              <w:right w:type="dxa" w:w="130"/>
+            </w:tcMar>
+          </w:tcPr>
+          <w:p>
+            <w:pPr>
+              <w:spacing w:line="264"/>
+            </w:pPr>
+            <w:r>
+              <w:rPr>
+                <w:rFonts w:ascii="Calibri" w:cs="Calibri" w:eastAsia="Calibri" w:hAnsi="Calibri"/>
+                <w:color w:val="3F4E66"/>
+                <w:sz w:val="19"/>
+                <w:szCs w:val="19"/>
+              </w:rPr>
+              <w:t xml:space="preserve">My Timesheet</w:t>
             </w:r>
           </w:p>
         </w:tc>
@@ -6997,197 +7664,13 @@
       <w:r>
         <w:rPr>
           <w:rFonts w:ascii="Cambria" w:cs="Cambria" w:eastAsia="Cambria" w:hAnsi="Cambria"/>
-          <w:color w:val="16233A"/>
-          <w:sz w:val="21"/>
-          <w:szCs w:val="21"/>
-        </w:rPr>
-        <w:t xml:space="preserve">The lead is not told about their own action — telling somebody what they just did is noise, and noise is how people learn to ignore a channel. Nobody receives the same event twice: each recipient is checked against the ones already sent. The line manager’s copy names the person rather than addressing them, and drops the "record your time" line — it is not their timesheet.</w:t>
-      </w:r>
-    </w:p>
-    <w:p>
-      <w:pPr>
-        <w:pStyle w:val="Heading2"/>
-        <w:spacing w:after="100" w:before="280"/>
-      </w:pPr>
-      <w:r>
-        <w:rPr>
-          <w:rFonts w:ascii="Calibri" w:cs="Calibri" w:eastAsia="Calibri" w:hAnsi="Calibri"/>
-          <w:b/>
-          <w:bCs/>
-          <w:color w:val="16233A"/>
-          <w:sz w:val="23"/>
-          <w:szCs w:val="23"/>
-        </w:rPr>
-        <w:t xml:space="preserve">The message</w:t>
-      </w:r>
-    </w:p>
-    <w:p>
-      <w:pPr>
-        <w:spacing w:after="140" w:line="288"/>
-      </w:pPr>
-      <w:r>
-        <w:rPr>
-          <w:rFonts w:ascii="Cambria" w:cs="Cambria" w:eastAsia="Cambria" w:hAnsi="Cambria"/>
-          <w:color w:val="16233A"/>
-          <w:sz w:val="21"/>
-          <w:szCs w:val="21"/>
-        </w:rPr>
-        <w:t xml:space="preserve">Every message carries the whole assignment, labelled, so nobody has to open the app to find out what changed:</w:t>
-      </w:r>
-    </w:p>
-    <w:p>
-      <w:pPr>
-        <w:pBdr>
-          <w:left w:val="single" w:color="1F5F94" w:sz="18" w:space="8"/>
-        </w:pBdr>
-        <w:shd w:fill="EEF2F7" w:val="clear"/>
-        <w:spacing w:after="160" w:before="120" w:line="260"/>
-        <w:ind w:left="120" w:right="120"/>
-      </w:pPr>
-      <w:r>
-        <w:rPr>
-          <w:rFonts w:ascii="Consolas" w:cs="Consolas" w:eastAsia="Consolas" w:hAnsi="Consolas"/>
-          <w:color w:val="3F4E66"/>
-          <w:sz w:val="17"/>
-          <w:szCs w:val="17"/>
-        </w:rPr>
-        <w:t xml:space="preserve">You were added to AMPTJ by Hari A.</w:t>
-      </w:r>
-      <w:r>
-        <w:br/>
-      </w:r>
-      <w:r>
-        <w:rPr>
-          <w:rFonts w:ascii="Consolas" w:cs="Consolas" w:eastAsia="Consolas" w:hAnsi="Consolas"/>
-          <w:color w:val="3F4E66"/>
-          <w:sz w:val="17"/>
-          <w:szCs w:val="17"/>
-        </w:rPr>
-        <w:t xml:space="preserve"/>
-      </w:r>
-      <w:r>
-        <w:br/>
-      </w:r>
-      <w:r>
-        <w:rPr>
-          <w:rFonts w:ascii="Consolas" w:cs="Consolas" w:eastAsia="Consolas" w:hAnsi="Consolas"/>
-          <w:color w:val="3F4E66"/>
-          <w:sz w:val="17"/>
-          <w:szCs w:val="17"/>
-        </w:rPr>
-        <w:t xml:space="preserve">Project: AMPTJ</w:t>
-      </w:r>
-      <w:r>
-        <w:br/>
-      </w:r>
-      <w:r>
-        <w:rPr>
-          <w:rFonts w:ascii="Consolas" w:cs="Consolas" w:eastAsia="Consolas" w:hAnsi="Consolas"/>
-          <w:color w:val="3F4E66"/>
-          <w:sz w:val="17"/>
-          <w:szCs w:val="17"/>
-        </w:rPr>
-        <w:t xml:space="preserve">Project ends: 31 Dec 2026</w:t>
-      </w:r>
-      <w:r>
-        <w:br/>
-      </w:r>
-      <w:r>
-        <w:rPr>
-          <w:rFonts w:ascii="Consolas" w:cs="Consolas" w:eastAsia="Consolas" w:hAnsi="Consolas"/>
-          <w:color w:val="3F4E66"/>
-          <w:sz w:val="17"/>
-          <w:szCs w:val="17"/>
-        </w:rPr>
-        <w:t xml:space="preserve">Employee: Meera R (100107)</w:t>
-      </w:r>
-      <w:r>
-        <w:br/>
-      </w:r>
-      <w:r>
-        <w:rPr>
-          <w:rFonts w:ascii="Consolas" w:cs="Consolas" w:eastAsia="Consolas" w:hAnsi="Consolas"/>
-          <w:color w:val="3F4E66"/>
-          <w:sz w:val="17"/>
-          <w:szCs w:val="17"/>
-        </w:rPr>
-        <w:t xml:space="preserve">Role: EC Consultant</w:t>
-      </w:r>
-      <w:r>
-        <w:br/>
-      </w:r>
-      <w:r>
-        <w:rPr>
-          <w:rFonts w:ascii="Consolas" w:cs="Consolas" w:eastAsia="Consolas" w:hAnsi="Consolas"/>
-          <w:color w:val="3F4E66"/>
-          <w:sz w:val="17"/>
-          <w:szCs w:val="17"/>
-        </w:rPr>
-        <w:t xml:space="preserve">Start date: 01 Feb 2026</w:t>
-      </w:r>
-      <w:r>
-        <w:br/>
-      </w:r>
-      <w:r>
-        <w:rPr>
-          <w:rFonts w:ascii="Consolas" w:cs="Consolas" w:eastAsia="Consolas" w:hAnsi="Consolas"/>
-          <w:color w:val="3F4E66"/>
-          <w:sz w:val="17"/>
-          <w:szCs w:val="17"/>
-        </w:rPr>
-        <w:t xml:space="preserve">End date: 30 Sep 2026</w:t>
-      </w:r>
-      <w:r>
-        <w:br/>
-      </w:r>
-      <w:r>
-        <w:rPr>
-          <w:rFonts w:ascii="Consolas" w:cs="Consolas" w:eastAsia="Consolas" w:hAnsi="Consolas"/>
-          <w:color w:val="3F4E66"/>
-          <w:sz w:val="17"/>
-          <w:szCs w:val="17"/>
-        </w:rPr>
-        <w:t xml:space="preserve">Percentage: 50%</w:t>
-      </w:r>
-      <w:r>
-        <w:br/>
-      </w:r>
-      <w:r>
-        <w:rPr>
-          <w:rFonts w:ascii="Consolas" w:cs="Consolas" w:eastAsia="Consolas" w:hAnsi="Consolas"/>
-          <w:color w:val="3F4E66"/>
-          <w:sz w:val="17"/>
-          <w:szCs w:val="17"/>
-        </w:rPr>
-        <w:t xml:space="preserve"/>
-      </w:r>
-      <w:r>
-        <w:br/>
-      </w:r>
-      <w:r>
-        <w:rPr>
-          <w:rFonts w:ascii="Consolas" w:cs="Consolas" w:eastAsia="Consolas" w:hAnsi="Consolas"/>
-          <w:color w:val="3F4E66"/>
-          <w:sz w:val="17"/>
-          <w:szCs w:val="17"/>
-        </w:rPr>
-        <w:t xml:space="preserve">Record your time against it in My Timesheet.</w:t>
-      </w:r>
-    </w:p>
-    <w:p>
-      <w:pPr>
-        <w:spacing w:after="140" w:line="288"/>
-      </w:pPr>
-      <w:r>
-        <w:rPr>
-          <w:rFonts w:ascii="Cambria" w:cs="Cambria" w:eastAsia="Cambria" w:hAnsi="Cambria"/>
           <w:b/>
           <w:bCs/>
           <w:color w:val="16233A"/>
           <w:sz w:val="21"/>
           <w:szCs w:val="21"/>
         </w:rPr>
-        <w:t xml:space="preserve">Project ends</w:t>
+        <w:t xml:space="preserve">Nobody is told twice, and nobody is told about their own action.</w:t>
       </w:r>
       <w:r>
         <w:rPr>
@@ -7196,27 +7679,7 @@
           <w:sz w:val="21"/>
           <w:szCs w:val="21"/>
         </w:rPr>
-        <w:t xml:space="preserve"> is there because since migration 792 the project’s end date is the </w:t>
-      </w:r>
-      <w:r>
-        <w:rPr>
-          <w:rFonts w:ascii="Cambria" w:cs="Cambria" w:eastAsia="Cambria" w:hAnsi="Cambria"/>
-          <w:i/>
-          <w:iCs/>
-          <w:color w:val="16233A"/>
-          <w:sz w:val="21"/>
-          <w:szCs w:val="21"/>
-        </w:rPr>
-        <w:t xml:space="preserve">ceiling</w:t>
-      </w:r>
-      <w:r>
-        <w:rPr>
-          <w:rFonts w:ascii="Cambria" w:cs="Cambria" w:eastAsia="Cambria" w:hAnsi="Cambria"/>
-          <w:color w:val="16233A"/>
-          <w:sz w:val="21"/>
-          <w:szCs w:val="21"/>
-        </w:rPr>
-        <w:t xml:space="preserve"> on the assignment’s — quoting the ceiling is what makes the line above it mean something.</w:t>
+        <w:t xml:space="preserve"> Both rules come from one mechanism: each recipient is checked against the list already sent, and the actor is seeded into that list before anybody is resolved. Telling somebody what they just did is noise, and noise is how people learn to ignore a channel.</w:t>
       </w:r>
     </w:p>
     <w:tbl>
@@ -7260,7 +7723,7 @@
                 <w:sz w:val="16"/>
                 <w:szCs w:val="16"/>
               </w:rPr>
-              <w:t xml:space="preserve">WHY THE LABELS ARE NOT COLUMN-ALIGNED</w:t>
+              <w:t xml:space="preserve">WHY THE TEAM IS TOLD ABOUT A LEAD CHANGE AND NOT ABOUT EACH OTHER’S ASSIGNMENTS</w:t>
             </w:r>
           </w:p>
           <w:p>
@@ -7274,7 +7737,21 @@
                 <w:sz w:val="20"/>
                 <w:szCs w:val="20"/>
               </w:rPr>
-              <w:t xml:space="preserve">Migration 793 padded them so the values would form a column. It could never work: the mail template escapes the body, turns newlines into line breaks and renders it in one paragraph in a proportional font — and HTML collapses runs of spaces. Migration 794 removed the padding rather than keep implying a column that never appears. Real alignment needs the edge function to render structured detail as a table, which is a change to that shared function.</w:t>
+              <w:t xml:space="preserve">A new lead can see the team’s hours on that project. That is a visibility change affecting the people whose work it is, which is a different thing from an FYI. A colleague’s percentage changing is not — so members hear about the lead, and not about each other.</w:t>
+            </w:r>
+          </w:p>
+          <w:p>
+            <w:pPr>
+              <w:spacing w:after="70" w:line="276"/>
+            </w:pPr>
+            <w:r>
+              <w:rPr>
+                <w:rFonts w:ascii="Cambria" w:cs="Cambria" w:eastAsia="Cambria" w:hAnsi="Cambria"/>
+                <w:color w:val="3F4E66"/>
+                <w:sz w:val="20"/>
+                <w:szCs w:val="20"/>
+              </w:rPr>
+              <w:t xml:space="preserve">Current members only. Somebody who has already rolled off is not mailed about a project they left, even though the new lead can see their past hours. Members only, never their line managers — that is the multiplier that would turn one lead change into thirty messages.</w:t>
             </w:r>
           </w:p>
         </w:tc>
@@ -7299,7 +7776,7 @@
           <w:sz w:val="23"/>
           <w:szCs w:val="23"/>
         </w:rPr>
-        <w:t xml:space="preserve">Ordering and failure</w:t>
+        <w:t xml:space="preserve">The message</w:t>
       </w:r>
     </w:p>
     <w:p>
@@ -7313,198 +7790,7 @@
           <w:sz w:val="21"/>
           <w:szCs w:val="21"/>
         </w:rPr>
-        <w:t xml:space="preserve">Two details that are easy to get wrong and are asserted by the migration’s own verification:</w:t>
-      </w:r>
-    </w:p>
-    <w:p>
-      <w:pPr>
-        <w:pStyle w:val="ListParagraph"/>
-        <w:numPr>
-          <w:ilvl w:val="0"/>
-          <w:numId w:val="1"/>
-        </w:numPr>
-        <w:spacing w:after="70" w:line="288"/>
-      </w:pPr>
-      <w:r>
-        <w:rPr>
-          <w:rFonts w:ascii="Cambria" w:cs="Cambria" w:eastAsia="Cambria" w:hAnsi="Cambria"/>
-          <w:b/>
-          <w:bCs/>
-          <w:color w:val="16233A"/>
-          <w:sz w:val="21"/>
-          <w:szCs w:val="21"/>
-        </w:rPr>
-        <w:t xml:space="preserve">The `removed` message is composed before the row is deleted.</w:t>
-      </w:r>
-      <w:r>
-        <w:rPr>
-          <w:rFonts w:ascii="Cambria" w:cs="Cambria" w:eastAsia="Cambria" w:hAnsi="Cambria"/>
-          <w:color w:val="16233A"/>
-          <w:sz w:val="21"/>
-          <w:szCs w:val="21"/>
-        </w:rPr>
-        <w:t xml:space="preserve"> Afterwards there is nothing left to describe, and "an assignment was removed" without saying which is worse than silence.</w:t>
-      </w:r>
-    </w:p>
-    <w:p>
-      <w:pPr>
-        <w:pStyle w:val="ListParagraph"/>
-        <w:numPr>
-          <w:ilvl w:val="0"/>
-          <w:numId w:val="1"/>
-        </w:numPr>
-        <w:spacing w:after="70" w:line="288"/>
-      </w:pPr>
-      <w:r>
-        <w:rPr>
-          <w:rFonts w:ascii="Cambria" w:cs="Cambria" w:eastAsia="Cambria" w:hAnsi="Cambria"/>
-          <w:b/>
-          <w:bCs/>
-          <w:color w:val="16233A"/>
-          <w:sz w:val="21"/>
-          <w:szCs w:val="21"/>
-        </w:rPr>
-        <w:t xml:space="preserve">The `ended` message is sent after the update,</w:t>
-      </w:r>
-      <w:r>
-        <w:rPr>
-          <w:rFonts w:ascii="Cambria" w:cs="Cambria" w:eastAsia="Cambria" w:hAnsi="Cambria"/>
-          <w:color w:val="16233A"/>
-          <w:sz w:val="21"/>
-          <w:szCs w:val="21"/>
-        </w:rPr>
-        <w:t xml:space="preserve"> so the end date it quotes is the new one.</w:t>
-      </w:r>
-    </w:p>
-    <w:p>
-      <w:pPr>
-        <w:spacing w:after="140" w:line="288"/>
-      </w:pPr>
-      <w:r>
-        <w:rPr>
-          <w:rFonts w:ascii="Cambria" w:cs="Cambria" w:eastAsia="Cambria" w:hAnsi="Cambria"/>
-          <w:color w:val="16233A"/>
-          <w:sz w:val="21"/>
-          <w:szCs w:val="21"/>
-        </w:rPr>
-        <w:t xml:space="preserve">Every notify call is wrapped: a notification failure can never roll back a staffing change that succeeded. But it is never silent either — the RPC returns </w:t>
-      </w:r>
-      <w:r>
-        <w:rPr>
-          <w:rFonts w:ascii="Consolas" w:cs="Consolas" w:eastAsia="Consolas" w:hAnsi="Consolas"/>
-          <w:color w:val="3F4E66"/>
-          <w:sz w:val="18"/>
-          <w:szCs w:val="18"/>
-        </w:rPr>
-        <w:t xml:space="preserve">notified</w:t>
-      </w:r>
-      <w:r>
-        <w:rPr>
-          <w:rFonts w:ascii="Cambria" w:cs="Cambria" w:eastAsia="Cambria" w:hAnsi="Cambria"/>
-          <w:color w:val="16233A"/>
-          <w:sz w:val="21"/>
-          <w:szCs w:val="21"/>
-        </w:rPr>
-        <w:t xml:space="preserve"> and, if something threw, </w:t>
-      </w:r>
-      <w:r>
-        <w:rPr>
-          <w:rFonts w:ascii="Consolas" w:cs="Consolas" w:eastAsia="Consolas" w:hAnsi="Consolas"/>
-          <w:color w:val="3F4E66"/>
-          <w:sz w:val="18"/>
-          <w:szCs w:val="18"/>
-        </w:rPr>
-        <w:t xml:space="preserve">notify_error</w:t>
-      </w:r>
-      <w:r>
-        <w:rPr>
-          <w:rFonts w:ascii="Cambria" w:cs="Cambria" w:eastAsia="Cambria" w:hAnsi="Cambria"/>
-          <w:color w:val="16233A"/>
-          <w:sz w:val="21"/>
-          <w:szCs w:val="21"/>
-        </w:rPr>
-        <w:t xml:space="preserve">, and the Add path reports it on screen: </w:t>
-      </w:r>
-      <w:r>
-        <w:rPr>
-          <w:rFonts w:ascii="Cambria" w:cs="Cambria" w:eastAsia="Cambria" w:hAnsi="Cambria"/>
-          <w:i/>
-          <w:iCs/>
-          <w:color w:val="16233A"/>
-          <w:sz w:val="21"/>
-          <w:szCs w:val="21"/>
-        </w:rPr>
-        <w:t xml:space="preserve">"Meera added — but they could not be notified. Tell them directly."</w:t>
-      </w:r>
-    </w:p>
-    <w:p>
-      <w:pPr>
-        <w:spacing w:after="160"/>
-      </w:pPr>
-    </w:p>
-    <w:p>
-      <w:pPr>
-        <w:pStyle w:val="Heading1"/>
-        <w:pBdr>
-          <w:top w:val="single" w:color="D7DFE9" w:sz="6" w:space="12"/>
-        </w:pBdr>
-        <w:spacing w:after="140" w:before="400"/>
-      </w:pPr>
-      <w:r>
-        <w:rPr>
-          <w:rFonts w:ascii="Calibri" w:cs="Calibri" w:eastAsia="Calibri" w:hAnsi="Calibri"/>
-          <w:b/>
-          <w:bCs/>
-          <w:color w:val="1F5F94"/>
-          <w:sz w:val="22"/>
-          <w:szCs w:val="22"/>
-        </w:rPr>
-        <w:t xml:space="preserve">6   </w:t>
-      </w:r>
-      <w:r>
-        <w:rPr>
-          <w:rFonts w:ascii="Calibri" w:cs="Calibri" w:eastAsia="Calibri" w:hAnsi="Calibri"/>
-          <w:b/>
-          <w:bCs/>
-          <w:color w:val="16233A"/>
-          <w:sz w:val="30"/>
-          <w:szCs w:val="30"/>
-        </w:rPr>
-        <w:t xml:space="preserve">Which projects a person can book time to</w:t>
-      </w:r>
-    </w:p>
-    <w:p>
-      <w:pPr>
-        <w:spacing w:after="140" w:line="288"/>
-      </w:pPr>
-      <w:r>
-        <w:rPr>
-          <w:rFonts w:ascii="Cambria" w:cs="Cambria" w:eastAsia="Cambria" w:hAnsi="Cambria"/>
-          <w:color w:val="3F4E66"/>
-          <w:sz w:val="23"/>
-          <w:szCs w:val="23"/>
-        </w:rPr>
-        <w:t xml:space="preserve">Two timelines govern the timesheet dropdown, and both must cover </w:t>
-      </w:r>
-      <w:r>
-        <w:rPr>
-          <w:rFonts w:ascii="Cambria" w:cs="Cambria" w:eastAsia="Cambria" w:hAnsi="Cambria"/>
-          <w:i/>
-          <w:iCs/>
-          <w:color w:val="3F4E66"/>
-          <w:sz w:val="23"/>
-          <w:szCs w:val="23"/>
-        </w:rPr>
-        <w:t xml:space="preserve">every</w:t>
-      </w:r>
-      <w:r>
-        <w:rPr>
-          <w:rFonts w:ascii="Cambria" w:cs="Cambria" w:eastAsia="Cambria" w:hAnsi="Cambria"/>
-          <w:color w:val="3F4E66"/>
-          <w:sz w:val="23"/>
-          <w:szCs w:val="23"/>
-        </w:rPr>
-        <w:t xml:space="preserve"> day being written: the project’s own window, and that person’s allocation window.</w:t>
+        <w:t xml:space="preserve">Every assignment message carries the whole assignment, labelled, so nobody has to open the app to find out what changed:</w:t>
       </w:r>
     </w:p>
     <w:p>
@@ -7523,7 +7809,7 @@
           <w:sz w:val="17"/>
           <w:szCs w:val="17"/>
         </w:rPr>
-        <w:t xml:space="preserve">AUGUST      1 ─────── 7 ─────── 14 ─────── 21 ─────── 28 ─── 31</w:t>
+        <w:t xml:space="preserve">You were added to AMPTJ by Hari A.</w:t>
       </w:r>
       <w:r>
         <w:br/>
@@ -7547,7 +7833,7 @@
           <w:sz w:val="17"/>
           <w:szCs w:val="17"/>
         </w:rPr>
-        <w:t xml:space="preserve">Project     ███████████████████████████████████████████       ends 28 Aug</w:t>
+        <w:t xml:space="preserve">Project: AMPTJ</w:t>
       </w:r>
       <w:r>
         <w:br/>
@@ -7559,7 +7845,7 @@
           <w:sz w:val="17"/>
           <w:szCs w:val="17"/>
         </w:rPr>
-        <w:t xml:space="preserve">Allocation  ███████████████████            █████████████       two stints</w:t>
+        <w:t xml:space="preserve">Project ends: 31 Dec 2026</w:t>
       </w:r>
       <w:r>
         <w:br/>
@@ -7571,7 +7857,7 @@
           <w:sz w:val="17"/>
           <w:szCs w:val="17"/>
         </w:rPr>
-        <w:t xml:space="preserve"/>
+        <w:t xml:space="preserve">Employee: Meera R (100107)</w:t>
       </w:r>
       <w:r>
         <w:br/>
@@ -7583,7 +7869,7 @@
           <w:sz w:val="17"/>
           <w:szCs w:val="17"/>
         </w:rPr>
-        <w:t xml:space="preserve">Offered     ███████████████████    (not a  █████████████  (project</w:t>
+        <w:t xml:space="preserve">Role: EC Consultant</w:t>
       </w:r>
       <w:r>
         <w:br/>
@@ -7595,7 +7881,7 @@
           <w:sz w:val="17"/>
           <w:szCs w:val="17"/>
         </w:rPr>
-        <w:t xml:space="preserve">                                   member)                 has ended)</w:t>
+        <w:t xml:space="preserve">Start date: 01 Feb 2026</w:t>
       </w:r>
       <w:r>
         <w:br/>
@@ -7607,7 +7893,7 @@
           <w:sz w:val="17"/>
           <w:szCs w:val="17"/>
         </w:rPr>
-        <w:t xml:space="preserve"/>
+        <w:t xml:space="preserve">End date: 30 Sep 2026</w:t>
       </w:r>
       <w:r>
         <w:br/>
@@ -7619,7 +7905,7 @@
           <w:sz w:val="17"/>
           <w:szCs w:val="17"/>
         </w:rPr>
-        <w:t xml:space="preserve">Exemption:  an entry that already exists on a day keeps its project</w:t>
+        <w:t xml:space="preserve">Percentage: 50%</w:t>
       </w:r>
       <w:r>
         <w:br/>
@@ -7631,22 +7917,25 @@
           <w:sz w:val="17"/>
           <w:szCs w:val="17"/>
         </w:rPr>
-        <w:t xml:space="preserve">            on that day, whatever the two windows now say.</w:t>
+        <w:t xml:space="preserve"/>
+      </w:r>
+      <w:r>
+        <w:br/>
+      </w:r>
+      <w:r>
+        <w:rPr>
+          <w:rFonts w:ascii="Consolas" w:cs="Consolas" w:eastAsia="Consolas" w:hAnsi="Consolas"/>
+          <w:color w:val="3F4E66"/>
+          <w:sz w:val="17"/>
+          <w:szCs w:val="17"/>
+        </w:rPr>
+        <w:t xml:space="preserve">Record your time against it in My Timesheet.</w:t>
       </w:r>
     </w:p>
     <w:p>
       <w:pPr>
         <w:spacing w:after="140" w:line="288"/>
       </w:pPr>
-      <w:r>
-        <w:rPr>
-          <w:rFonts w:ascii="Cambria" w:cs="Cambria" w:eastAsia="Cambria" w:hAnsi="Cambria"/>
-          <w:color w:val="16233A"/>
-          <w:sz w:val="21"/>
-          <w:szCs w:val="21"/>
-        </w:rPr>
-        <w:t xml:space="preserve">Both windows are inclusive at both ends, and both are tested </w:t>
-      </w:r>
       <w:r>
         <w:rPr>
           <w:rFonts w:ascii="Cambria" w:cs="Cambria" w:eastAsia="Cambria" w:hAnsi="Cambria"/>
@@ -7656,7 +7945,7 @@
           <w:sz w:val="21"/>
           <w:szCs w:val="21"/>
         </w:rPr>
-        <w:t xml:space="preserve">per day</w:t>
+        <w:t xml:space="preserve">Project ends</w:t>
       </w:r>
       <w:r>
         <w:rPr>
@@ -7665,7 +7954,27 @@
           <w:sz w:val="21"/>
           <w:szCs w:val="21"/>
         </w:rPr>
-        <w:t xml:space="preserve">, not per month. Before migration 787 the allocation window was only tested per month, so a stint ending on the 10th left the project offered for the rest of August.</w:t>
+        <w:t xml:space="preserve"> is there because since migration 792 the project’s end date is the </w:t>
+      </w:r>
+      <w:r>
+        <w:rPr>
+          <w:rFonts w:ascii="Cambria" w:cs="Cambria" w:eastAsia="Cambria" w:hAnsi="Cambria"/>
+          <w:i/>
+          <w:iCs/>
+          <w:color w:val="16233A"/>
+          <w:sz w:val="21"/>
+          <w:szCs w:val="21"/>
+        </w:rPr>
+        <w:t xml:space="preserve">ceiling</w:t>
+      </w:r>
+      <w:r>
+        <w:rPr>
+          <w:rFonts w:ascii="Cambria" w:cs="Cambria" w:eastAsia="Cambria" w:hAnsi="Cambria"/>
+          <w:color w:val="16233A"/>
+          <w:sz w:val="21"/>
+          <w:szCs w:val="21"/>
+        </w:rPr>
+        <w:t xml:space="preserve"> on the assignment’s — quoting the ceiling is what makes the line above it mean something. A lead message carries its own block instead: the project’s dates, team size, budget and who led it before.</w:t>
       </w:r>
     </w:p>
     <w:p>
@@ -7682,7 +7991,7 @@
           <w:sz w:val="23"/>
           <w:szCs w:val="23"/>
         </w:rPr>
-        <w:t xml:space="preserve">How it resolves</w:t>
+        <w:t xml:space="preserve">Changing the wording, without a deploy</w:t>
       </w:r>
     </w:p>
     <w:p>
@@ -7691,12 +8000,52 @@
       </w:pPr>
       <w:r>
         <w:rPr>
+          <w:rFonts w:ascii="Cambria" w:cs="Cambria" w:eastAsia="Cambria" w:hAnsi="Cambria"/>
+          <w:b/>
+          <w:bCs/>
+          <w:color w:val="16233A"/>
+          <w:sz w:val="21"/>
+          <w:szCs w:val="21"/>
+        </w:rPr>
+        <w:t xml:space="preserve">Admin → Workflow → Notifications</w:t>
+      </w:r>
+      <w:r>
+        <w:rPr>
+          <w:rFonts w:ascii="Cambria" w:cs="Cambria" w:eastAsia="Cambria" w:hAnsi="Cambria"/>
+          <w:color w:val="16233A"/>
+          <w:sz w:val="21"/>
+          <w:szCs w:val="21"/>
+        </w:rPr>
+        <w:t xml:space="preserve">, filter by the </w:t>
+      </w:r>
+      <w:r>
+        <w:rPr>
+          <w:rFonts w:ascii="Cambria" w:cs="Cambria" w:eastAsia="Cambria" w:hAnsi="Cambria"/>
+          <w:b/>
+          <w:bCs/>
+          <w:color w:val="16233A"/>
+          <w:sz w:val="21"/>
+          <w:szCs w:val="21"/>
+        </w:rPr>
+        <w:t xml:space="preserve">Project</w:t>
+      </w:r>
+      <w:r>
+        <w:rPr>
+          <w:rFonts w:ascii="Cambria" w:cs="Cambria" w:eastAsia="Cambria" w:hAnsi="Cambria"/>
+          <w:color w:val="16233A"/>
+          <w:sz w:val="21"/>
+          <w:szCs w:val="21"/>
+        </w:rPr>
+        <w:t xml:space="preserve"> category. Thirteen templates: eight for assignments (</w:t>
+      </w:r>
+      <w:r>
+        <w:rPr>
           <w:rFonts w:ascii="Consolas" w:cs="Consolas" w:eastAsia="Consolas" w:hAnsi="Consolas"/>
           <w:color w:val="3F4E66"/>
           <w:sz w:val="18"/>
           <w:szCs w:val="18"/>
         </w:rPr>
-        <w:t xml:space="preserve">my_timesheet_projects(employee, period_start, period_end)</w:t>
+        <w:t xml:space="preserve">_self</w:t>
       </w:r>
       <w:r>
         <w:rPr>
@@ -7705,7 +8054,7 @@
           <w:sz w:val="21"/>
           <w:szCs w:val="21"/>
         </w:rPr>
-        <w:t xml:space="preserve"> returns the candidate projects for the displayed month, each carrying its own window and </w:t>
+        <w:t xml:space="preserve"> and </w:t>
       </w:r>
       <w:r>
         <w:rPr>
@@ -7714,7 +8063,7 @@
           <w:sz w:val="18"/>
           <w:szCs w:val="18"/>
         </w:rPr>
-        <w:t xml:space="preserve">member_spells</w:t>
+        <w:t xml:space="preserve">_other</w:t>
       </w:r>
       <w:r>
         <w:rPr>
@@ -7723,157 +8072,634 @@
           <w:sz w:val="21"/>
           <w:szCs w:val="21"/>
         </w:rPr>
-        <w:t xml:space="preserve"> — a JSON </w:t>
-      </w:r>
-      <w:r>
-        <w:rPr>
-          <w:rFonts w:ascii="Cambria" w:cs="Cambria" w:eastAsia="Cambria" w:hAnsi="Cambria"/>
-          <w:i/>
-          <w:iCs/>
-          <w:color w:val="16233A"/>
-          <w:sz w:val="21"/>
-          <w:szCs w:val="21"/>
-        </w:rPr>
-        <w:t xml:space="preserve">array</w:t>
-      </w:r>
-      <w:r>
-        <w:rPr>
-          <w:rFonts w:ascii="Cambria" w:cs="Cambria" w:eastAsia="Cambria" w:hAnsi="Cambria"/>
-          <w:color w:val="16233A"/>
-          <w:sz w:val="21"/>
-          <w:szCs w:val="21"/>
-        </w:rPr>
-        <w:t xml:space="preserve"> of the person’s stints overlapping that month. An array rather than a first-and-last pair, because somebody on a project 1–10 January and again 20–31 January would otherwise be handed the ten days in the middle when they were off it.</w:t>
+        <w:t xml:space="preserve"> for each of the four events) and five for lead changes. Edit the subject or the body and it takes effect on the very next notification.</w:t>
       </w:r>
     </w:p>
+    <w:tbl>
+      <w:tblPr>
+        <w:tblW w:type="dxa" w:w="9746"/>
+        <w:tblBorders>
+          <w:top w:val="single" w:color="D7DFE9" w:sz="4"/>
+          <w:left w:val="single" w:color="D7DFE9" w:sz="4"/>
+          <w:bottom w:val="single" w:color="D7DFE9" w:sz="4"/>
+          <w:right w:val="single" w:color="D7DFE9" w:sz="4"/>
+          <w:insideH w:val="single" w:color="D7DFE9" w:sz="2"/>
+          <w:insideV w:val="single" w:color="D7DFE9" w:sz="2"/>
+        </w:tblBorders>
+      </w:tblPr>
+      <w:tblGrid>
+        <w:gridCol w:w="3703"/>
+        <w:gridCol w:w="6043"/>
+      </w:tblGrid>
+      <w:tr>
+        <w:trPr>
+          <w:tblHeader/>
+        </w:trPr>
+        <w:tc>
+          <w:tcPr>
+            <w:tcW w:type="dxa" w:w="3703"/>
+            <w:shd w:fill="EEF2F7" w:val="clear"/>
+            <w:tcMar>
+              <w:top w:type="dxa" w:w="90"/>
+              <w:left w:type="dxa" w:w="130"/>
+              <w:bottom w:type="dxa" w:w="90"/>
+              <w:right w:type="dxa" w:w="130"/>
+            </w:tcMar>
+          </w:tcPr>
+          <w:p>
+            <w:r>
+              <w:rPr>
+                <w:rFonts w:ascii="Calibri" w:cs="Calibri" w:eastAsia="Calibri" w:hAnsi="Calibri"/>
+                <w:b/>
+                <w:bCs/>
+                <w:color w:val="6C7A91"/>
+                <w:spacing w:val="14"/>
+                <w:sz w:val="15"/>
+                <w:szCs w:val="15"/>
+              </w:rPr>
+              <w:t xml:space="preserve">TOKEN</w:t>
+            </w:r>
+          </w:p>
+        </w:tc>
+        <w:tc>
+          <w:tcPr>
+            <w:tcW w:type="dxa" w:w="6043"/>
+            <w:shd w:fill="EEF2F7" w:val="clear"/>
+            <w:tcMar>
+              <w:top w:type="dxa" w:w="90"/>
+              <w:left w:type="dxa" w:w="130"/>
+              <w:bottom w:type="dxa" w:w="90"/>
+              <w:right w:type="dxa" w:w="130"/>
+            </w:tcMar>
+          </w:tcPr>
+          <w:p>
+            <w:r>
+              <w:rPr>
+                <w:rFonts w:ascii="Calibri" w:cs="Calibri" w:eastAsia="Calibri" w:hAnsi="Calibri"/>
+                <w:b/>
+                <w:bCs/>
+                <w:color w:val="6C7A91"/>
+                <w:spacing w:val="14"/>
+                <w:sz w:val="15"/>
+                <w:szCs w:val="15"/>
+              </w:rPr>
+              <w:t xml:space="preserve">RESOLVES TO</w:t>
+            </w:r>
+          </w:p>
+        </w:tc>
+      </w:tr>
+      <w:tr>
+        <w:tc>
+          <w:tcPr>
+            <w:tcW w:type="dxa" w:w="3703"/>
+            <w:tcMar>
+              <w:top w:type="dxa" w:w="90"/>
+              <w:left w:type="dxa" w:w="130"/>
+              <w:bottom w:type="dxa" w:w="90"/>
+              <w:right w:type="dxa" w:w="130"/>
+            </w:tcMar>
+          </w:tcPr>
+          <w:p>
+            <w:pPr>
+              <w:spacing w:line="264"/>
+            </w:pPr>
+            <w:r>
+              <w:rPr>
+                <w:rFonts w:ascii="Consolas" w:cs="Consolas" w:eastAsia="Consolas" w:hAnsi="Consolas"/>
+                <w:color w:val="16233A"/>
+                <w:sz w:val="16"/>
+                <w:szCs w:val="16"/>
+              </w:rPr>
+              <w:t xml:space="preserve">{{project}}</w:t>
+            </w:r>
+            <w:r>
+              <w:rPr>
+                <w:rFonts w:ascii="Calibri" w:cs="Calibri" w:eastAsia="Calibri" w:hAnsi="Calibri"/>
+                <w:color w:val="16233A"/>
+                <w:sz w:val="19"/>
+                <w:szCs w:val="19"/>
+              </w:rPr>
+              <w:t xml:space="preserve"> </w:t>
+            </w:r>
+            <w:r>
+              <w:rPr>
+                <w:rFonts w:ascii="Consolas" w:cs="Consolas" w:eastAsia="Consolas" w:hAnsi="Consolas"/>
+                <w:color w:val="16233A"/>
+                <w:sz w:val="16"/>
+                <w:szCs w:val="16"/>
+              </w:rPr>
+              <w:t xml:space="preserve">{{project_end}}</w:t>
+            </w:r>
+          </w:p>
+        </w:tc>
+        <w:tc>
+          <w:tcPr>
+            <w:tcW w:type="dxa" w:w="6043"/>
+            <w:tcMar>
+              <w:top w:type="dxa" w:w="90"/>
+              <w:left w:type="dxa" w:w="130"/>
+              <w:bottom w:type="dxa" w:w="90"/>
+              <w:right w:type="dxa" w:w="130"/>
+            </w:tcMar>
+          </w:tcPr>
+          <w:p>
+            <w:pPr>
+              <w:spacing w:line="264"/>
+            </w:pPr>
+            <w:r>
+              <w:rPr>
+                <w:rFonts w:ascii="Calibri" w:cs="Calibri" w:eastAsia="Calibri" w:hAnsi="Calibri"/>
+                <w:color w:val="3F4E66"/>
+                <w:sz w:val="19"/>
+                <w:szCs w:val="19"/>
+              </w:rPr>
+              <w:t xml:space="preserve">Project name, and when it ends</w:t>
+            </w:r>
+          </w:p>
+        </w:tc>
+      </w:tr>
+      <w:tr>
+        <w:tc>
+          <w:tcPr>
+            <w:tcW w:type="dxa" w:w="3703"/>
+            <w:tcMar>
+              <w:top w:type="dxa" w:w="90"/>
+              <w:left w:type="dxa" w:w="130"/>
+              <w:bottom w:type="dxa" w:w="90"/>
+              <w:right w:type="dxa" w:w="130"/>
+            </w:tcMar>
+          </w:tcPr>
+          <w:p>
+            <w:pPr>
+              <w:spacing w:line="264"/>
+            </w:pPr>
+            <w:r>
+              <w:rPr>
+                <w:rFonts w:ascii="Consolas" w:cs="Consolas" w:eastAsia="Consolas" w:hAnsi="Consolas"/>
+                <w:color w:val="16233A"/>
+                <w:sz w:val="16"/>
+                <w:szCs w:val="16"/>
+              </w:rPr>
+              <w:t xml:space="preserve">{{employee}}</w:t>
+            </w:r>
+            <w:r>
+              <w:rPr>
+                <w:rFonts w:ascii="Calibri" w:cs="Calibri" w:eastAsia="Calibri" w:hAnsi="Calibri"/>
+                <w:color w:val="16233A"/>
+                <w:sz w:val="19"/>
+                <w:szCs w:val="19"/>
+              </w:rPr>
+              <w:t xml:space="preserve"> </w:t>
+            </w:r>
+            <w:r>
+              <w:rPr>
+                <w:rFonts w:ascii="Consolas" w:cs="Consolas" w:eastAsia="Consolas" w:hAnsi="Consolas"/>
+                <w:color w:val="16233A"/>
+                <w:sz w:val="16"/>
+                <w:szCs w:val="16"/>
+              </w:rPr>
+              <w:t xml:space="preserve">{{employee_code}}</w:t>
+            </w:r>
+          </w:p>
+        </w:tc>
+        <w:tc>
+          <w:tcPr>
+            <w:tcW w:type="dxa" w:w="6043"/>
+            <w:tcMar>
+              <w:top w:type="dxa" w:w="90"/>
+              <w:left w:type="dxa" w:w="130"/>
+              <w:bottom w:type="dxa" w:w="90"/>
+              <w:right w:type="dxa" w:w="130"/>
+            </w:tcMar>
+          </w:tcPr>
+          <w:p>
+            <w:pPr>
+              <w:spacing w:line="264"/>
+            </w:pPr>
+            <w:r>
+              <w:rPr>
+                <w:rFonts w:ascii="Calibri" w:cs="Calibri" w:eastAsia="Calibri" w:hAnsi="Calibri"/>
+                <w:color w:val="3F4E66"/>
+                <w:sz w:val="19"/>
+                <w:szCs w:val="19"/>
+              </w:rPr>
+              <w:t xml:space="preserve">The person, and their employee code</w:t>
+            </w:r>
+          </w:p>
+        </w:tc>
+      </w:tr>
+      <w:tr>
+        <w:tc>
+          <w:tcPr>
+            <w:tcW w:type="dxa" w:w="3703"/>
+            <w:tcMar>
+              <w:top w:type="dxa" w:w="90"/>
+              <w:left w:type="dxa" w:w="130"/>
+              <w:bottom w:type="dxa" w:w="90"/>
+              <w:right w:type="dxa" w:w="130"/>
+            </w:tcMar>
+          </w:tcPr>
+          <w:p>
+            <w:pPr>
+              <w:spacing w:line="264"/>
+            </w:pPr>
+            <w:r>
+              <w:rPr>
+                <w:rFonts w:ascii="Consolas" w:cs="Consolas" w:eastAsia="Consolas" w:hAnsi="Consolas"/>
+                <w:color w:val="16233A"/>
+                <w:sz w:val="16"/>
+                <w:szCs w:val="16"/>
+              </w:rPr>
+              <w:t xml:space="preserve">{{role}}</w:t>
+            </w:r>
+            <w:r>
+              <w:rPr>
+                <w:rFonts w:ascii="Calibri" w:cs="Calibri" w:eastAsia="Calibri" w:hAnsi="Calibri"/>
+                <w:color w:val="16233A"/>
+                <w:sz w:val="19"/>
+                <w:szCs w:val="19"/>
+              </w:rPr>
+              <w:t xml:space="preserve"> </w:t>
+            </w:r>
+            <w:r>
+              <w:rPr>
+                <w:rFonts w:ascii="Consolas" w:cs="Consolas" w:eastAsia="Consolas" w:hAnsi="Consolas"/>
+                <w:color w:val="16233A"/>
+                <w:sz w:val="16"/>
+                <w:szCs w:val="16"/>
+              </w:rPr>
+              <w:t xml:space="preserve">{{percentage}}</w:t>
+            </w:r>
+          </w:p>
+        </w:tc>
+        <w:tc>
+          <w:tcPr>
+            <w:tcW w:type="dxa" w:w="6043"/>
+            <w:tcMar>
+              <w:top w:type="dxa" w:w="90"/>
+              <w:left w:type="dxa" w:w="130"/>
+              <w:bottom w:type="dxa" w:w="90"/>
+              <w:right w:type="dxa" w:w="130"/>
+            </w:tcMar>
+          </w:tcPr>
+          <w:p>
+            <w:pPr>
+              <w:spacing w:line="264"/>
+            </w:pPr>
+            <w:r>
+              <w:rPr>
+                <w:rFonts w:ascii="Calibri" w:cs="Calibri" w:eastAsia="Calibri" w:hAnsi="Calibri"/>
+                <w:color w:val="3F4E66"/>
+                <w:sz w:val="19"/>
+                <w:szCs w:val="19"/>
+              </w:rPr>
+              <w:t xml:space="preserve">Their role and allocation, already carrying the % sign</w:t>
+            </w:r>
+          </w:p>
+        </w:tc>
+      </w:tr>
+      <w:tr>
+        <w:tc>
+          <w:tcPr>
+            <w:tcW w:type="dxa" w:w="3703"/>
+            <w:tcMar>
+              <w:top w:type="dxa" w:w="90"/>
+              <w:left w:type="dxa" w:w="130"/>
+              <w:bottom w:type="dxa" w:w="90"/>
+              <w:right w:type="dxa" w:w="130"/>
+            </w:tcMar>
+          </w:tcPr>
+          <w:p>
+            <w:pPr>
+              <w:spacing w:line="264"/>
+            </w:pPr>
+            <w:r>
+              <w:rPr>
+                <w:rFonts w:ascii="Consolas" w:cs="Consolas" w:eastAsia="Consolas" w:hAnsi="Consolas"/>
+                <w:color w:val="16233A"/>
+                <w:sz w:val="16"/>
+                <w:szCs w:val="16"/>
+              </w:rPr>
+              <w:t xml:space="preserve">{{start_date}}</w:t>
+            </w:r>
+            <w:r>
+              <w:rPr>
+                <w:rFonts w:ascii="Calibri" w:cs="Calibri" w:eastAsia="Calibri" w:hAnsi="Calibri"/>
+                <w:color w:val="16233A"/>
+                <w:sz w:val="19"/>
+                <w:szCs w:val="19"/>
+              </w:rPr>
+              <w:t xml:space="preserve"> </w:t>
+            </w:r>
+            <w:r>
+              <w:rPr>
+                <w:rFonts w:ascii="Consolas" w:cs="Consolas" w:eastAsia="Consolas" w:hAnsi="Consolas"/>
+                <w:color w:val="16233A"/>
+                <w:sz w:val="16"/>
+                <w:szCs w:val="16"/>
+              </w:rPr>
+              <w:t xml:space="preserve">{{end_date}}</w:t>
+            </w:r>
+          </w:p>
+        </w:tc>
+        <w:tc>
+          <w:tcPr>
+            <w:tcW w:type="dxa" w:w="6043"/>
+            <w:tcMar>
+              <w:top w:type="dxa" w:w="90"/>
+              <w:left w:type="dxa" w:w="130"/>
+              <w:bottom w:type="dxa" w:w="90"/>
+              <w:right w:type="dxa" w:w="130"/>
+            </w:tcMar>
+          </w:tcPr>
+          <w:p>
+            <w:pPr>
+              <w:spacing w:line="264"/>
+            </w:pPr>
+            <w:r>
+              <w:rPr>
+                <w:rFonts w:ascii="Calibri" w:cs="Calibri" w:eastAsia="Calibri" w:hAnsi="Calibri"/>
+                <w:color w:val="3F4E66"/>
+                <w:sz w:val="19"/>
+                <w:szCs w:val="19"/>
+              </w:rPr>
+              <w:t xml:space="preserve">The assignment window; end reads </w:t>
+            </w:r>
+            <w:r>
+              <w:rPr>
+                <w:rFonts w:ascii="Calibri" w:cs="Calibri" w:eastAsia="Calibri" w:hAnsi="Calibri"/>
+                <w:i/>
+                <w:iCs/>
+                <w:color w:val="3F4E66"/>
+                <w:sz w:val="19"/>
+                <w:szCs w:val="19"/>
+              </w:rPr>
+              <w:t xml:space="preserve">Open-ended</w:t>
+            </w:r>
+            <w:r>
+              <w:rPr>
+                <w:rFonts w:ascii="Calibri" w:cs="Calibri" w:eastAsia="Calibri" w:hAnsi="Calibri"/>
+                <w:color w:val="3F4E66"/>
+                <w:sz w:val="19"/>
+                <w:szCs w:val="19"/>
+              </w:rPr>
+              <w:t xml:space="preserve"> when null</w:t>
+            </w:r>
+          </w:p>
+        </w:tc>
+      </w:tr>
+      <w:tr>
+        <w:tc>
+          <w:tcPr>
+            <w:tcW w:type="dxa" w:w="3703"/>
+            <w:tcMar>
+              <w:top w:type="dxa" w:w="90"/>
+              <w:left w:type="dxa" w:w="130"/>
+              <w:bottom w:type="dxa" w:w="90"/>
+              <w:right w:type="dxa" w:w="130"/>
+            </w:tcMar>
+          </w:tcPr>
+          <w:p>
+            <w:pPr>
+              <w:spacing w:line="264"/>
+            </w:pPr>
+            <w:r>
+              <w:rPr>
+                <w:rFonts w:ascii="Consolas" w:cs="Consolas" w:eastAsia="Consolas" w:hAnsi="Consolas"/>
+                <w:color w:val="16233A"/>
+                <w:sz w:val="16"/>
+                <w:szCs w:val="16"/>
+              </w:rPr>
+              <w:t xml:space="preserve">{{actor}}</w:t>
+            </w:r>
+          </w:p>
+        </w:tc>
+        <w:tc>
+          <w:tcPr>
+            <w:tcW w:type="dxa" w:w="6043"/>
+            <w:tcMar>
+              <w:top w:type="dxa" w:w="90"/>
+              <w:left w:type="dxa" w:w="130"/>
+              <w:bottom w:type="dxa" w:w="90"/>
+              <w:right w:type="dxa" w:w="130"/>
+            </w:tcMar>
+          </w:tcPr>
+          <w:p>
+            <w:pPr>
+              <w:spacing w:line="264"/>
+            </w:pPr>
+            <w:r>
+              <w:rPr>
+                <w:rFonts w:ascii="Calibri" w:cs="Calibri" w:eastAsia="Calibri" w:hAnsi="Calibri"/>
+                <w:color w:val="3F4E66"/>
+                <w:sz w:val="19"/>
+                <w:szCs w:val="19"/>
+              </w:rPr>
+              <w:t xml:space="preserve">Who made the change</w:t>
+            </w:r>
+          </w:p>
+        </w:tc>
+      </w:tr>
+      <w:tr>
+        <w:tc>
+          <w:tcPr>
+            <w:tcW w:type="dxa" w:w="3703"/>
+            <w:tcMar>
+              <w:top w:type="dxa" w:w="90"/>
+              <w:left w:type="dxa" w:w="130"/>
+              <w:bottom w:type="dxa" w:w="90"/>
+              <w:right w:type="dxa" w:w="130"/>
+            </w:tcMar>
+          </w:tcPr>
+          <w:p>
+            <w:pPr>
+              <w:spacing w:line="264"/>
+            </w:pPr>
+            <w:r>
+              <w:rPr>
+                <w:rFonts w:ascii="Consolas" w:cs="Consolas" w:eastAsia="Consolas" w:hAnsi="Consolas"/>
+                <w:color w:val="16233A"/>
+                <w:sz w:val="16"/>
+                <w:szCs w:val="16"/>
+              </w:rPr>
+              <w:t xml:space="preserve">{{detail}}</w:t>
+            </w:r>
+          </w:p>
+        </w:tc>
+        <w:tc>
+          <w:tcPr>
+            <w:tcW w:type="dxa" w:w="6043"/>
+            <w:tcMar>
+              <w:top w:type="dxa" w:w="90"/>
+              <w:left w:type="dxa" w:w="130"/>
+              <w:bottom w:type="dxa" w:w="90"/>
+              <w:right w:type="dxa" w:w="130"/>
+            </w:tcMar>
+          </w:tcPr>
+          <w:p>
+            <w:pPr>
+              <w:spacing w:line="264"/>
+            </w:pPr>
+            <w:r>
+              <w:rPr>
+                <w:rFonts w:ascii="Calibri" w:cs="Calibri" w:eastAsia="Calibri" w:hAnsi="Calibri"/>
+                <w:color w:val="3F4E66"/>
+                <w:sz w:val="19"/>
+                <w:szCs w:val="19"/>
+              </w:rPr>
+              <w:t xml:space="preserve">The whole labelled block above, pre-formatted</w:t>
+            </w:r>
+          </w:p>
+        </w:tc>
+      </w:tr>
+      <w:tr>
+        <w:tc>
+          <w:tcPr>
+            <w:tcW w:type="dxa" w:w="3703"/>
+            <w:tcMar>
+              <w:top w:type="dxa" w:w="90"/>
+              <w:left w:type="dxa" w:w="130"/>
+              <w:bottom w:type="dxa" w:w="90"/>
+              <w:right w:type="dxa" w:w="130"/>
+            </w:tcMar>
+          </w:tcPr>
+          <w:p>
+            <w:pPr>
+              <w:spacing w:line="264"/>
+            </w:pPr>
+            <w:r>
+              <w:rPr>
+                <w:rFonts w:ascii="Consolas" w:cs="Consolas" w:eastAsia="Consolas" w:hAnsi="Consolas"/>
+                <w:color w:val="16233A"/>
+                <w:sz w:val="16"/>
+                <w:szCs w:val="16"/>
+              </w:rPr>
+              <w:t xml:space="preserve">{{lead}}</w:t>
+            </w:r>
+            <w:r>
+              <w:rPr>
+                <w:rFonts w:ascii="Calibri" w:cs="Calibri" w:eastAsia="Calibri" w:hAnsi="Calibri"/>
+                <w:color w:val="16233A"/>
+                <w:sz w:val="19"/>
+                <w:szCs w:val="19"/>
+              </w:rPr>
+              <w:t xml:space="preserve"> </w:t>
+            </w:r>
+            <w:r>
+              <w:rPr>
+                <w:rFonts w:ascii="Consolas" w:cs="Consolas" w:eastAsia="Consolas" w:hAnsi="Consolas"/>
+                <w:color w:val="16233A"/>
+                <w:sz w:val="16"/>
+                <w:szCs w:val="16"/>
+              </w:rPr>
+              <w:t xml:space="preserve">{{previous_lead}}</w:t>
+            </w:r>
+            <w:r>
+              <w:rPr>
+                <w:rFonts w:ascii="Calibri" w:cs="Calibri" w:eastAsia="Calibri" w:hAnsi="Calibri"/>
+                <w:color w:val="16233A"/>
+                <w:sz w:val="19"/>
+                <w:szCs w:val="19"/>
+              </w:rPr>
+              <w:t xml:space="preserve"> </w:t>
+            </w:r>
+            <w:r>
+              <w:rPr>
+                <w:rFonts w:ascii="Consolas" w:cs="Consolas" w:eastAsia="Consolas" w:hAnsi="Consolas"/>
+                <w:color w:val="16233A"/>
+                <w:sz w:val="16"/>
+                <w:szCs w:val="16"/>
+              </w:rPr>
+              <w:t xml:space="preserve">{{team_size}}</w:t>
+            </w:r>
+            <w:r>
+              <w:rPr>
+                <w:rFonts w:ascii="Calibri" w:cs="Calibri" w:eastAsia="Calibri" w:hAnsi="Calibri"/>
+                <w:color w:val="16233A"/>
+                <w:sz w:val="19"/>
+                <w:szCs w:val="19"/>
+              </w:rPr>
+              <w:t xml:space="preserve"> </w:t>
+            </w:r>
+            <w:r>
+              <w:rPr>
+                <w:rFonts w:ascii="Consolas" w:cs="Consolas" w:eastAsia="Consolas" w:hAnsi="Consolas"/>
+                <w:color w:val="16233A"/>
+                <w:sz w:val="16"/>
+                <w:szCs w:val="16"/>
+              </w:rPr>
+              <w:t xml:space="preserve">{{budget}}</w:t>
+            </w:r>
+          </w:p>
+        </w:tc>
+        <w:tc>
+          <w:tcPr>
+            <w:tcW w:type="dxa" w:w="6043"/>
+            <w:tcMar>
+              <w:top w:type="dxa" w:w="90"/>
+              <w:left w:type="dxa" w:w="130"/>
+              <w:bottom w:type="dxa" w:w="90"/>
+              <w:right w:type="dxa" w:w="130"/>
+            </w:tcMar>
+          </w:tcPr>
+          <w:p>
+            <w:pPr>
+              <w:spacing w:line="264"/>
+            </w:pPr>
+            <w:r>
+              <w:rPr>
+                <w:rFonts w:ascii="Calibri" w:cs="Calibri" w:eastAsia="Calibri" w:hAnsi="Calibri"/>
+                <w:color w:val="3F4E66"/>
+                <w:sz w:val="19"/>
+                <w:szCs w:val="19"/>
+              </w:rPr>
+              <w:t xml:space="preserve">Lead templates only. </w:t>
+            </w:r>
+            <w:r>
+              <w:rPr>
+                <w:rFonts w:ascii="Consolas" w:cs="Consolas" w:eastAsia="Consolas" w:hAnsi="Consolas"/>
+                <w:color w:val="3F4E66"/>
+                <w:sz w:val="16"/>
+                <w:szCs w:val="16"/>
+              </w:rPr>
+              <w:t xml:space="preserve">{{lead}}</w:t>
+            </w:r>
+            <w:r>
+              <w:rPr>
+                <w:rFonts w:ascii="Calibri" w:cs="Calibri" w:eastAsia="Calibri" w:hAnsi="Calibri"/>
+                <w:color w:val="3F4E66"/>
+                <w:sz w:val="19"/>
+                <w:szCs w:val="19"/>
+              </w:rPr>
+              <w:t xml:space="preserve"> reads </w:t>
+            </w:r>
+            <w:r>
+              <w:rPr>
+                <w:rFonts w:ascii="Calibri" w:cs="Calibri" w:eastAsia="Calibri" w:hAnsi="Calibri"/>
+                <w:i/>
+                <w:iCs/>
+                <w:color w:val="3F4E66"/>
+                <w:sz w:val="19"/>
+                <w:szCs w:val="19"/>
+              </w:rPr>
+              <w:t xml:space="preserve">nobody</w:t>
+            </w:r>
+            <w:r>
+              <w:rPr>
+                <w:rFonts w:ascii="Calibri" w:cs="Calibri" w:eastAsia="Calibri" w:hAnsi="Calibri"/>
+                <w:color w:val="3F4E66"/>
+                <w:sz w:val="19"/>
+                <w:szCs w:val="19"/>
+              </w:rPr>
+              <w:t xml:space="preserve"> when the field was cleared</w:t>
+            </w:r>
+          </w:p>
+        </w:tc>
+      </w:tr>
+    </w:tbl>
     <w:p>
       <w:pPr>
-        <w:spacing w:after="140" w:line="288"/>
-      </w:pPr>
-      <w:r>
-        <w:rPr>
-          <w:rFonts w:ascii="Cambria" w:cs="Cambria" w:eastAsia="Cambria" w:hAnsi="Cambria"/>
-          <w:color w:val="16233A"/>
-          <w:sz w:val="21"/>
-          <w:szCs w:val="21"/>
-        </w:rPr>
-        <w:t xml:space="preserve">The screen then applies, for every date being written:</w:t>
-      </w:r>
-    </w:p>
-    <w:p>
-      <w:pPr>
-        <w:spacing w:after="60" w:line="276"/>
-        <w:ind w:left="360" w:hanging="300"/>
-      </w:pPr>
-      <w:r>
-        <w:rPr>
-          <w:rFonts w:ascii="Calibri" w:cs="Calibri" w:eastAsia="Calibri" w:hAnsi="Calibri"/>
-          <w:b/>
-          <w:bCs/>
-          <w:color w:val="1F5F94"/>
-          <w:sz w:val="19"/>
-          <w:szCs w:val="19"/>
-        </w:rPr>
-        <w:t xml:space="preserve">1.  </w:t>
-      </w:r>
-      <w:r>
-        <w:rPr>
-          <w:rFonts w:ascii="Calibri" w:cs="Calibri" w:eastAsia="Calibri" w:hAnsi="Calibri"/>
-          <w:color w:val="3F4E66"/>
-          <w:sz w:val="20"/>
-          <w:szCs w:val="20"/>
-        </w:rPr>
-        <w:t xml:space="preserve">An entry already exists on this date for this project</w:t>
-      </w:r>
-      <w:r>
-        <w:rPr>
-          <w:rFonts w:ascii="Calibri" w:cs="Calibri" w:eastAsia="Calibri" w:hAnsi="Calibri"/>
-          <w:b/>
-          <w:bCs/>
-          <w:color w:val="6C7A91"/>
-          <w:sz w:val="16"/>
-          <w:szCs w:val="16"/>
-        </w:rPr>
-        <w:t xml:space="preserve">   → OFFER IT</w:t>
-      </w:r>
-    </w:p>
-    <w:p>
-      <w:pPr>
-        <w:spacing w:after="60" w:line="276"/>
-        <w:ind w:left="360" w:hanging="300"/>
-      </w:pPr>
-      <w:r>
-        <w:rPr>
-          <w:rFonts w:ascii="Calibri" w:cs="Calibri" w:eastAsia="Calibri" w:hAnsi="Calibri"/>
-          <w:b/>
-          <w:bCs/>
-          <w:color w:val="1F5F94"/>
-          <w:sz w:val="19"/>
-          <w:szCs w:val="19"/>
-        </w:rPr>
-        <w:t xml:space="preserve">2.  </w:t>
-      </w:r>
-      <w:r>
-        <w:rPr>
-          <w:rFonts w:ascii="Calibri" w:cs="Calibri" w:eastAsia="Calibri" w:hAnsi="Calibri"/>
-          <w:color w:val="3F4E66"/>
-          <w:sz w:val="20"/>
-          <w:szCs w:val="20"/>
-        </w:rPr>
-        <w:t xml:space="preserve">Otherwise: the date is inside the project’s own window</w:t>
-      </w:r>
-      <w:r>
-        <w:rPr>
-          <w:rFonts w:ascii="Calibri" w:cs="Calibri" w:eastAsia="Calibri" w:hAnsi="Calibri"/>
-          <w:b/>
-          <w:bCs/>
-          <w:color w:val="6C7A91"/>
-          <w:sz w:val="16"/>
-          <w:szCs w:val="16"/>
-        </w:rPr>
-        <w:t xml:space="preserve">   → REQUIRED</w:t>
-      </w:r>
-    </w:p>
-    <w:p>
-      <w:pPr>
-        <w:spacing w:after="60" w:line="276"/>
-        <w:ind w:left="360" w:hanging="300"/>
-      </w:pPr>
-      <w:r>
-        <w:rPr>
-          <w:rFonts w:ascii="Calibri" w:cs="Calibri" w:eastAsia="Calibri" w:hAnsi="Calibri"/>
-          <w:b/>
-          <w:bCs/>
-          <w:color w:val="1F5F94"/>
-          <w:sz w:val="19"/>
-          <w:szCs w:val="19"/>
-        </w:rPr>
-        <w:t xml:space="preserve">3.  </w:t>
-      </w:r>
-      <w:r>
-        <w:rPr>
-          <w:rFonts w:ascii="Calibri" w:cs="Calibri" w:eastAsia="Calibri" w:hAnsi="Calibri"/>
-          <w:color w:val="3F4E66"/>
-          <w:sz w:val="20"/>
-          <w:szCs w:val="20"/>
-        </w:rPr>
-        <w:t xml:space="preserve">…and inside at least one of that person’s stints</w:t>
-      </w:r>
-      <w:r>
-        <w:rPr>
-          <w:rFonts w:ascii="Calibri" w:cs="Calibri" w:eastAsia="Calibri" w:hAnsi="Calibri"/>
-          <w:b/>
-          <w:bCs/>
-          <w:color w:val="6C7A91"/>
-          <w:sz w:val="16"/>
-          <w:szCs w:val="16"/>
-        </w:rPr>
-        <w:t xml:space="preserve">   → REQUIRED</w:t>
-      </w:r>
-    </w:p>
-    <w:p>
-      <w:pPr>
-        <w:spacing w:after="120"/>
+        <w:spacing w:after="160"/>
       </w:pPr>
     </w:p>
     <w:p>
@@ -7882,23 +8708,30 @@
       </w:pPr>
       <w:r>
         <w:rPr>
+          <w:rFonts w:ascii="Consolas" w:cs="Consolas" w:eastAsia="Consolas" w:hAnsi="Consolas"/>
+          <w:color w:val="3F4E66"/>
+          <w:sz w:val="18"/>
+          <w:szCs w:val="18"/>
+        </w:rPr>
+        <w:t xml:space="preserve">{{detail}}</w:t>
+      </w:r>
+      <w:r>
+        <w:rPr>
           <w:rFonts w:ascii="Cambria" w:cs="Cambria" w:eastAsia="Cambria" w:hAnsi="Cambria"/>
           <w:color w:val="16233A"/>
           <w:sz w:val="21"/>
           <w:szCs w:val="21"/>
         </w:rPr>
-        <w:t xml:space="preserve">The day panel passes one date. The Create modal passes every selected date, so its list is the </w:t>
-      </w:r>
-      <w:r>
-        <w:rPr>
-          <w:rFonts w:ascii="Cambria" w:cs="Cambria" w:eastAsia="Cambria" w:hAnsi="Cambria"/>
-          <w:i/>
-          <w:iCs/>
-          <w:color w:val="16233A"/>
-          <w:sz w:val="21"/>
-          <w:szCs w:val="21"/>
-        </w:rPr>
-        <w:t xml:space="preserve">intersection</w:t>
+        <w:t xml:space="preserve"> arrives pre-formatted because a template can only substitute — it has no formatting, no conditionals and no defaults. An administrator can move that block or drop it, but cannot reformat what is inside it. Migration 749 made the same call for the same reason: </w:t>
+      </w:r>
+      <w:r>
+        <w:rPr>
+          <w:rFonts w:ascii="Consolas" w:cs="Consolas" w:eastAsia="Consolas" w:hAnsi="Consolas"/>
+          <w:color w:val="3F4E66"/>
+          <w:sz w:val="18"/>
+          <w:szCs w:val="18"/>
+        </w:rPr>
+        <w:t xml:space="preserve">{{recorded_minutes}}</w:t>
       </w:r>
       <w:r>
         <w:rPr>
@@ -7907,41 +8740,7 @@
           <w:sz w:val="21"/>
           <w:szCs w:val="21"/>
         </w:rPr>
-        <w:t xml:space="preserve">. Copy Day runs the same test against every entry on the clipboard, and the calendar colours a day pasteable using that same test — a day that cannot take the paste should look like it cannot.</w:t>
-      </w:r>
-    </w:p>
-    <w:p>
-      <w:pPr>
-        <w:spacing w:after="140" w:line="288"/>
-      </w:pPr>
-      <w:r>
-        <w:rPr>
-          <w:rFonts w:ascii="Cambria" w:cs="Cambria" w:eastAsia="Cambria" w:hAnsi="Cambria"/>
-          <w:color w:val="16233A"/>
-          <w:sz w:val="21"/>
-          <w:szCs w:val="21"/>
-        </w:rPr>
-        <w:t xml:space="preserve">Withheld projects are named rather than silently dropped: </w:t>
-      </w:r>
-      <w:r>
-        <w:rPr>
-          <w:rFonts w:ascii="Cambria" w:cs="Cambria" w:eastAsia="Cambria" w:hAnsi="Cambria"/>
-          <w:i/>
-          <w:iCs/>
-          <w:color w:val="16233A"/>
-          <w:sz w:val="21"/>
-          <w:szCs w:val="21"/>
-        </w:rPr>
-        <w:t xml:space="preserve">"Not available for 21 Aug: AMPTJ, QCC — outside the project’s dates or your allocation to it."</w:t>
-      </w:r>
-      <w:r>
-        <w:rPr>
-          <w:rFonts w:ascii="Cambria" w:cs="Cambria" w:eastAsia="Cambria" w:hAnsi="Cambria"/>
-          <w:color w:val="16233A"/>
-          <w:sz w:val="21"/>
-          <w:szCs w:val="21"/>
-        </w:rPr>
-        <w:t xml:space="preserve"> A project vanishing with no reason given is indistinguishable from a bug.</w:t>
+        <w:t xml:space="preserve"> renders 4560 where a reader expects 76 h, and a notification must not promise a number it can only print wrong.</w:t>
       </w:r>
     </w:p>
     <w:p>
@@ -7958,7 +8757,7 @@
           <w:sz w:val="23"/>
           <w:szCs w:val="23"/>
         </w:rPr>
-        <w:t xml:space="preserve">Two deliberate exemptions</w:t>
+        <w:t xml:space="preserve">Two rules that make editing safe</w:t>
       </w:r>
     </w:p>
     <w:tbl>
@@ -8000,18 +8799,18 @@
                 <w:sz w:val="21"/>
                 <w:szCs w:val="21"/>
               </w:rPr>
-              <w:t xml:space="preserve">A day you have already booked keeps its project  </w:t>
+              <w:t xml:space="preserve">A missing template falls back — it never goes silent  </w:t>
             </w:r>
             <w:r>
               <w:rPr>
                 <w:rFonts w:ascii="Calibri" w:cs="Calibri" w:eastAsia="Calibri" w:hAnsi="Calibri"/>
                 <w:b/>
                 <w:bCs/>
-                <w:color w:val="8A5307"/>
+                <w:color w:val="1F5F94"/>
                 <w:sz w:val="15"/>
                 <w:szCs w:val="15"/>
               </w:rPr>
-              <w:t xml:space="preserve">[SCREEN]</w:t>
+              <w:t xml:space="preserve">[RPC]</w:t>
             </w:r>
           </w:p>
           <w:p>
@@ -8025,7 +8824,21 @@
                 <w:sz w:val="20"/>
                 <w:szCs w:val="20"/>
               </w:rPr>
-              <w:t xml:space="preserve">Per </w:t>
+              <w:t xml:space="preserve">The wording built into the functions is still there, and is used whenever the template is absent or renders an empty title. Deleting a template changes the words; it can never switch a notification off.</w:t>
+            </w:r>
+          </w:p>
+          <w:p>
+            <w:pPr>
+              <w:spacing w:after="60" w:line="276"/>
+            </w:pPr>
+            <w:r>
+              <w:rPr>
+                <w:rFonts w:ascii="Cambria" w:cs="Cambria" w:eastAsia="Cambria" w:hAnsi="Cambria"/>
+                <w:color w:val="3F4E66"/>
+                <w:sz w:val="20"/>
+                <w:szCs w:val="20"/>
+              </w:rPr>
+              <w:t xml:space="preserve">This is deliberately </w:t>
             </w:r>
             <w:r>
               <w:rPr>
@@ -8036,7 +8849,7 @@
                 <w:sz w:val="20"/>
                 <w:szCs w:val="20"/>
               </w:rPr>
-              <w:t xml:space="preserve">date</w:t>
+              <w:t xml:space="preserve">unlike</w:t>
             </w:r>
             <w:r>
               <w:rPr>
@@ -8045,7 +8858,7 @@
                 <w:sz w:val="20"/>
                 <w:szCs w:val="20"/>
               </w:rPr>
-              <w:t xml:space="preserve">, not per project — it does not reopen the rest of the month. Without it, an entry that exists could not name its own project, and rows stranded before the guards existed would be uneditable from the only screen that has them.</w:t>
+              <w:t xml:space="preserve"> the workflow renderer, which skips with a log notice when a code is not found — so deleting a template there quietly disables a notification.</w:t>
             </w:r>
           </w:p>
         </w:tc>
@@ -8095,6 +8908,1174 @@
                 <w:sz w:val="21"/>
                 <w:szCs w:val="21"/>
               </w:rPr>
+              <w:t xml:space="preserve">An unresolved token is stripped, not shipped  </w:t>
+            </w:r>
+            <w:r>
+              <w:rPr>
+                <w:rFonts w:ascii="Calibri" w:cs="Calibri" w:eastAsia="Calibri" w:hAnsi="Calibri"/>
+                <w:b/>
+                <w:bCs/>
+                <w:color w:val="1F5F94"/>
+                <w:sz w:val="15"/>
+                <w:szCs w:val="15"/>
+              </w:rPr>
+              <w:t xml:space="preserve">[RPC]</w:t>
+            </w:r>
+          </w:p>
+          <w:p>
+            <w:pPr>
+              <w:spacing w:after="60" w:line="276"/>
+            </w:pPr>
+            <w:r>
+              <w:rPr>
+                <w:rFonts w:ascii="Cambria" w:cs="Cambria" w:eastAsia="Cambria" w:hAnsi="Cambria"/>
+                <w:color w:val="3F4E66"/>
+                <w:sz w:val="20"/>
+                <w:szCs w:val="20"/>
+              </w:rPr>
+              <w:t xml:space="preserve">An administrator who types </w:t>
+            </w:r>
+            <w:r>
+              <w:rPr>
+                <w:rFonts w:ascii="Consolas" w:cs="Consolas" w:eastAsia="Consolas" w:hAnsi="Consolas"/>
+                <w:color w:val="3F4E66"/>
+                <w:sz w:val="17"/>
+                <w:szCs w:val="17"/>
+              </w:rPr>
+              <w:t xml:space="preserve">{{approver_name}}</w:t>
+            </w:r>
+            <w:r>
+              <w:rPr>
+                <w:rFonts w:ascii="Cambria" w:cs="Cambria" w:eastAsia="Cambria" w:hAnsi="Cambria"/>
+                <w:color w:val="3F4E66"/>
+                <w:sz w:val="20"/>
+                <w:szCs w:val="20"/>
+              </w:rPr>
+              <w:t xml:space="preserve"> — a real token, but one from the workflow vocabulary that project events never carry — gets nothing rather than literal braces in somebody’s inbox. The editor also hides the workflow-wide tokens on project templates, so they are never offered in the first place.</w:t>
+            </w:r>
+          </w:p>
+        </w:tc>
+      </w:tr>
+    </w:tbl>
+    <w:p>
+      <w:pPr>
+        <w:spacing w:after="160"/>
+      </w:pPr>
+    </w:p>
+    <w:p>
+      <w:pPr>
+        <w:pStyle w:val="Heading2"/>
+        <w:spacing w:after="100" w:before="280"/>
+      </w:pPr>
+      <w:r>
+        <w:rPr>
+          <w:rFonts w:ascii="Calibri" w:cs="Calibri" w:eastAsia="Calibri" w:hAnsi="Calibri"/>
+          <w:b/>
+          <w:bCs/>
+          <w:color w:val="16233A"/>
+          <w:sz w:val="23"/>
+          <w:szCs w:val="23"/>
+        </w:rPr>
+        <w:t xml:space="preserve">Where this lives, and why not the workflow queue</w:t>
+      </w:r>
+    </w:p>
+    <w:p>
+      <w:pPr>
+        <w:spacing w:after="140" w:line="288"/>
+      </w:pPr>
+      <w:r>
+        <w:rPr>
+          <w:rFonts w:ascii="Cambria" w:cs="Cambria" w:eastAsia="Cambria" w:hAnsi="Cambria"/>
+          <w:color w:val="16233A"/>
+          <w:sz w:val="21"/>
+          <w:szCs w:val="21"/>
+        </w:rPr>
+        <w:t xml:space="preserve">The wording comes from </w:t>
+      </w:r>
+      <w:r>
+        <w:rPr>
+          <w:rFonts w:ascii="Consolas" w:cs="Consolas" w:eastAsia="Consolas" w:hAnsi="Consolas"/>
+          <w:color w:val="3F4E66"/>
+          <w:sz w:val="18"/>
+          <w:szCs w:val="18"/>
+        </w:rPr>
+        <w:t xml:space="preserve">workflow_notification_templates</w:t>
+      </w:r>
+      <w:r>
+        <w:rPr>
+          <w:rFonts w:ascii="Cambria" w:cs="Cambria" w:eastAsia="Cambria" w:hAnsi="Cambria"/>
+          <w:color w:val="16233A"/>
+          <w:sz w:val="21"/>
+          <w:szCs w:val="21"/>
+        </w:rPr>
+        <w:t xml:space="preserve">, the same table the workflow engine uses — and nothing else about the workflow engine is involved. That table is a wording store: </w:t>
+      </w:r>
+      <w:r>
+        <w:rPr>
+          <w:rFonts w:ascii="Consolas" w:cs="Consolas" w:eastAsia="Consolas" w:hAnsi="Consolas"/>
+          <w:color w:val="3F4E66"/>
+          <w:sz w:val="18"/>
+          <w:szCs w:val="18"/>
+        </w:rPr>
+        <w:t xml:space="preserve">code</w:t>
+      </w:r>
+      <w:r>
+        <w:rPr>
+          <w:rFonts w:ascii="Cambria" w:cs="Cambria" w:eastAsia="Cambria" w:hAnsi="Cambria"/>
+          <w:color w:val="16233A"/>
+          <w:sz w:val="21"/>
+          <w:szCs w:val="21"/>
+        </w:rPr>
+        <w:t xml:space="preserve">, </w:t>
+      </w:r>
+      <w:r>
+        <w:rPr>
+          <w:rFonts w:ascii="Consolas" w:cs="Consolas" w:eastAsia="Consolas" w:hAnsi="Consolas"/>
+          <w:color w:val="3F4E66"/>
+          <w:sz w:val="18"/>
+          <w:szCs w:val="18"/>
+        </w:rPr>
+        <w:t xml:space="preserve">title_tmpl</w:t>
+      </w:r>
+      <w:r>
+        <w:rPr>
+          <w:rFonts w:ascii="Cambria" w:cs="Cambria" w:eastAsia="Cambria" w:hAnsi="Cambria"/>
+          <w:color w:val="16233A"/>
+          <w:sz w:val="21"/>
+          <w:szCs w:val="21"/>
+        </w:rPr>
+        <w:t xml:space="preserve">, </w:t>
+      </w:r>
+      <w:r>
+        <w:rPr>
+          <w:rFonts w:ascii="Consolas" w:cs="Consolas" w:eastAsia="Consolas" w:hAnsi="Consolas"/>
+          <w:color w:val="3F4E66"/>
+          <w:sz w:val="18"/>
+          <w:szCs w:val="18"/>
+        </w:rPr>
+        <w:t xml:space="preserve">body_tmpl</w:t>
+      </w:r>
+      <w:r>
+        <w:rPr>
+          <w:rFonts w:ascii="Cambria" w:cs="Cambria" w:eastAsia="Cambria" w:hAnsi="Cambria"/>
+          <w:color w:val="16233A"/>
+          <w:sz w:val="21"/>
+          <w:szCs w:val="21"/>
+        </w:rPr>
+        <w:t xml:space="preserve">, </w:t>
+      </w:r>
+      <w:r>
+        <w:rPr>
+          <w:rFonts w:ascii="Consolas" w:cs="Consolas" w:eastAsia="Consolas" w:hAnsi="Consolas"/>
+          <w:color w:val="3F4E66"/>
+          <w:sz w:val="18"/>
+          <w:szCs w:val="18"/>
+        </w:rPr>
+        <w:t xml:space="preserve">category</w:t>
+      </w:r>
+      <w:r>
+        <w:rPr>
+          <w:rFonts w:ascii="Cambria" w:cs="Cambria" w:eastAsia="Cambria" w:hAnsi="Cambria"/>
+          <w:color w:val="16233A"/>
+          <w:sz w:val="21"/>
+          <w:szCs w:val="21"/>
+        </w:rPr>
+        <w:t xml:space="preserve">, and no workflow columns at all.</w:t>
+      </w:r>
+    </w:p>
+    <w:p>
+      <w:pPr>
+        <w:spacing w:after="140" w:line="288"/>
+      </w:pPr>
+      <w:r>
+        <w:rPr>
+          <w:rFonts w:ascii="Cambria" w:cs="Cambria" w:eastAsia="Cambria" w:hAnsi="Cambria"/>
+          <w:color w:val="16233A"/>
+          <w:sz w:val="21"/>
+          <w:szCs w:val="21"/>
+        </w:rPr>
+        <w:t xml:space="preserve">Project events do </w:t>
+      </w:r>
+      <w:r>
+        <w:rPr>
+          <w:rFonts w:ascii="Cambria" w:cs="Cambria" w:eastAsia="Cambria" w:hAnsi="Cambria"/>
+          <w:b/>
+          <w:bCs/>
+          <w:color w:val="16233A"/>
+          <w:sz w:val="21"/>
+          <w:szCs w:val="21"/>
+        </w:rPr>
+        <w:t xml:space="preserve">not</w:t>
+      </w:r>
+      <w:r>
+        <w:rPr>
+          <w:rFonts w:ascii="Cambria" w:cs="Cambria" w:eastAsia="Cambria" w:hAnsi="Cambria"/>
+          <w:color w:val="16233A"/>
+          <w:sz w:val="21"/>
+          <w:szCs w:val="21"/>
+        </w:rPr>
+        <w:t xml:space="preserve"> go through </w:t>
+      </w:r>
+      <w:r>
+        <w:rPr>
+          <w:rFonts w:ascii="Consolas" w:cs="Consolas" w:eastAsia="Consolas" w:hAnsi="Consolas"/>
+          <w:color w:val="3F4E66"/>
+          <w:sz w:val="18"/>
+          <w:szCs w:val="18"/>
+        </w:rPr>
+        <w:t xml:space="preserve">workflow_notification_queue</w:t>
+      </w:r>
+      <w:r>
+        <w:rPr>
+          <w:rFonts w:ascii="Cambria" w:cs="Cambria" w:eastAsia="Cambria" w:hAnsi="Cambria"/>
+          <w:color w:val="16233A"/>
+          <w:sz w:val="21"/>
+          <w:szCs w:val="21"/>
+        </w:rPr>
+        <w:t xml:space="preserve">, because it carries </w:t>
+      </w:r>
+      <w:r>
+        <w:rPr>
+          <w:rFonts w:ascii="Consolas" w:cs="Consolas" w:eastAsia="Consolas" w:hAnsi="Consolas"/>
+          <w:color w:val="3F4E66"/>
+          <w:sz w:val="18"/>
+          <w:szCs w:val="18"/>
+        </w:rPr>
+        <w:t xml:space="preserve">instance_id uuid NOT NULL REFERENCES workflow_instances(id)</w:t>
+      </w:r>
+      <w:r>
+        <w:rPr>
+          <w:rFonts w:ascii="Cambria" w:cs="Cambria" w:eastAsia="Cambria" w:hAnsi="Cambria"/>
+          <w:color w:val="16233A"/>
+          <w:sz w:val="21"/>
+          <w:szCs w:val="21"/>
+        </w:rPr>
+        <w:t xml:space="preserve"> and a project assignment has no workflow instance. Giving it a fake one would surface staffing in My Requests, the approver inbox and the stalled-workflow report; dropping the </w:t>
+      </w:r>
+      <w:r>
+        <w:rPr>
+          <w:rFonts w:ascii="Consolas" w:cs="Consolas" w:eastAsia="Consolas" w:hAnsi="Consolas"/>
+          <w:color w:val="3F4E66"/>
+          <w:sz w:val="18"/>
+          <w:szCs w:val="18"/>
+        </w:rPr>
+        <w:t xml:space="preserve">NOT NULL</w:t>
+      </w:r>
+      <w:r>
+        <w:rPr>
+          <w:rFonts w:ascii="Cambria" w:cs="Cambria" w:eastAsia="Cambria" w:hAnsi="Cambria"/>
+          <w:color w:val="16233A"/>
+          <w:sz w:val="21"/>
+          <w:szCs w:val="21"/>
+        </w:rPr>
+        <w:t xml:space="preserve"> would remove the guarantee that every queued notification is traceable, to serve a caller that is not an approval. Migration 789 declined it for that reason, and </w:t>
+      </w:r>
+      <w:r>
+        <w:rPr>
+          <w:rFonts w:ascii="Consolas" w:cs="Consolas" w:eastAsia="Consolas" w:hAnsi="Consolas"/>
+          <w:color w:val="3F4E66"/>
+          <w:sz w:val="18"/>
+          <w:szCs w:val="18"/>
+        </w:rPr>
+        <w:t xml:space="preserve">notify_delegation_created</w:t>
+      </w:r>
+      <w:r>
+        <w:rPr>
+          <w:rFonts w:ascii="Cambria" w:cs="Cambria" w:eastAsia="Cambria" w:hAnsi="Cambria"/>
+          <w:color w:val="16233A"/>
+          <w:sz w:val="21"/>
+          <w:szCs w:val="21"/>
+        </w:rPr>
+        <w:t xml:space="preserve"> hit the same wall first.</w:t>
+      </w:r>
+    </w:p>
+    <w:p>
+      <w:pPr>
+        <w:pStyle w:val="Heading2"/>
+        <w:spacing w:after="100" w:before="280"/>
+      </w:pPr>
+      <w:r>
+        <w:rPr>
+          <w:rFonts w:ascii="Calibri" w:cs="Calibri" w:eastAsia="Calibri" w:hAnsi="Calibri"/>
+          <w:b/>
+          <w:bCs/>
+          <w:color w:val="16233A"/>
+          <w:sz w:val="23"/>
+          <w:szCs w:val="23"/>
+        </w:rPr>
+        <w:t xml:space="preserve">Ordering and failure</w:t>
+      </w:r>
+    </w:p>
+    <w:p>
+      <w:pPr>
+        <w:spacing w:after="140" w:line="288"/>
+      </w:pPr>
+      <w:r>
+        <w:rPr>
+          <w:rFonts w:ascii="Cambria" w:cs="Cambria" w:eastAsia="Cambria" w:hAnsi="Cambria"/>
+          <w:color w:val="16233A"/>
+          <w:sz w:val="21"/>
+          <w:szCs w:val="21"/>
+        </w:rPr>
+        <w:t xml:space="preserve">Three details that are easy to get wrong, all asserted by the migrations’ own verification:</w:t>
+      </w:r>
+    </w:p>
+    <w:p>
+      <w:pPr>
+        <w:pStyle w:val="ListParagraph"/>
+        <w:numPr>
+          <w:ilvl w:val="0"/>
+          <w:numId w:val="1"/>
+        </w:numPr>
+        <w:spacing w:after="70" w:line="288"/>
+      </w:pPr>
+      <w:r>
+        <w:rPr>
+          <w:rFonts w:ascii="Cambria" w:cs="Cambria" w:eastAsia="Cambria" w:hAnsi="Cambria"/>
+          <w:b/>
+          <w:bCs/>
+          <w:color w:val="16233A"/>
+          <w:sz w:val="21"/>
+          <w:szCs w:val="21"/>
+        </w:rPr>
+        <w:t xml:space="preserve">The `removed` message is composed before the row is deleted.</w:t>
+      </w:r>
+      <w:r>
+        <w:rPr>
+          <w:rFonts w:ascii="Cambria" w:cs="Cambria" w:eastAsia="Cambria" w:hAnsi="Cambria"/>
+          <w:color w:val="16233A"/>
+          <w:sz w:val="21"/>
+          <w:szCs w:val="21"/>
+        </w:rPr>
+        <w:t xml:space="preserve"> Afterwards there is nothing left to describe, and "an assignment was removed" without saying which is worse than silence.</w:t>
+      </w:r>
+    </w:p>
+    <w:p>
+      <w:pPr>
+        <w:pStyle w:val="ListParagraph"/>
+        <w:numPr>
+          <w:ilvl w:val="0"/>
+          <w:numId w:val="1"/>
+        </w:numPr>
+        <w:spacing w:after="70" w:line="288"/>
+      </w:pPr>
+      <w:r>
+        <w:rPr>
+          <w:rFonts w:ascii="Cambria" w:cs="Cambria" w:eastAsia="Cambria" w:hAnsi="Cambria"/>
+          <w:b/>
+          <w:bCs/>
+          <w:color w:val="16233A"/>
+          <w:sz w:val="21"/>
+          <w:szCs w:val="21"/>
+        </w:rPr>
+        <w:t xml:space="preserve">The `ended` message is sent after the update,</w:t>
+      </w:r>
+      <w:r>
+        <w:rPr>
+          <w:rFonts w:ascii="Cambria" w:cs="Cambria" w:eastAsia="Cambria" w:hAnsi="Cambria"/>
+          <w:color w:val="16233A"/>
+          <w:sz w:val="21"/>
+          <w:szCs w:val="21"/>
+        </w:rPr>
+        <w:t xml:space="preserve"> so the end date it quotes is the new one.</w:t>
+      </w:r>
+    </w:p>
+    <w:p>
+      <w:pPr>
+        <w:pStyle w:val="ListParagraph"/>
+        <w:numPr>
+          <w:ilvl w:val="0"/>
+          <w:numId w:val="1"/>
+        </w:numPr>
+        <w:spacing w:after="70" w:line="288"/>
+      </w:pPr>
+      <w:r>
+        <w:rPr>
+          <w:rFonts w:ascii="Cambria" w:cs="Cambria" w:eastAsia="Cambria" w:hAnsi="Cambria"/>
+          <w:b/>
+          <w:bCs/>
+          <w:color w:val="16233A"/>
+          <w:sz w:val="21"/>
+          <w:szCs w:val="21"/>
+        </w:rPr>
+        <w:t xml:space="preserve">A lead change fires only on a genuine transition.</w:t>
+      </w:r>
+      <w:r>
+        <w:rPr>
+          <w:rFonts w:ascii="Cambria" w:cs="Cambria" w:eastAsia="Cambria" w:hAnsi="Cambria"/>
+          <w:color w:val="16233A"/>
+          <w:sz w:val="21"/>
+          <w:szCs w:val="21"/>
+        </w:rPr>
+        <w:t xml:space="preserve"> An update that names </w:t>
+      </w:r>
+      <w:r>
+        <w:rPr>
+          <w:rFonts w:ascii="Consolas" w:cs="Consolas" w:eastAsia="Consolas" w:hAnsi="Consolas"/>
+          <w:color w:val="3F4E66"/>
+          <w:sz w:val="18"/>
+          <w:szCs w:val="18"/>
+        </w:rPr>
+        <w:t xml:space="preserve">manager_id</w:t>
+      </w:r>
+      <w:r>
+        <w:rPr>
+          <w:rFonts w:ascii="Cambria" w:cs="Cambria" w:eastAsia="Cambria" w:hAnsi="Cambria"/>
+          <w:color w:val="16233A"/>
+          <w:sz w:val="21"/>
+          <w:szCs w:val="21"/>
+        </w:rPr>
+        <w:t xml:space="preserve"> without changing it says nothing, which also stops a double-send when somebody clears the field and re-sets it in two saves.</w:t>
+      </w:r>
+    </w:p>
+    <w:p>
+      <w:pPr>
+        <w:spacing w:after="140" w:line="288"/>
+      </w:pPr>
+      <w:r>
+        <w:rPr>
+          <w:rFonts w:ascii="Cambria" w:cs="Cambria" w:eastAsia="Cambria" w:hAnsi="Cambria"/>
+          <w:color w:val="16233A"/>
+          <w:sz w:val="21"/>
+          <w:szCs w:val="21"/>
+        </w:rPr>
+        <w:t xml:space="preserve">Every notify call is contained. On the assignment path the RPC returns </w:t>
+      </w:r>
+      <w:r>
+        <w:rPr>
+          <w:rFonts w:ascii="Consolas" w:cs="Consolas" w:eastAsia="Consolas" w:hAnsi="Consolas"/>
+          <w:color w:val="3F4E66"/>
+          <w:sz w:val="18"/>
+          <w:szCs w:val="18"/>
+        </w:rPr>
+        <w:t xml:space="preserve">notified</w:t>
+      </w:r>
+      <w:r>
+        <w:rPr>
+          <w:rFonts w:ascii="Cambria" w:cs="Cambria" w:eastAsia="Cambria" w:hAnsi="Cambria"/>
+          <w:color w:val="16233A"/>
+          <w:sz w:val="21"/>
+          <w:szCs w:val="21"/>
+        </w:rPr>
+        <w:t xml:space="preserve"> and, if something threw, </w:t>
+      </w:r>
+      <w:r>
+        <w:rPr>
+          <w:rFonts w:ascii="Consolas" w:cs="Consolas" w:eastAsia="Consolas" w:hAnsi="Consolas"/>
+          <w:color w:val="3F4E66"/>
+          <w:sz w:val="18"/>
+          <w:szCs w:val="18"/>
+        </w:rPr>
+        <w:t xml:space="preserve">notify_error</w:t>
+      </w:r>
+      <w:r>
+        <w:rPr>
+          <w:rFonts w:ascii="Cambria" w:cs="Cambria" w:eastAsia="Cambria" w:hAnsi="Cambria"/>
+          <w:color w:val="16233A"/>
+          <w:sz w:val="21"/>
+          <w:szCs w:val="21"/>
+        </w:rPr>
+        <w:t xml:space="preserve"> — and the Add screen reports it: </w:t>
+      </w:r>
+      <w:r>
+        <w:rPr>
+          <w:rFonts w:ascii="Cambria" w:cs="Cambria" w:eastAsia="Cambria" w:hAnsi="Cambria"/>
+          <w:i/>
+          <w:iCs/>
+          <w:color w:val="16233A"/>
+          <w:sz w:val="21"/>
+          <w:szCs w:val="21"/>
+        </w:rPr>
+        <w:t xml:space="preserve">"Meera added — but they could not be notified. Tell them directly."</w:t>
+      </w:r>
+      <w:r>
+        <w:rPr>
+          <w:rFonts w:ascii="Cambria" w:cs="Cambria" w:eastAsia="Cambria" w:hAnsi="Cambria"/>
+          <w:color w:val="16233A"/>
+          <w:sz w:val="21"/>
+          <w:szCs w:val="21"/>
+        </w:rPr>
+        <w:t xml:space="preserve"> On the lead path it matters more, because a trigger runs </w:t>
+      </w:r>
+      <w:r>
+        <w:rPr>
+          <w:rFonts w:ascii="Cambria" w:cs="Cambria" w:eastAsia="Cambria" w:hAnsi="Cambria"/>
+          <w:i/>
+          <w:iCs/>
+          <w:color w:val="16233A"/>
+          <w:sz w:val="21"/>
+          <w:szCs w:val="21"/>
+        </w:rPr>
+        <w:t xml:space="preserve">inside your transaction</w:t>
+      </w:r>
+      <w:r>
+        <w:rPr>
+          <w:rFonts w:ascii="Cambria" w:cs="Cambria" w:eastAsia="Cambria" w:hAnsi="Cambria"/>
+          <w:color w:val="16233A"/>
+          <w:sz w:val="21"/>
+          <w:szCs w:val="21"/>
+        </w:rPr>
+        <w:t xml:space="preserve">: without the wrapper, a failed notification would roll back somebody’s project edit. It logs a warning and the save stands.</w:t>
+      </w:r>
+    </w:p>
+    <w:p>
+      <w:pPr>
+        <w:spacing w:after="160"/>
+      </w:pPr>
+    </w:p>
+    <w:p>
+      <w:pPr>
+        <w:pStyle w:val="Heading1"/>
+        <w:pBdr>
+          <w:top w:val="single" w:color="D7DFE9" w:sz="6" w:space="12"/>
+        </w:pBdr>
+        <w:spacing w:after="140" w:before="400"/>
+      </w:pPr>
+      <w:r>
+        <w:rPr>
+          <w:rFonts w:ascii="Calibri" w:cs="Calibri" w:eastAsia="Calibri" w:hAnsi="Calibri"/>
+          <w:b/>
+          <w:bCs/>
+          <w:color w:val="1F5F94"/>
+          <w:sz w:val="22"/>
+          <w:szCs w:val="22"/>
+        </w:rPr>
+        <w:t xml:space="preserve">6   </w:t>
+      </w:r>
+      <w:r>
+        <w:rPr>
+          <w:rFonts w:ascii="Calibri" w:cs="Calibri" w:eastAsia="Calibri" w:hAnsi="Calibri"/>
+          <w:b/>
+          <w:bCs/>
+          <w:color w:val="16233A"/>
+          <w:sz w:val="30"/>
+          <w:szCs w:val="30"/>
+        </w:rPr>
+        <w:t xml:space="preserve">Which projects a person can book time to</w:t>
+      </w:r>
+    </w:p>
+    <w:p>
+      <w:pPr>
+        <w:spacing w:after="140" w:line="288"/>
+      </w:pPr>
+      <w:r>
+        <w:rPr>
+          <w:rFonts w:ascii="Cambria" w:cs="Cambria" w:eastAsia="Cambria" w:hAnsi="Cambria"/>
+          <w:color w:val="3F4E66"/>
+          <w:sz w:val="23"/>
+          <w:szCs w:val="23"/>
+        </w:rPr>
+        <w:t xml:space="preserve">Two timelines govern the timesheet dropdown, and both must cover </w:t>
+      </w:r>
+      <w:r>
+        <w:rPr>
+          <w:rFonts w:ascii="Cambria" w:cs="Cambria" w:eastAsia="Cambria" w:hAnsi="Cambria"/>
+          <w:i/>
+          <w:iCs/>
+          <w:color w:val="3F4E66"/>
+          <w:sz w:val="23"/>
+          <w:szCs w:val="23"/>
+        </w:rPr>
+        <w:t xml:space="preserve">every</w:t>
+      </w:r>
+      <w:r>
+        <w:rPr>
+          <w:rFonts w:ascii="Cambria" w:cs="Cambria" w:eastAsia="Cambria" w:hAnsi="Cambria"/>
+          <w:color w:val="3F4E66"/>
+          <w:sz w:val="23"/>
+          <w:szCs w:val="23"/>
+        </w:rPr>
+        <w:t xml:space="preserve"> day being written: the project’s own window, and that person’s allocation window.</w:t>
+      </w:r>
+    </w:p>
+    <w:p>
+      <w:pPr>
+        <w:pBdr>
+          <w:left w:val="single" w:color="1F5F94" w:sz="18" w:space="8"/>
+        </w:pBdr>
+        <w:shd w:fill="EEF2F7" w:val="clear"/>
+        <w:spacing w:after="160" w:before="120" w:line="260"/>
+        <w:ind w:left="120" w:right="120"/>
+      </w:pPr>
+      <w:r>
+        <w:rPr>
+          <w:rFonts w:ascii="Consolas" w:cs="Consolas" w:eastAsia="Consolas" w:hAnsi="Consolas"/>
+          <w:color w:val="3F4E66"/>
+          <w:sz w:val="17"/>
+          <w:szCs w:val="17"/>
+        </w:rPr>
+        <w:t xml:space="preserve">AUGUST      1 ─────── 7 ─────── 14 ─────── 21 ─────── 28 ─── 31</w:t>
+      </w:r>
+      <w:r>
+        <w:br/>
+      </w:r>
+      <w:r>
+        <w:rPr>
+          <w:rFonts w:ascii="Consolas" w:cs="Consolas" w:eastAsia="Consolas" w:hAnsi="Consolas"/>
+          <w:color w:val="3F4E66"/>
+          <w:sz w:val="17"/>
+          <w:szCs w:val="17"/>
+        </w:rPr>
+        <w:t xml:space="preserve"/>
+      </w:r>
+      <w:r>
+        <w:br/>
+      </w:r>
+      <w:r>
+        <w:rPr>
+          <w:rFonts w:ascii="Consolas" w:cs="Consolas" w:eastAsia="Consolas" w:hAnsi="Consolas"/>
+          <w:color w:val="3F4E66"/>
+          <w:sz w:val="17"/>
+          <w:szCs w:val="17"/>
+        </w:rPr>
+        <w:t xml:space="preserve">Project     ███████████████████████████████████████████       ends 28 Aug</w:t>
+      </w:r>
+      <w:r>
+        <w:br/>
+      </w:r>
+      <w:r>
+        <w:rPr>
+          <w:rFonts w:ascii="Consolas" w:cs="Consolas" w:eastAsia="Consolas" w:hAnsi="Consolas"/>
+          <w:color w:val="3F4E66"/>
+          <w:sz w:val="17"/>
+          <w:szCs w:val="17"/>
+        </w:rPr>
+        <w:t xml:space="preserve">Allocation  ███████████████████            █████████████       two stints</w:t>
+      </w:r>
+      <w:r>
+        <w:br/>
+      </w:r>
+      <w:r>
+        <w:rPr>
+          <w:rFonts w:ascii="Consolas" w:cs="Consolas" w:eastAsia="Consolas" w:hAnsi="Consolas"/>
+          <w:color w:val="3F4E66"/>
+          <w:sz w:val="17"/>
+          <w:szCs w:val="17"/>
+        </w:rPr>
+        <w:t xml:space="preserve"/>
+      </w:r>
+      <w:r>
+        <w:br/>
+      </w:r>
+      <w:r>
+        <w:rPr>
+          <w:rFonts w:ascii="Consolas" w:cs="Consolas" w:eastAsia="Consolas" w:hAnsi="Consolas"/>
+          <w:color w:val="3F4E66"/>
+          <w:sz w:val="17"/>
+          <w:szCs w:val="17"/>
+        </w:rPr>
+        <w:t xml:space="preserve">Offered     ███████████████████    (not a  █████████████  (project</w:t>
+      </w:r>
+      <w:r>
+        <w:br/>
+      </w:r>
+      <w:r>
+        <w:rPr>
+          <w:rFonts w:ascii="Consolas" w:cs="Consolas" w:eastAsia="Consolas" w:hAnsi="Consolas"/>
+          <w:color w:val="3F4E66"/>
+          <w:sz w:val="17"/>
+          <w:szCs w:val="17"/>
+        </w:rPr>
+        <w:t xml:space="preserve">                                   member)                 has ended)</w:t>
+      </w:r>
+      <w:r>
+        <w:br/>
+      </w:r>
+      <w:r>
+        <w:rPr>
+          <w:rFonts w:ascii="Consolas" w:cs="Consolas" w:eastAsia="Consolas" w:hAnsi="Consolas"/>
+          <w:color w:val="3F4E66"/>
+          <w:sz w:val="17"/>
+          <w:szCs w:val="17"/>
+        </w:rPr>
+        <w:t xml:space="preserve"/>
+      </w:r>
+      <w:r>
+        <w:br/>
+      </w:r>
+      <w:r>
+        <w:rPr>
+          <w:rFonts w:ascii="Consolas" w:cs="Consolas" w:eastAsia="Consolas" w:hAnsi="Consolas"/>
+          <w:color w:val="3F4E66"/>
+          <w:sz w:val="17"/>
+          <w:szCs w:val="17"/>
+        </w:rPr>
+        <w:t xml:space="preserve">Exemption:  an entry that already exists on a day keeps its project</w:t>
+      </w:r>
+      <w:r>
+        <w:br/>
+      </w:r>
+      <w:r>
+        <w:rPr>
+          <w:rFonts w:ascii="Consolas" w:cs="Consolas" w:eastAsia="Consolas" w:hAnsi="Consolas"/>
+          <w:color w:val="3F4E66"/>
+          <w:sz w:val="17"/>
+          <w:szCs w:val="17"/>
+        </w:rPr>
+        <w:t xml:space="preserve">            on that day, whatever the two windows now say.</w:t>
+      </w:r>
+    </w:p>
+    <w:p>
+      <w:pPr>
+        <w:spacing w:after="140" w:line="288"/>
+      </w:pPr>
+      <w:r>
+        <w:rPr>
+          <w:rFonts w:ascii="Cambria" w:cs="Cambria" w:eastAsia="Cambria" w:hAnsi="Cambria"/>
+          <w:color w:val="16233A"/>
+          <w:sz w:val="21"/>
+          <w:szCs w:val="21"/>
+        </w:rPr>
+        <w:t xml:space="preserve">Both windows are inclusive at both ends, and both are tested </w:t>
+      </w:r>
+      <w:r>
+        <w:rPr>
+          <w:rFonts w:ascii="Cambria" w:cs="Cambria" w:eastAsia="Cambria" w:hAnsi="Cambria"/>
+          <w:b/>
+          <w:bCs/>
+          <w:color w:val="16233A"/>
+          <w:sz w:val="21"/>
+          <w:szCs w:val="21"/>
+        </w:rPr>
+        <w:t xml:space="preserve">per day</w:t>
+      </w:r>
+      <w:r>
+        <w:rPr>
+          <w:rFonts w:ascii="Cambria" w:cs="Cambria" w:eastAsia="Cambria" w:hAnsi="Cambria"/>
+          <w:color w:val="16233A"/>
+          <w:sz w:val="21"/>
+          <w:szCs w:val="21"/>
+        </w:rPr>
+        <w:t xml:space="preserve">, not per month. Before migration 787 the allocation window was only tested per month, so a stint ending on the 10th left the project offered for the rest of August.</w:t>
+      </w:r>
+    </w:p>
+    <w:p>
+      <w:pPr>
+        <w:pStyle w:val="Heading2"/>
+        <w:spacing w:after="100" w:before="280"/>
+      </w:pPr>
+      <w:r>
+        <w:rPr>
+          <w:rFonts w:ascii="Calibri" w:cs="Calibri" w:eastAsia="Calibri" w:hAnsi="Calibri"/>
+          <w:b/>
+          <w:bCs/>
+          <w:color w:val="16233A"/>
+          <w:sz w:val="23"/>
+          <w:szCs w:val="23"/>
+        </w:rPr>
+        <w:t xml:space="preserve">How it resolves</w:t>
+      </w:r>
+    </w:p>
+    <w:p>
+      <w:pPr>
+        <w:spacing w:after="140" w:line="288"/>
+      </w:pPr>
+      <w:r>
+        <w:rPr>
+          <w:rFonts w:ascii="Consolas" w:cs="Consolas" w:eastAsia="Consolas" w:hAnsi="Consolas"/>
+          <w:color w:val="3F4E66"/>
+          <w:sz w:val="18"/>
+          <w:szCs w:val="18"/>
+        </w:rPr>
+        <w:t xml:space="preserve">my_timesheet_projects(employee, period_start, period_end)</w:t>
+      </w:r>
+      <w:r>
+        <w:rPr>
+          <w:rFonts w:ascii="Cambria" w:cs="Cambria" w:eastAsia="Cambria" w:hAnsi="Cambria"/>
+          <w:color w:val="16233A"/>
+          <w:sz w:val="21"/>
+          <w:szCs w:val="21"/>
+        </w:rPr>
+        <w:t xml:space="preserve"> returns the candidate projects for the displayed month, each carrying its own window and </w:t>
+      </w:r>
+      <w:r>
+        <w:rPr>
+          <w:rFonts w:ascii="Consolas" w:cs="Consolas" w:eastAsia="Consolas" w:hAnsi="Consolas"/>
+          <w:color w:val="3F4E66"/>
+          <w:sz w:val="18"/>
+          <w:szCs w:val="18"/>
+        </w:rPr>
+        <w:t xml:space="preserve">member_spells</w:t>
+      </w:r>
+      <w:r>
+        <w:rPr>
+          <w:rFonts w:ascii="Cambria" w:cs="Cambria" w:eastAsia="Cambria" w:hAnsi="Cambria"/>
+          <w:color w:val="16233A"/>
+          <w:sz w:val="21"/>
+          <w:szCs w:val="21"/>
+        </w:rPr>
+        <w:t xml:space="preserve"> — a JSON </w:t>
+      </w:r>
+      <w:r>
+        <w:rPr>
+          <w:rFonts w:ascii="Cambria" w:cs="Cambria" w:eastAsia="Cambria" w:hAnsi="Cambria"/>
+          <w:i/>
+          <w:iCs/>
+          <w:color w:val="16233A"/>
+          <w:sz w:val="21"/>
+          <w:szCs w:val="21"/>
+        </w:rPr>
+        <w:t xml:space="preserve">array</w:t>
+      </w:r>
+      <w:r>
+        <w:rPr>
+          <w:rFonts w:ascii="Cambria" w:cs="Cambria" w:eastAsia="Cambria" w:hAnsi="Cambria"/>
+          <w:color w:val="16233A"/>
+          <w:sz w:val="21"/>
+          <w:szCs w:val="21"/>
+        </w:rPr>
+        <w:t xml:space="preserve"> of the person’s stints overlapping that month. An array rather than a first-and-last pair, because somebody on a project 1–10 January and again 20–31 January would otherwise be handed the ten days in the middle when they were off it.</w:t>
+      </w:r>
+    </w:p>
+    <w:p>
+      <w:pPr>
+        <w:spacing w:after="140" w:line="288"/>
+      </w:pPr>
+      <w:r>
+        <w:rPr>
+          <w:rFonts w:ascii="Cambria" w:cs="Cambria" w:eastAsia="Cambria" w:hAnsi="Cambria"/>
+          <w:color w:val="16233A"/>
+          <w:sz w:val="21"/>
+          <w:szCs w:val="21"/>
+        </w:rPr>
+        <w:t xml:space="preserve">The screen then applies, for every date being written:</w:t>
+      </w:r>
+    </w:p>
+    <w:p>
+      <w:pPr>
+        <w:spacing w:after="60" w:line="276"/>
+        <w:ind w:left="360" w:hanging="300"/>
+      </w:pPr>
+      <w:r>
+        <w:rPr>
+          <w:rFonts w:ascii="Calibri" w:cs="Calibri" w:eastAsia="Calibri" w:hAnsi="Calibri"/>
+          <w:b/>
+          <w:bCs/>
+          <w:color w:val="1F5F94"/>
+          <w:sz w:val="19"/>
+          <w:szCs w:val="19"/>
+        </w:rPr>
+        <w:t xml:space="preserve">1.  </w:t>
+      </w:r>
+      <w:r>
+        <w:rPr>
+          <w:rFonts w:ascii="Calibri" w:cs="Calibri" w:eastAsia="Calibri" w:hAnsi="Calibri"/>
+          <w:color w:val="3F4E66"/>
+          <w:sz w:val="20"/>
+          <w:szCs w:val="20"/>
+        </w:rPr>
+        <w:t xml:space="preserve">An entry already exists on this date for this project</w:t>
+      </w:r>
+      <w:r>
+        <w:rPr>
+          <w:rFonts w:ascii="Calibri" w:cs="Calibri" w:eastAsia="Calibri" w:hAnsi="Calibri"/>
+          <w:b/>
+          <w:bCs/>
+          <w:color w:val="6C7A91"/>
+          <w:sz w:val="16"/>
+          <w:szCs w:val="16"/>
+        </w:rPr>
+        <w:t xml:space="preserve">   → OFFER IT</w:t>
+      </w:r>
+    </w:p>
+    <w:p>
+      <w:pPr>
+        <w:spacing w:after="60" w:line="276"/>
+        <w:ind w:left="360" w:hanging="300"/>
+      </w:pPr>
+      <w:r>
+        <w:rPr>
+          <w:rFonts w:ascii="Calibri" w:cs="Calibri" w:eastAsia="Calibri" w:hAnsi="Calibri"/>
+          <w:b/>
+          <w:bCs/>
+          <w:color w:val="1F5F94"/>
+          <w:sz w:val="19"/>
+          <w:szCs w:val="19"/>
+        </w:rPr>
+        <w:t xml:space="preserve">2.  </w:t>
+      </w:r>
+      <w:r>
+        <w:rPr>
+          <w:rFonts w:ascii="Calibri" w:cs="Calibri" w:eastAsia="Calibri" w:hAnsi="Calibri"/>
+          <w:color w:val="3F4E66"/>
+          <w:sz w:val="20"/>
+          <w:szCs w:val="20"/>
+        </w:rPr>
+        <w:t xml:space="preserve">Otherwise: the date is inside the project’s own window</w:t>
+      </w:r>
+      <w:r>
+        <w:rPr>
+          <w:rFonts w:ascii="Calibri" w:cs="Calibri" w:eastAsia="Calibri" w:hAnsi="Calibri"/>
+          <w:b/>
+          <w:bCs/>
+          <w:color w:val="6C7A91"/>
+          <w:sz w:val="16"/>
+          <w:szCs w:val="16"/>
+        </w:rPr>
+        <w:t xml:space="preserve">   → REQUIRED</w:t>
+      </w:r>
+    </w:p>
+    <w:p>
+      <w:pPr>
+        <w:spacing w:after="60" w:line="276"/>
+        <w:ind w:left="360" w:hanging="300"/>
+      </w:pPr>
+      <w:r>
+        <w:rPr>
+          <w:rFonts w:ascii="Calibri" w:cs="Calibri" w:eastAsia="Calibri" w:hAnsi="Calibri"/>
+          <w:b/>
+          <w:bCs/>
+          <w:color w:val="1F5F94"/>
+          <w:sz w:val="19"/>
+          <w:szCs w:val="19"/>
+        </w:rPr>
+        <w:t xml:space="preserve">3.  </w:t>
+      </w:r>
+      <w:r>
+        <w:rPr>
+          <w:rFonts w:ascii="Calibri" w:cs="Calibri" w:eastAsia="Calibri" w:hAnsi="Calibri"/>
+          <w:color w:val="3F4E66"/>
+          <w:sz w:val="20"/>
+          <w:szCs w:val="20"/>
+        </w:rPr>
+        <w:t xml:space="preserve">…and inside at least one of that person’s stints</w:t>
+      </w:r>
+      <w:r>
+        <w:rPr>
+          <w:rFonts w:ascii="Calibri" w:cs="Calibri" w:eastAsia="Calibri" w:hAnsi="Calibri"/>
+          <w:b/>
+          <w:bCs/>
+          <w:color w:val="6C7A91"/>
+          <w:sz w:val="16"/>
+          <w:szCs w:val="16"/>
+        </w:rPr>
+        <w:t xml:space="preserve">   → REQUIRED</w:t>
+      </w:r>
+    </w:p>
+    <w:p>
+      <w:pPr>
+        <w:spacing w:after="120"/>
+      </w:pPr>
+    </w:p>
+    <w:p>
+      <w:pPr>
+        <w:spacing w:after="140" w:line="288"/>
+      </w:pPr>
+      <w:r>
+        <w:rPr>
+          <w:rFonts w:ascii="Cambria" w:cs="Cambria" w:eastAsia="Cambria" w:hAnsi="Cambria"/>
+          <w:color w:val="16233A"/>
+          <w:sz w:val="21"/>
+          <w:szCs w:val="21"/>
+        </w:rPr>
+        <w:t xml:space="preserve">The day panel passes one date. The Create modal passes every selected date, so its list is the </w:t>
+      </w:r>
+      <w:r>
+        <w:rPr>
+          <w:rFonts w:ascii="Cambria" w:cs="Cambria" w:eastAsia="Cambria" w:hAnsi="Cambria"/>
+          <w:i/>
+          <w:iCs/>
+          <w:color w:val="16233A"/>
+          <w:sz w:val="21"/>
+          <w:szCs w:val="21"/>
+        </w:rPr>
+        <w:t xml:space="preserve">intersection</w:t>
+      </w:r>
+      <w:r>
+        <w:rPr>
+          <w:rFonts w:ascii="Cambria" w:cs="Cambria" w:eastAsia="Cambria" w:hAnsi="Cambria"/>
+          <w:color w:val="16233A"/>
+          <w:sz w:val="21"/>
+          <w:szCs w:val="21"/>
+        </w:rPr>
+        <w:t xml:space="preserve">. Copy Day runs the same test against every entry on the clipboard, and the calendar colours a day pasteable using that same test — a day that cannot take the paste should look like it cannot.</w:t>
+      </w:r>
+    </w:p>
+    <w:p>
+      <w:pPr>
+        <w:spacing w:after="140" w:line="288"/>
+      </w:pPr>
+      <w:r>
+        <w:rPr>
+          <w:rFonts w:ascii="Cambria" w:cs="Cambria" w:eastAsia="Cambria" w:hAnsi="Cambria"/>
+          <w:color w:val="16233A"/>
+          <w:sz w:val="21"/>
+          <w:szCs w:val="21"/>
+        </w:rPr>
+        <w:t xml:space="preserve">Withheld projects are named rather than silently dropped: </w:t>
+      </w:r>
+      <w:r>
+        <w:rPr>
+          <w:rFonts w:ascii="Cambria" w:cs="Cambria" w:eastAsia="Cambria" w:hAnsi="Cambria"/>
+          <w:i/>
+          <w:iCs/>
+          <w:color w:val="16233A"/>
+          <w:sz w:val="21"/>
+          <w:szCs w:val="21"/>
+        </w:rPr>
+        <w:t xml:space="preserve">"Not available for 21 Aug: AMPTJ, QCC — outside the project’s dates or your allocation to it."</w:t>
+      </w:r>
+      <w:r>
+        <w:rPr>
+          <w:rFonts w:ascii="Cambria" w:cs="Cambria" w:eastAsia="Cambria" w:hAnsi="Cambria"/>
+          <w:color w:val="16233A"/>
+          <w:sz w:val="21"/>
+          <w:szCs w:val="21"/>
+        </w:rPr>
+        <w:t xml:space="preserve"> A project vanishing with no reason given is indistinguishable from a bug.</w:t>
+      </w:r>
+    </w:p>
+    <w:p>
+      <w:pPr>
+        <w:pStyle w:val="Heading2"/>
+        <w:spacing w:after="100" w:before="280"/>
+      </w:pPr>
+      <w:r>
+        <w:rPr>
+          <w:rFonts w:ascii="Calibri" w:cs="Calibri" w:eastAsia="Calibri" w:hAnsi="Calibri"/>
+          <w:b/>
+          <w:bCs/>
+          <w:color w:val="16233A"/>
+          <w:sz w:val="23"/>
+          <w:szCs w:val="23"/>
+        </w:rPr>
+        <w:t xml:space="preserve">Two deliberate exemptions</w:t>
+      </w:r>
+    </w:p>
+    <w:tbl>
+      <w:tblPr>
+        <w:tblW w:type="dxa" w:w="9746"/>
+        <w:tblBorders>
+          <w:top w:val="single" w:color="D7DFE9" w:sz="4"/>
+          <w:left w:val="single" w:color="D7DFE9" w:sz="4"/>
+          <w:bottom w:val="single" w:color="D7DFE9" w:sz="4"/>
+          <w:right w:val="single" w:color="D7DFE9" w:sz="4"/>
+          <w:insideH w:val="single" w:color="auto" w:sz="4"/>
+          <w:insideV w:val="single" w:color="auto" w:sz="4"/>
+        </w:tblBorders>
+      </w:tblPr>
+      <w:tblGrid>
+        <w:gridCol w:w="9746"/>
+      </w:tblGrid>
+      <w:tr>
+        <w:tc>
+          <w:tcPr>
+            <w:tcW w:type="dxa" w:w="9746"/>
+            <w:tcMar>
+              <w:top w:type="dxa" w:w="130"/>
+              <w:left w:type="dxa" w:w="160"/>
+              <w:bottom w:type="dxa" w:w="130"/>
+              <w:right w:type="dxa" w:w="160"/>
+            </w:tcMar>
+          </w:tcPr>
+          <w:p>
+            <w:pPr>
+              <w:spacing w:after="70"/>
+            </w:pPr>
+            <w:r>
+              <w:rPr>
+                <w:rFonts w:ascii="Calibri" w:cs="Calibri" w:eastAsia="Calibri" w:hAnsi="Calibri"/>
+                <w:b/>
+                <w:bCs/>
+                <w:color w:val="16233A"/>
+                <w:sz w:val="21"/>
+                <w:szCs w:val="21"/>
+              </w:rPr>
+              <w:t xml:space="preserve">A day you have already booked keeps its project  </w:t>
+            </w:r>
+            <w:r>
+              <w:rPr>
+                <w:rFonts w:ascii="Calibri" w:cs="Calibri" w:eastAsia="Calibri" w:hAnsi="Calibri"/>
+                <w:b/>
+                <w:bCs/>
+                <w:color w:val="8A5307"/>
+                <w:sz w:val="15"/>
+                <w:szCs w:val="15"/>
+              </w:rPr>
+              <w:t xml:space="preserve">[SCREEN]</w:t>
+            </w:r>
+          </w:p>
+          <w:p>
+            <w:pPr>
+              <w:spacing w:after="60" w:line="276"/>
+            </w:pPr>
+            <w:r>
+              <w:rPr>
+                <w:rFonts w:ascii="Cambria" w:cs="Cambria" w:eastAsia="Cambria" w:hAnsi="Cambria"/>
+                <w:color w:val="3F4E66"/>
+                <w:sz w:val="20"/>
+                <w:szCs w:val="20"/>
+              </w:rPr>
+              <w:t xml:space="preserve">Per </w:t>
+            </w:r>
+            <w:r>
+              <w:rPr>
+                <w:rFonts w:ascii="Cambria" w:cs="Cambria" w:eastAsia="Cambria" w:hAnsi="Cambria"/>
+                <w:i/>
+                <w:iCs/>
+                <w:color w:val="3F4E66"/>
+                <w:sz w:val="20"/>
+                <w:szCs w:val="20"/>
+              </w:rPr>
+              <w:t xml:space="preserve">date</w:t>
+            </w:r>
+            <w:r>
+              <w:rPr>
+                <w:rFonts w:ascii="Cambria" w:cs="Cambria" w:eastAsia="Cambria" w:hAnsi="Cambria"/>
+                <w:color w:val="3F4E66"/>
+                <w:sz w:val="20"/>
+                <w:szCs w:val="20"/>
+              </w:rPr>
+              <w:t xml:space="preserve">, not per project — it does not reopen the rest of the month. Without it, an entry that exists could not name its own project, and rows stranded before the guards existed would be uneditable from the only screen that has them.</w:t>
+            </w:r>
+          </w:p>
+        </w:tc>
+      </w:tr>
+    </w:tbl>
+    <w:p>
+      <w:pPr>
+        <w:spacing w:after="100"/>
+      </w:pPr>
+    </w:p>
+    <w:tbl>
+      <w:tblPr>
+        <w:tblW w:type="dxa" w:w="9746"/>
+        <w:tblBorders>
+          <w:top w:val="single" w:color="D7DFE9" w:sz="4"/>
+          <w:left w:val="single" w:color="D7DFE9" w:sz="4"/>
+          <w:bottom w:val="single" w:color="D7DFE9" w:sz="4"/>
+          <w:right w:val="single" w:color="D7DFE9" w:sz="4"/>
+          <w:insideH w:val="single" w:color="auto" w:sz="4"/>
+          <w:insideV w:val="single" w:color="auto" w:sz="4"/>
+        </w:tblBorders>
+      </w:tblPr>
+      <w:tblGrid>
+        <w:gridCol w:w="9746"/>
+      </w:tblGrid>
+      <w:tr>
+        <w:tc>
+          <w:tcPr>
+            <w:tcW w:type="dxa" w:w="9746"/>
+            <w:tcMar>
+              <w:top w:type="dxa" w:w="130"/>
+              <w:left w:type="dxa" w:w="160"/>
+              <w:bottom w:type="dxa" w:w="130"/>
+              <w:right w:type="dxa" w:w="160"/>
+            </w:tcMar>
+          </w:tcPr>
+          <w:p>
+            <w:pPr>
+              <w:spacing w:after="70"/>
+            </w:pPr>
+            <w:r>
+              <w:rPr>
+                <w:rFonts w:ascii="Calibri" w:cs="Calibri" w:eastAsia="Calibri" w:hAnsi="Calibri"/>
+                <w:b/>
+                <w:bCs/>
+                <w:color w:val="16233A"/>
+                <w:sz w:val="21"/>
+                <w:szCs w:val="21"/>
+              </w:rPr>
               <w:t xml:space="preserve">Somebody with no memberships is offered everything  </w:t>
             </w:r>
             <w:r>
@@ -9475,7 +11456,7 @@
                 <w:sz w:val="16"/>
                 <w:szCs w:val="16"/>
               </w:rPr>
-              <w:t xml:space="preserve">Q8 · wording</w:t>
+              <w:t xml:space="preserve">Q8 · wording · RESOLVED in 796</w:t>
             </w:r>
           </w:p>
           <w:p>
@@ -9505,7 +11486,7 @@
                 <w:sz w:val="20"/>
                 <w:szCs w:val="20"/>
               </w:rPr>
-              <w:t xml:space="preserve">The shared verb produces </w:t>
+              <w:t xml:space="preserve">The shared verb produced </w:t>
             </w:r>
             <w:r>
               <w:rPr>
@@ -9545,7 +11526,7 @@
                 <w:sz w:val="20"/>
                 <w:szCs w:val="20"/>
               </w:rPr>
-              <w:t xml:space="preserve"> in the line manager’s copy. The titles are fine; only the body’s first sentence is off.</w:t>
+              <w:t xml:space="preserve"> in the line manager’s copy.</w:t>
             </w:r>
           </w:p>
           <w:p>
@@ -9562,7 +11543,7 @@
                 <w:sz w:val="20"/>
                 <w:szCs w:val="20"/>
               </w:rPr>
-              <w:t xml:space="preserve">Worth a migration on its own, or fold into the next change to that function?</w:t>
+              <w:t xml:space="preserve">Fixed for free when the wording moved into templates: the seeded _other bodies now read "Meera R’s assignment on AMPTJ was changed by Hari A." No separate migration was needed.</w:t>
             </w:r>
           </w:p>
         </w:tc>
@@ -10180,11 +12161,22 @@
             <w:r>
               <w:rPr>
                 <w:rFonts w:ascii="Calibri" w:cs="Calibri" w:eastAsia="Calibri" w:hAnsi="Calibri"/>
+                <w:b/>
+                <w:bCs/>
                 <w:color w:val="16233A"/>
                 <w:sz w:val="20"/>
                 <w:szCs w:val="20"/>
               </w:rPr>
-              <w:t xml:space="preserve">Remove the two banners until the routing exists, or build the routing? And if we build it, is </w:t>
+              <w:t xml:space="preserve">Since drafted:</w:t>
+            </w:r>
+            <w:r>
+              <w:rPr>
+                <w:rFonts w:ascii="Calibri" w:cs="Calibri" w:eastAsia="Calibri" w:hAnsi="Calibri"/>
+                <w:color w:val="16233A"/>
+                <w:sz w:val="20"/>
+                <w:szCs w:val="20"/>
+              </w:rPr>
+              <w:t xml:space="preserve"> migration 798 retired </w:t>
             </w:r>
             <w:r>
               <w:rPr>
@@ -10202,7 +12194,7 @@
                 <w:sz w:val="20"/>
                 <w:szCs w:val="20"/>
               </w:rPr>
-              <w:t xml:space="preserve"> worth a draft state on </w:t>
+              <w:t xml:space="preserve"> — a code that could never be wired should not be offered in a dropdown — and its banner is gone from the screen. </w:t>
             </w:r>
             <w:r>
               <w:rPr>
@@ -10211,7 +12203,7 @@
                 <w:sz w:val="17"/>
                 <w:szCs w:val="17"/>
               </w:rPr>
-              <w:t xml:space="preserve">projects</w:t>
+              <w:t xml:space="preserve">project_edit</w:t>
             </w:r>
             <w:r>
               <w:rPr>
@@ -10220,7 +12212,27 @@
                 <w:sz w:val="20"/>
                 <w:szCs w:val="20"/>
               </w:rPr>
-              <w:t xml:space="preserve">, or should approval only ever apply to edits?</w:t>
+              <w:t xml:space="preserve">’s banner is deliberately left mounted as the marker: it becomes true the moment the routing exists. </w:t>
+            </w:r>
+            <w:r>
+              <w:rPr>
+                <w:rFonts w:ascii="Calibri" w:cs="Calibri" w:eastAsia="Calibri" w:hAnsi="Calibri"/>
+                <w:b/>
+                <w:bCs/>
+                <w:color w:val="16233A"/>
+                <w:sz w:val="20"/>
+                <w:szCs w:val="20"/>
+              </w:rPr>
+              <w:t xml:space="preserve">Do not assign a workflow to project_edit until then</w:t>
+            </w:r>
+            <w:r>
+              <w:rPr>
+                <w:rFonts w:ascii="Calibri" w:cs="Calibri" w:eastAsia="Calibri" w:hAnsi="Calibri"/>
+                <w:color w:val="16233A"/>
+                <w:sz w:val="20"/>
+                <w:szCs w:val="20"/>
+              </w:rPr>
+              <w:t xml:space="preserve"> — the assignment will save, the banner will appear, and the edit will still apply immediately. The open question is now bigger than projects: routing exists on two screens and is promised on six. Build the shared submit-and-apply layer for all of them, or take the promise down on the other four?</w:t>
             </w:r>
           </w:p>
         </w:tc>
@@ -14898,6 +16910,205 @@
               </w:rPr>
               <w:t xml:space="preserve">notifications</w:t>
             </w:r>
+            <w:r>
+              <w:rPr>
+                <w:rFonts w:ascii="Calibri" w:cs="Calibri" w:eastAsia="Calibri" w:hAnsi="Calibri"/>
+                <w:color w:val="3F4E66"/>
+                <w:sz w:val="19"/>
+                <w:szCs w:val="19"/>
+              </w:rPr>
+              <w:t xml:space="preserve">; wording from the </w:t>
+            </w:r>
+            <w:r>
+              <w:rPr>
+                <w:rFonts w:ascii="Consolas" w:cs="Consolas" w:eastAsia="Consolas" w:hAnsi="Consolas"/>
+                <w:color w:val="3F4E66"/>
+                <w:sz w:val="16"/>
+                <w:szCs w:val="16"/>
+              </w:rPr>
+              <w:t xml:space="preserve">project.member_*</w:t>
+            </w:r>
+            <w:r>
+              <w:rPr>
+                <w:rFonts w:ascii="Calibri" w:cs="Calibri" w:eastAsia="Calibri" w:hAnsi="Calibri"/>
+                <w:color w:val="3F4E66"/>
+                <w:sz w:val="19"/>
+                <w:szCs w:val="19"/>
+              </w:rPr>
+              <w:t xml:space="preserve"> templates</w:t>
+            </w:r>
+          </w:p>
+        </w:tc>
+      </w:tr>
+      <w:tr>
+        <w:tc>
+          <w:tcPr>
+            <w:tcW w:type="dxa" w:w="3119"/>
+            <w:tcMar>
+              <w:top w:type="dxa" w:w="90"/>
+              <w:left w:type="dxa" w:w="130"/>
+              <w:bottom w:type="dxa" w:w="90"/>
+              <w:right w:type="dxa" w:w="130"/>
+            </w:tcMar>
+          </w:tcPr>
+          <w:p>
+            <w:pPr>
+              <w:spacing w:line="264"/>
+            </w:pPr>
+            <w:r>
+              <w:rPr>
+                <w:rFonts w:ascii="Consolas" w:cs="Consolas" w:eastAsia="Consolas" w:hAnsi="Consolas"/>
+                <w:color w:val="16233A"/>
+                <w:sz w:val="16"/>
+                <w:szCs w:val="16"/>
+              </w:rPr>
+              <w:t xml:space="preserve">notify_project_lead_change(uuid, uuid, uuid)</w:t>
+            </w:r>
+          </w:p>
+        </w:tc>
+        <w:tc>
+          <w:tcPr>
+            <w:tcW w:type="dxa" w:w="2534"/>
+            <w:tcMar>
+              <w:top w:type="dxa" w:w="90"/>
+              <w:left w:type="dxa" w:w="130"/>
+              <w:bottom w:type="dxa" w:w="90"/>
+              <w:right w:type="dxa" w:w="130"/>
+            </w:tcMar>
+          </w:tcPr>
+          <w:p>
+            <w:pPr>
+              <w:spacing w:line="264"/>
+            </w:pPr>
+            <w:r>
+              <w:rPr>
+                <w:rFonts w:ascii="Calibri" w:cs="Calibri" w:eastAsia="Calibri" w:hAnsi="Calibri"/>
+                <w:color w:val="3F4E66"/>
+                <w:sz w:val="19"/>
+                <w:szCs w:val="19"/>
+              </w:rPr>
+              <w:t xml:space="preserve">—</w:t>
+            </w:r>
+          </w:p>
+        </w:tc>
+        <w:tc>
+          <w:tcPr>
+            <w:tcW w:type="dxa" w:w="4093"/>
+            <w:tcMar>
+              <w:top w:type="dxa" w:w="90"/>
+              <w:left w:type="dxa" w:w="130"/>
+              <w:bottom w:type="dxa" w:w="90"/>
+              <w:right w:type="dxa" w:w="130"/>
+            </w:tcMar>
+          </w:tcPr>
+          <w:p>
+            <w:pPr>
+              <w:spacing w:line="264"/>
+            </w:pPr>
+            <w:r>
+              <w:rPr>
+                <w:rFonts w:ascii="Calibri" w:cs="Calibri" w:eastAsia="Calibri" w:hAnsi="Calibri"/>
+                <w:color w:val="3F4E66"/>
+                <w:sz w:val="19"/>
+                <w:szCs w:val="19"/>
+              </w:rPr>
+              <w:t xml:space="preserve">Both leads, both line managers and the current members</w:t>
+            </w:r>
+          </w:p>
+        </w:tc>
+      </w:tr>
+      <w:tr>
+        <w:tc>
+          <w:tcPr>
+            <w:tcW w:type="dxa" w:w="3119"/>
+            <w:tcMar>
+              <w:top w:type="dxa" w:w="90"/>
+              <w:left w:type="dxa" w:w="130"/>
+              <w:bottom w:type="dxa" w:w="90"/>
+              <w:right w:type="dxa" w:w="130"/>
+            </w:tcMar>
+          </w:tcPr>
+          <w:p>
+            <w:pPr>
+              <w:spacing w:line="264"/>
+            </w:pPr>
+            <w:r>
+              <w:rPr>
+                <w:rFonts w:ascii="Consolas" w:cs="Consolas" w:eastAsia="Consolas" w:hAnsi="Consolas"/>
+                <w:color w:val="16233A"/>
+                <w:sz w:val="16"/>
+                <w:szCs w:val="16"/>
+              </w:rPr>
+              <w:t xml:space="preserve">render_notification_template(text, jsonb)</w:t>
+            </w:r>
+          </w:p>
+        </w:tc>
+        <w:tc>
+          <w:tcPr>
+            <w:tcW w:type="dxa" w:w="2534"/>
+            <w:tcMar>
+              <w:top w:type="dxa" w:w="90"/>
+              <w:left w:type="dxa" w:w="130"/>
+              <w:bottom w:type="dxa" w:w="90"/>
+              <w:right w:type="dxa" w:w="130"/>
+            </w:tcMar>
+          </w:tcPr>
+          <w:p>
+            <w:pPr>
+              <w:spacing w:line="264"/>
+            </w:pPr>
+            <w:r>
+              <w:rPr>
+                <w:rFonts w:ascii="Calibri" w:cs="Calibri" w:eastAsia="Calibri" w:hAnsi="Calibri"/>
+                <w:color w:val="3F4E66"/>
+                <w:sz w:val="19"/>
+                <w:szCs w:val="19"/>
+              </w:rPr>
+              <w:t xml:space="preserve">—</w:t>
+            </w:r>
+          </w:p>
+        </w:tc>
+        <w:tc>
+          <w:tcPr>
+            <w:tcW w:type="dxa" w:w="4093"/>
+            <w:tcMar>
+              <w:top w:type="dxa" w:w="90"/>
+              <w:left w:type="dxa" w:w="130"/>
+              <w:bottom w:type="dxa" w:w="90"/>
+              <w:right w:type="dxa" w:w="130"/>
+            </w:tcMar>
+          </w:tcPr>
+          <w:p>
+            <w:pPr>
+              <w:spacing w:line="264"/>
+            </w:pPr>
+            <w:r>
+              <w:rPr>
+                <w:rFonts w:ascii="Calibri" w:cs="Calibri" w:eastAsia="Calibri" w:hAnsi="Calibri"/>
+                <w:color w:val="3F4E66"/>
+                <w:sz w:val="19"/>
+                <w:szCs w:val="19"/>
+              </w:rPr>
+              <w:t xml:space="preserve">Substitutes </w:t>
+            </w:r>
+            <w:r>
+              <w:rPr>
+                <w:rFonts w:ascii="Consolas" w:cs="Consolas" w:eastAsia="Consolas" w:hAnsi="Consolas"/>
+                <w:color w:val="3F4E66"/>
+                <w:sz w:val="16"/>
+                <w:szCs w:val="16"/>
+              </w:rPr>
+              <w:t xml:space="preserve">{{tokens}}</w:t>
+            </w:r>
+            <w:r>
+              <w:rPr>
+                <w:rFonts w:ascii="Calibri" w:cs="Calibri" w:eastAsia="Calibri" w:hAnsi="Calibri"/>
+                <w:color w:val="3F4E66"/>
+                <w:sz w:val="19"/>
+                <w:szCs w:val="19"/>
+              </w:rPr>
+              <w:t xml:space="preserve">; NULL on an unknown code so the caller falls back</w:t>
+            </w:r>
           </w:p>
         </w:tc>
       </w:tr>
@@ -16631,6 +18842,101 @@
                 <w:sz w:val="16"/>
                 <w:szCs w:val="16"/>
               </w:rPr>
+              <w:t xml:space="preserve">after_project_lead_notify</w:t>
+            </w:r>
+          </w:p>
+        </w:tc>
+        <w:tc>
+          <w:tcPr>
+            <w:tcW w:type="dxa" w:w="3898"/>
+            <w:tcMar>
+              <w:top w:type="dxa" w:w="90"/>
+              <w:left w:type="dxa" w:w="130"/>
+              <w:bottom w:type="dxa" w:w="90"/>
+              <w:right w:type="dxa" w:w="130"/>
+            </w:tcMar>
+          </w:tcPr>
+          <w:p>
+            <w:pPr>
+              <w:spacing w:line="264"/>
+            </w:pPr>
+            <w:r>
+              <w:rPr>
+                <w:rFonts w:ascii="Consolas" w:cs="Consolas" w:eastAsia="Consolas" w:hAnsi="Consolas"/>
+                <w:color w:val="3F4E66"/>
+                <w:sz w:val="16"/>
+                <w:szCs w:val="16"/>
+              </w:rPr>
+              <w:t xml:space="preserve">projects</w:t>
+            </w:r>
+            <w:r>
+              <w:rPr>
+                <w:rFonts w:ascii="Calibri" w:cs="Calibri" w:eastAsia="Calibri" w:hAnsi="Calibri"/>
+                <w:color w:val="3F4E66"/>
+                <w:sz w:val="19"/>
+                <w:szCs w:val="19"/>
+              </w:rPr>
+              <w:t xml:space="preserve"> · AFTER INSERT/UPDATE OF </w:t>
+            </w:r>
+            <w:r>
+              <w:rPr>
+                <w:rFonts w:ascii="Consolas" w:cs="Consolas" w:eastAsia="Consolas" w:hAnsi="Consolas"/>
+                <w:color w:val="3F4E66"/>
+                <w:sz w:val="16"/>
+                <w:szCs w:val="16"/>
+              </w:rPr>
+              <w:t xml:space="preserve">manager_id</w:t>
+            </w:r>
+          </w:p>
+        </w:tc>
+        <w:tc>
+          <w:tcPr>
+            <w:tcW w:type="dxa" w:w="2924"/>
+            <w:tcMar>
+              <w:top w:type="dxa" w:w="90"/>
+              <w:left w:type="dxa" w:w="130"/>
+              <w:bottom w:type="dxa" w:w="90"/>
+              <w:right w:type="dxa" w:w="130"/>
+            </w:tcMar>
+          </w:tcPr>
+          <w:p>
+            <w:pPr>
+              <w:spacing w:line="264"/>
+            </w:pPr>
+            <w:r>
+              <w:rPr>
+                <w:rFonts w:ascii="Calibri" w:cs="Calibri" w:eastAsia="Calibri" w:hAnsi="Calibri"/>
+                <w:color w:val="3F4E66"/>
+                <w:sz w:val="19"/>
+                <w:szCs w:val="19"/>
+              </w:rPr>
+              <w:t xml:space="preserve">Announces a change of lead. Contained, so a failed message cannot roll back the edit</w:t>
+            </w:r>
+          </w:p>
+        </w:tc>
+      </w:tr>
+      <w:tr>
+        <w:tc>
+          <w:tcPr>
+            <w:tcW w:type="dxa" w:w="2924"/>
+            <w:tcMar>
+              <w:top w:type="dxa" w:w="90"/>
+              <w:left w:type="dxa" w:w="130"/>
+              <w:bottom w:type="dxa" w:w="90"/>
+              <w:right w:type="dxa" w:w="130"/>
+            </w:tcMar>
+          </w:tcPr>
+          <w:p>
+            <w:pPr>
+              <w:spacing w:line="264"/>
+            </w:pPr>
+            <w:r>
+              <w:rPr>
+                <w:rFonts w:ascii="Consolas" w:cs="Consolas" w:eastAsia="Consolas" w:hAnsi="Consolas"/>
+                <w:color w:val="16233A"/>
+                <w:sz w:val="16"/>
+                <w:szCs w:val="16"/>
+              </w:rPr>
               <w:t xml:space="preserve">after_notification_insert_send_email</w:t>
             </w:r>
           </w:p>
@@ -17890,6 +20196,198 @@
           </w:p>
         </w:tc>
       </w:tr>
+      <w:tr>
+        <w:tc>
+          <w:tcPr>
+            <w:tcW w:type="dxa" w:w="780"/>
+            <w:tcMar>
+              <w:top w:type="dxa" w:w="90"/>
+              <w:left w:type="dxa" w:w="130"/>
+              <w:bottom w:type="dxa" w:w="90"/>
+              <w:right w:type="dxa" w:w="130"/>
+            </w:tcMar>
+          </w:tcPr>
+          <w:p>
+            <w:pPr>
+              <w:spacing w:line="264"/>
+            </w:pPr>
+            <w:r>
+              <w:rPr>
+                <w:rFonts w:ascii="Calibri" w:cs="Calibri" w:eastAsia="Calibri" w:hAnsi="Calibri"/>
+                <w:color w:val="16233A"/>
+                <w:sz w:val="19"/>
+                <w:szCs w:val="19"/>
+              </w:rPr>
+              <w:t xml:space="preserve">796</w:t>
+            </w:r>
+          </w:p>
+        </w:tc>
+        <w:tc>
+          <w:tcPr>
+            <w:tcW w:type="dxa" w:w="8966"/>
+            <w:tcMar>
+              <w:top w:type="dxa" w:w="90"/>
+              <w:left w:type="dxa" w:w="130"/>
+              <w:bottom w:type="dxa" w:w="90"/>
+              <w:right w:type="dxa" w:w="130"/>
+            </w:tcMar>
+          </w:tcPr>
+          <w:p>
+            <w:pPr>
+              <w:spacing w:line="264"/>
+            </w:pPr>
+            <w:r>
+              <w:rPr>
+                <w:rFonts w:ascii="Calibri" w:cs="Calibri" w:eastAsia="Calibri" w:hAnsi="Calibri"/>
+                <w:color w:val="3F4E66"/>
+                <w:sz w:val="19"/>
+                <w:szCs w:val="19"/>
+              </w:rPr>
+              <w:t xml:space="preserve">Project notification wording moves into Manage Notifications; </w:t>
+            </w:r>
+            <w:r>
+              <w:rPr>
+                <w:rFonts w:ascii="Consolas" w:cs="Consolas" w:eastAsia="Consolas" w:hAnsi="Consolas"/>
+                <w:color w:val="3F4E66"/>
+                <w:sz w:val="16"/>
+                <w:szCs w:val="16"/>
+              </w:rPr>
+              <w:t xml:space="preserve">render_notification_template</w:t>
+            </w:r>
+            <w:r>
+              <w:rPr>
+                <w:rFonts w:ascii="Calibri" w:cs="Calibri" w:eastAsia="Calibri" w:hAnsi="Calibri"/>
+                <w:color w:val="3F4E66"/>
+                <w:sz w:val="19"/>
+                <w:szCs w:val="19"/>
+              </w:rPr>
+              <w:t xml:space="preserve">.</w:t>
+            </w:r>
+          </w:p>
+        </w:tc>
+      </w:tr>
+      <w:tr>
+        <w:tc>
+          <w:tcPr>
+            <w:tcW w:type="dxa" w:w="780"/>
+            <w:tcMar>
+              <w:top w:type="dxa" w:w="90"/>
+              <w:left w:type="dxa" w:w="130"/>
+              <w:bottom w:type="dxa" w:w="90"/>
+              <w:right w:type="dxa" w:w="130"/>
+            </w:tcMar>
+          </w:tcPr>
+          <w:p>
+            <w:pPr>
+              <w:spacing w:line="264"/>
+            </w:pPr>
+            <w:r>
+              <w:rPr>
+                <w:rFonts w:ascii="Calibri" w:cs="Calibri" w:eastAsia="Calibri" w:hAnsi="Calibri"/>
+                <w:color w:val="16233A"/>
+                <w:sz w:val="19"/>
+                <w:szCs w:val="19"/>
+              </w:rPr>
+              <w:t xml:space="preserve">797</w:t>
+            </w:r>
+          </w:p>
+        </w:tc>
+        <w:tc>
+          <w:tcPr>
+            <w:tcW w:type="dxa" w:w="8966"/>
+            <w:tcMar>
+              <w:top w:type="dxa" w:w="90"/>
+              <w:left w:type="dxa" w:w="130"/>
+              <w:bottom w:type="dxa" w:w="90"/>
+              <w:right w:type="dxa" w:w="130"/>
+            </w:tcMar>
+          </w:tcPr>
+          <w:p>
+            <w:pPr>
+              <w:spacing w:line="264"/>
+            </w:pPr>
+            <w:r>
+              <w:rPr>
+                <w:rFonts w:ascii="Calibri" w:cs="Calibri" w:eastAsia="Calibri" w:hAnsi="Calibri"/>
+                <w:color w:val="3F4E66"/>
+                <w:sz w:val="19"/>
+                <w:szCs w:val="19"/>
+              </w:rPr>
+              <w:t xml:space="preserve">A change of project lead tells both leads, their managers and the team.</w:t>
+            </w:r>
+          </w:p>
+        </w:tc>
+      </w:tr>
+      <w:tr>
+        <w:tc>
+          <w:tcPr>
+            <w:tcW w:type="dxa" w:w="780"/>
+            <w:tcMar>
+              <w:top w:type="dxa" w:w="90"/>
+              <w:left w:type="dxa" w:w="130"/>
+              <w:bottom w:type="dxa" w:w="90"/>
+              <w:right w:type="dxa" w:w="130"/>
+            </w:tcMar>
+          </w:tcPr>
+          <w:p>
+            <w:pPr>
+              <w:spacing w:line="264"/>
+            </w:pPr>
+            <w:r>
+              <w:rPr>
+                <w:rFonts w:ascii="Calibri" w:cs="Calibri" w:eastAsia="Calibri" w:hAnsi="Calibri"/>
+                <w:color w:val="16233A"/>
+                <w:sz w:val="19"/>
+                <w:szCs w:val="19"/>
+              </w:rPr>
+              <w:t xml:space="preserve">798</w:t>
+            </w:r>
+          </w:p>
+        </w:tc>
+        <w:tc>
+          <w:tcPr>
+            <w:tcW w:type="dxa" w:w="8966"/>
+            <w:tcMar>
+              <w:top w:type="dxa" w:w="90"/>
+              <w:left w:type="dxa" w:w="130"/>
+              <w:bottom w:type="dxa" w:w="90"/>
+              <w:right w:type="dxa" w:w="130"/>
+            </w:tcMar>
+          </w:tcPr>
+          <w:p>
+            <w:pPr>
+              <w:spacing w:line="264"/>
+            </w:pPr>
+            <w:r>
+              <w:rPr>
+                <w:rFonts w:ascii="Calibri" w:cs="Calibri" w:eastAsia="Calibri" w:hAnsi="Calibri"/>
+                <w:color w:val="3F4E66"/>
+                <w:sz w:val="19"/>
+                <w:szCs w:val="19"/>
+              </w:rPr>
+              <w:t xml:space="preserve">One module code for projects — </w:t>
+            </w:r>
+            <w:r>
+              <w:rPr>
+                <w:rFonts w:ascii="Consolas" w:cs="Consolas" w:eastAsia="Consolas" w:hAnsi="Consolas"/>
+                <w:color w:val="3F4E66"/>
+                <w:sz w:val="16"/>
+                <w:szCs w:val="16"/>
+              </w:rPr>
+              <w:t xml:space="preserve">project_create</w:t>
+            </w:r>
+            <w:r>
+              <w:rPr>
+                <w:rFonts w:ascii="Calibri" w:cs="Calibri" w:eastAsia="Calibri" w:hAnsi="Calibri"/>
+                <w:color w:val="3F4E66"/>
+                <w:sz w:val="19"/>
+                <w:szCs w:val="19"/>
+              </w:rPr>
+              <w:t xml:space="preserve"> retired as unbuildable.</w:t>
+            </w:r>
+          </w:p>
+        </w:tc>
+      </w:tr>
     </w:tbl>
     <w:p>
       <w:pPr>
@@ -17924,7 +20422,7 @@
           <w:sz w:val="18"/>
           <w:szCs w:val="18"/>
         </w:rPr>
-        <w:t xml:space="preserve">Test coverage lives in docs/timesheet-test-plan.html — 289 cases, sections AH–AN cover this slice.</w:t>
+        <w:t xml:space="preserve">Test coverage lives in docs/timesheet-test-plan.html — 309 cases, sections AH–AP cover this slice.</w:t>
       </w:r>
     </w:p>
     <w:sectPr>

</xml_diff>